<commit_message>
style: reformata documento teorico no Word seguindo padrao estrito ABNT (Arial 12, espacamento 1.5, recuo 1.25cm, margens 3/3/2/2)
</commit_message>
<xml_diff>
--- a/MODELO DE PROJETO INTEGRADOR - PARTE TEÓRICA.docx
+++ b/MODELO DE PROJETO INTEGRADOR - PARTE TEÓRICA.docx
@@ -4,160 +4,243 @@
   <w:body>
     <w:p>
       <w:pPr>
-        <w:pStyle w:val="Title"/>
+        <w:spacing w:line="360" w:lineRule="auto" w:before="240" w:after="360"/>
         <w:jc w:val="center"/>
       </w:pPr>
       <w:r>
         <w:rPr>
           <w:rFonts w:ascii="Arial" w:hAnsi="Arial"/>
           <w:b/>
-          <w:color w:val="1B2E24"/>
-          <w:sz w:val="36"/>
+          <w:color w:val="000000"/>
+          <w:sz w:val="28"/>
         </w:rPr>
         <w:t>PROJETO INTEGRADOR — PARTE TEÓRICA</w:t>
       </w:r>
     </w:p>
     <w:p>
       <w:pPr>
-        <w:spacing w:line="276" w:lineRule="auto" w:after="120"/>
+        <w:spacing w:line="360" w:lineRule="auto" w:after="120"/>
+        <w:ind w:firstLine="709"/>
+        <w:jc w:val="both"/>
       </w:pPr>
       <w:r>
         <w:rPr>
+          <w:rFonts w:ascii="Arial" w:hAnsi="Arial"/>
           <w:b/>
+          <w:color w:val="000000"/>
+          <w:sz w:val="24"/>
         </w:rPr>
         <w:t>Projeto:</w:t>
       </w:r>
       <w:r>
+        <w:rPr>
+          <w:rFonts w:ascii="Arial" w:hAnsi="Arial"/>
+          <w:color w:val="000000"/>
+          <w:sz w:val="24"/>
+        </w:rPr>
         <w:t xml:space="preserve"> Sentir Bem — Sistema de Terapia Emocional e Atendimento Automatizado</w:t>
       </w:r>
     </w:p>
     <w:p>
       <w:pPr>
-        <w:spacing w:line="276" w:lineRule="auto" w:after="120"/>
+        <w:spacing w:line="360" w:lineRule="auto" w:after="120"/>
+        <w:ind w:firstLine="709"/>
+        <w:jc w:val="both"/>
       </w:pPr>
       <w:r>
         <w:rPr>
+          <w:rFonts w:ascii="Arial" w:hAnsi="Arial"/>
           <w:b/>
+          <w:color w:val="000000"/>
+          <w:sz w:val="24"/>
         </w:rPr>
         <w:t>Tema Gerador:</w:t>
       </w:r>
       <w:r>
+        <w:rPr>
+          <w:rFonts w:ascii="Arial" w:hAnsi="Arial"/>
+          <w:color w:val="000000"/>
+          <w:sz w:val="24"/>
+        </w:rPr>
         <w:t xml:space="preserve"> Plataforma Tecnológica para Acolhimento, Agendamento e Gestão em Saúde Mental</w:t>
       </w:r>
     </w:p>
     <w:p>
       <w:pPr>
-        <w:spacing w:line="276" w:lineRule="auto" w:after="120"/>
+        <w:spacing w:line="360" w:lineRule="auto" w:after="120"/>
+        <w:ind w:firstLine="709"/>
+        <w:jc w:val="both"/>
       </w:pPr>
       <w:r>
         <w:rPr>
+          <w:rFonts w:ascii="Arial" w:hAnsi="Arial"/>
           <w:b/>
+          <w:color w:val="000000"/>
+          <w:sz w:val="24"/>
         </w:rPr>
         <w:t>Tecnologias:</w:t>
       </w:r>
       <w:r>
+        <w:rPr>
+          <w:rFonts w:ascii="Arial" w:hAnsi="Arial"/>
+          <w:color w:val="000000"/>
+          <w:sz w:val="24"/>
+        </w:rPr>
         <w:t xml:space="preserve"> HTML5, CSS3, JavaScript Vanilla, Node.js (Express), </w:t>
       </w:r>
       <w:r>
         <w:rPr>
-          <w:rFonts w:ascii="Consolas" w:hAnsi="Consolas"/>
-          <w:color w:val="2D5A45"/>
-          <w:sz w:val="19"/>
+          <w:rFonts w:ascii="Courier New" w:hAnsi="Courier New"/>
+          <w:color w:val="1E1E1E"/>
+          <w:sz w:val="22"/>
         </w:rPr>
         <w:t>whatsapp-web.js</w:t>
       </w:r>
       <w:r>
+        <w:rPr>
+          <w:rFonts w:ascii="Arial" w:hAnsi="Arial"/>
+          <w:color w:val="000000"/>
+          <w:sz w:val="24"/>
+        </w:rPr>
         <w:t>, Supabase (PostgreSQL), PIX</w:t>
       </w:r>
     </w:p>
     <w:p>
       <w:pPr>
-        <w:pStyle w:val="Heading1"/>
+        <w:spacing w:line="360" w:lineRule="auto" w:before="360" w:after="240"/>
+        <w:jc w:val="left"/>
       </w:pPr>
       <w:r>
         <w:rPr>
           <w:rFonts w:ascii="Arial" w:hAnsi="Arial"/>
           <w:b/>
-          <w:color w:val="2D5A45"/>
-          <w:sz w:val="28"/>
+          <w:color w:val="000000"/>
+          <w:sz w:val="24"/>
         </w:rPr>
         <w:t>1. CONTEXTUALIZAÇÃO DO TEMA E INTRODUÇÃO</w:t>
       </w:r>
     </w:p>
     <w:p>
       <w:pPr>
-        <w:spacing w:line="276" w:lineRule="auto" w:after="120"/>
+        <w:spacing w:line="360" w:lineRule="auto" w:after="120"/>
+        <w:ind w:firstLine="709"/>
+        <w:jc w:val="both"/>
       </w:pPr>
       <w:r>
+        <w:rPr>
+          <w:rFonts w:ascii="Arial" w:hAnsi="Arial"/>
+          <w:color w:val="000000"/>
+          <w:sz w:val="24"/>
+        </w:rPr>
         <w:t>A saúde mental e o bem-estar emocional consolidaram-se como pilares fundamentais para a qualidade de vida na sociedade contemporânea. De acordo com a Organização Mundial da Saúde (OMS), o acesso ágil e humanizado a cuidados psicológicos é crucial para a prevenção e o tratamento de transtornos como ansiedade, depressão e estresse ocupacional.</w:t>
       </w:r>
     </w:p>
     <w:p>
       <w:pPr>
-        <w:spacing w:line="276" w:lineRule="auto" w:after="120"/>
+        <w:spacing w:line="360" w:lineRule="auto" w:after="120"/>
+        <w:ind w:firstLine="709"/>
+        <w:jc w:val="both"/>
       </w:pPr>
       <w:r>
+        <w:rPr>
+          <w:rFonts w:ascii="Arial" w:hAnsi="Arial"/>
+          <w:color w:val="000000"/>
+          <w:sz w:val="24"/>
+        </w:rPr>
         <w:t>Contudo, a busca por atendimento psicológico ainda enfrenta sérias barreiras de acesso. Entre os principais obstáculos estão a burocracia no agendamento, a falta de clareza nas informações de serviços e valores, a demora no primeiro acolhimento e a ausência de canais digitais integrados e diretos. Muitas vezes, no momento de maior vulnerabilidade emocional, o paciente depara-se com processos lentos e desorganizados, o que resulta no abandono da busca por ajuda.</w:t>
       </w:r>
     </w:p>
     <w:p>
       <w:pPr>
-        <w:spacing w:line="276" w:lineRule="auto" w:after="120"/>
+        <w:spacing w:line="360" w:lineRule="auto" w:after="120"/>
+        <w:ind w:firstLine="709"/>
+        <w:jc w:val="both"/>
       </w:pPr>
       <w:r>
+        <w:rPr>
+          <w:rFonts w:ascii="Arial" w:hAnsi="Arial"/>
+          <w:color w:val="000000"/>
+          <w:sz w:val="24"/>
+        </w:rPr>
         <w:t xml:space="preserve">O projeto </w:t>
       </w:r>
       <w:r>
         <w:rPr>
+          <w:rFonts w:ascii="Arial" w:hAnsi="Arial"/>
           <w:b/>
+          <w:color w:val="000000"/>
+          <w:sz w:val="24"/>
         </w:rPr>
         <w:t>Sentir Bem</w:t>
       </w:r>
       <w:r>
+        <w:rPr>
+          <w:rFonts w:ascii="Arial" w:hAnsi="Arial"/>
+          <w:color w:val="000000"/>
+          <w:sz w:val="24"/>
+        </w:rPr>
         <w:t xml:space="preserve"> surge para enfrentar essa problemática, desenvolvendo uma solução tecnológica moderna que une um </w:t>
       </w:r>
       <w:r>
         <w:rPr>
+          <w:rFonts w:ascii="Arial" w:hAnsi="Arial"/>
           <w:b/>
+          <w:color w:val="000000"/>
+          <w:sz w:val="24"/>
         </w:rPr>
         <w:t>site institucional receptivo e transparente</w:t>
       </w:r>
       <w:r>
+        <w:rPr>
+          <w:rFonts w:ascii="Arial" w:hAnsi="Arial"/>
+          <w:color w:val="000000"/>
+          <w:sz w:val="24"/>
+        </w:rPr>
         <w:t xml:space="preserve"> a um </w:t>
       </w:r>
       <w:r>
         <w:rPr>
+          <w:rFonts w:ascii="Arial" w:hAnsi="Arial"/>
           <w:b/>
+          <w:color w:val="000000"/>
+          <w:sz w:val="24"/>
         </w:rPr>
         <w:t>sistema de atendimento automatizado via WhatsApp</w:t>
       </w:r>
       <w:r>
+        <w:rPr>
+          <w:rFonts w:ascii="Arial" w:hAnsi="Arial"/>
+          <w:color w:val="000000"/>
+          <w:sz w:val="24"/>
+        </w:rPr>
         <w:t xml:space="preserve"> (integrado a banco de dados relacional e painel administrativo). A proposta busca democratizar e agilizar o acesso à terapia emocional, proporcionando uma experiência contínua, segura e acolhedora desde o primeiro contato até o acompanhamento das consultas.</w:t>
       </w:r>
     </w:p>
     <w:p>
       <w:pPr>
-        <w:pStyle w:val="Heading1"/>
+        <w:spacing w:line="360" w:lineRule="auto" w:before="360" w:after="240"/>
+        <w:jc w:val="left"/>
       </w:pPr>
       <w:r>
         <w:rPr>
           <w:rFonts w:ascii="Arial" w:hAnsi="Arial"/>
           <w:b/>
-          <w:color w:val="2D5A45"/>
-          <w:sz w:val="28"/>
+          <w:color w:val="000000"/>
+          <w:sz w:val="24"/>
         </w:rPr>
         <w:t>2. PERCURSO METODOLÓGICO</w:t>
       </w:r>
     </w:p>
     <w:p>
       <w:pPr>
-        <w:pStyle w:val="Heading2"/>
+        <w:spacing w:line="360" w:lineRule="auto" w:before="280" w:after="160"/>
+        <w:jc w:val="left"/>
       </w:pPr>
       <w:r>
         <w:rPr>
           <w:rFonts w:ascii="Arial" w:hAnsi="Arial"/>
           <w:b/>
-          <w:color w:val="38664F"/>
+          <w:color w:val="000000"/>
           <w:sz w:val="24"/>
         </w:rPr>
         <w:t>2.1 A Coleta de Dados e a Definição do Corpus</w:t>
@@ -165,113 +248,224 @@
     </w:p>
     <w:p>
       <w:pPr>
-        <w:spacing w:line="276" w:lineRule="auto" w:after="120"/>
+        <w:spacing w:line="360" w:lineRule="auto" w:after="120"/>
+        <w:ind w:firstLine="709"/>
+        <w:jc w:val="both"/>
       </w:pPr>
       <w:r>
+        <w:rPr>
+          <w:rFonts w:ascii="Arial" w:hAnsi="Arial"/>
+          <w:color w:val="000000"/>
+          <w:sz w:val="24"/>
+        </w:rPr>
         <w:t xml:space="preserve">Os dados para a fundamentação desta pesquisa e para o desenvolvimento da plataforma foram coletados por meio de </w:t>
       </w:r>
       <w:r>
         <w:rPr>
+          <w:rFonts w:ascii="Arial" w:hAnsi="Arial"/>
           <w:b/>
+          <w:color w:val="000000"/>
+          <w:sz w:val="24"/>
         </w:rPr>
         <w:t>pesquisa bibliográfica, documental e de requisitos técnicos</w:t>
       </w:r>
       <w:r>
+        <w:rPr>
+          <w:rFonts w:ascii="Arial" w:hAnsi="Arial"/>
+          <w:color w:val="000000"/>
+          <w:sz w:val="24"/>
+        </w:rPr>
         <w:t>, utilizando normativas oficiais de psicologia, diretrizes de telessaúde e documentações tecnológicas.</w:t>
       </w:r>
     </w:p>
     <w:p>
       <w:pPr>
-        <w:spacing w:line="276" w:lineRule="auto" w:after="120"/>
+        <w:spacing w:line="360" w:lineRule="auto" w:after="120"/>
+        <w:ind w:firstLine="709"/>
+        <w:jc w:val="both"/>
       </w:pPr>
       <w:r>
+        <w:rPr>
+          <w:rFonts w:ascii="Arial" w:hAnsi="Arial"/>
+          <w:color w:val="000000"/>
+          <w:sz w:val="24"/>
+        </w:rPr>
         <w:t>O corpus da pesquisa foi composto por:</w:t>
       </w:r>
     </w:p>
     <w:p>
       <w:pPr>
-        <w:pStyle w:val="ListNumber"/>
+        <w:spacing w:line="360" w:lineRule="auto" w:after="120"/>
+        <w:ind w:left="709"/>
+        <w:jc w:val="both"/>
       </w:pPr>
       <w:r>
         <w:rPr>
+          <w:rFonts w:ascii="Arial" w:hAnsi="Arial"/>
           <w:b/>
+          <w:color w:val="000000"/>
+          <w:sz w:val="24"/>
+        </w:rPr>
+        <w:t xml:space="preserve">1. </w:t>
+      </w:r>
+      <w:r>
+        <w:rPr>
+          <w:rFonts w:ascii="Arial" w:hAnsi="Arial"/>
+          <w:b/>
+          <w:color w:val="000000"/>
+          <w:sz w:val="24"/>
         </w:rPr>
         <w:t>Diretrizes Oficiais de Saúde e Psicologia:</w:t>
       </w:r>
       <w:r>
+        <w:rPr>
+          <w:rFonts w:ascii="Arial" w:hAnsi="Arial"/>
+          <w:color w:val="000000"/>
+          <w:sz w:val="24"/>
+        </w:rPr>
         <w:t xml:space="preserve"> Resoluções do Conselho Federal de Psicologia (CFP, em especial a Resolução nº 11/2018 sobre prestação de serviços psicológicos mediados por TIC) e relatórios da Organização Mundial da Saúde (OMS).</w:t>
       </w:r>
     </w:p>
     <w:p>
       <w:pPr>
-        <w:pStyle w:val="ListNumber"/>
+        <w:spacing w:line="360" w:lineRule="auto" w:after="120"/>
+        <w:ind w:left="709"/>
+        <w:jc w:val="both"/>
       </w:pPr>
       <w:r>
         <w:rPr>
+          <w:rFonts w:ascii="Arial" w:hAnsi="Arial"/>
           <w:b/>
+          <w:color w:val="000000"/>
+          <w:sz w:val="24"/>
+        </w:rPr>
+        <w:t xml:space="preserve">2. </w:t>
+      </w:r>
+      <w:r>
+        <w:rPr>
+          <w:rFonts w:ascii="Arial" w:hAnsi="Arial"/>
+          <w:b/>
+          <w:color w:val="000000"/>
+          <w:sz w:val="24"/>
         </w:rPr>
         <w:t>Legislação e Segurança da Informação:</w:t>
       </w:r>
       <w:r>
+        <w:rPr>
+          <w:rFonts w:ascii="Arial" w:hAnsi="Arial"/>
+          <w:color w:val="000000"/>
+          <w:sz w:val="24"/>
+        </w:rPr>
         <w:t xml:space="preserve"> Lei Geral de Proteção de Dados Pessoais (LGPD - Lei nº 13.709/2018), com foco na proteção de dados sensíveis de saúde e identificadores únicos (CPF).</w:t>
       </w:r>
     </w:p>
     <w:p>
       <w:pPr>
-        <w:pStyle w:val="ListNumber"/>
+        <w:spacing w:line="360" w:lineRule="auto" w:after="120"/>
+        <w:ind w:left="709"/>
+        <w:jc w:val="both"/>
       </w:pPr>
       <w:r>
         <w:rPr>
+          <w:rFonts w:ascii="Arial" w:hAnsi="Arial"/>
           <w:b/>
+          <w:color w:val="000000"/>
+          <w:sz w:val="24"/>
+        </w:rPr>
+        <w:t xml:space="preserve">3. </w:t>
+      </w:r>
+      <w:r>
+        <w:rPr>
+          <w:rFonts w:ascii="Arial" w:hAnsi="Arial"/>
+          <w:b/>
+          <w:color w:val="000000"/>
+          <w:sz w:val="24"/>
         </w:rPr>
         <w:t>Documentação Técnica e Arquitetural:</w:t>
       </w:r>
       <w:r>
+        <w:rPr>
+          <w:rFonts w:ascii="Arial" w:hAnsi="Arial"/>
+          <w:color w:val="000000"/>
+          <w:sz w:val="24"/>
+        </w:rPr>
         <w:t xml:space="preserve"> Manuais e especificações do Node.js, Express framework, </w:t>
       </w:r>
       <w:r>
         <w:rPr>
-          <w:rFonts w:ascii="Consolas" w:hAnsi="Consolas"/>
-          <w:color w:val="2D5A45"/>
-          <w:sz w:val="19"/>
+          <w:rFonts w:ascii="Courier New" w:hAnsi="Courier New"/>
+          <w:color w:val="1E1E1E"/>
+          <w:sz w:val="22"/>
         </w:rPr>
         <w:t>whatsapp-web.js</w:t>
       </w:r>
       <w:r>
+        <w:rPr>
+          <w:rFonts w:ascii="Arial" w:hAnsi="Arial"/>
+          <w:color w:val="000000"/>
+          <w:sz w:val="24"/>
+        </w:rPr>
         <w:t>, Supabase BaaS (PostgreSQL) e padrões de design UI/UX (Glassmorphism e Acessibilidade Web).</w:t>
       </w:r>
     </w:p>
     <w:p>
       <w:pPr>
-        <w:pStyle w:val="ListNumber"/>
+        <w:spacing w:line="360" w:lineRule="auto" w:after="120"/>
+        <w:ind w:left="709"/>
+        <w:jc w:val="both"/>
       </w:pPr>
       <w:r>
         <w:rPr>
+          <w:rFonts w:ascii="Arial" w:hAnsi="Arial"/>
           <w:b/>
+          <w:color w:val="000000"/>
+          <w:sz w:val="24"/>
+        </w:rPr>
+        <w:t xml:space="preserve">4. </w:t>
+      </w:r>
+      <w:r>
+        <w:rPr>
+          <w:rFonts w:ascii="Arial" w:hAnsi="Arial"/>
+          <w:b/>
+          <w:color w:val="000000"/>
+          <w:sz w:val="24"/>
         </w:rPr>
         <w:t>Canais de Emergência em Saúde Mental:</w:t>
       </w:r>
       <w:r>
+        <w:rPr>
+          <w:rFonts w:ascii="Arial" w:hAnsi="Arial"/>
+          <w:color w:val="000000"/>
+          <w:sz w:val="24"/>
+        </w:rPr>
         <w:t xml:space="preserve"> Protocolos de encaminhamento e diretrizes do Centro de Valorização da Vida (CVV - 188).</w:t>
       </w:r>
     </w:p>
     <w:p>
       <w:pPr>
-        <w:spacing w:line="276" w:lineRule="auto" w:after="120"/>
+        <w:spacing w:line="360" w:lineRule="auto" w:after="120"/>
+        <w:ind w:firstLine="709"/>
+        <w:jc w:val="both"/>
       </w:pPr>
       <w:r>
+        <w:rPr>
+          <w:rFonts w:ascii="Arial" w:hAnsi="Arial"/>
+          <w:color w:val="000000"/>
+          <w:sz w:val="24"/>
+        </w:rPr>
         <w:t>As informações foram analisadas de forma qualitativa, permitindo mapear a jornada do paciente e identificar como a tecnologia pode eliminar intermediários desnecessários, reduzindo o tempo de espera no agendamento.</w:t>
       </w:r>
     </w:p>
     <w:p>
       <w:pPr>
-        <w:pStyle w:val="Heading2"/>
+        <w:spacing w:line="360" w:lineRule="auto" w:before="280" w:after="160"/>
+        <w:jc w:val="left"/>
       </w:pPr>
       <w:r>
         <w:rPr>
           <w:rFonts w:ascii="Arial" w:hAnsi="Arial"/>
           <w:b/>
-          <w:color w:val="38664F"/>
+          <w:color w:val="000000"/>
           <w:sz w:val="24"/>
         </w:rPr>
         <w:t>2.2 Tema / Objeto de Estudo</w:t>
@@ -279,120 +473,204 @@
     </w:p>
     <w:p>
       <w:pPr>
-        <w:spacing w:line="276" w:lineRule="auto" w:after="120"/>
+        <w:spacing w:line="360" w:lineRule="auto" w:after="120"/>
+        <w:ind w:firstLine="709"/>
+        <w:jc w:val="both"/>
       </w:pPr>
       <w:r>
+        <w:rPr>
+          <w:rFonts w:ascii="Arial" w:hAnsi="Arial"/>
+          <w:color w:val="000000"/>
+          <w:sz w:val="24"/>
+        </w:rPr>
         <w:t xml:space="preserve">O objeto de estudo consiste no desenvolvimento e na avaliação de um </w:t>
       </w:r>
       <w:r>
         <w:rPr>
+          <w:rFonts w:ascii="Arial" w:hAnsi="Arial"/>
           <w:b/>
+          <w:color w:val="000000"/>
+          <w:sz w:val="24"/>
         </w:rPr>
         <w:t>sistema integrado de terapia emocional e gestão de atendimento (Sentir Bem)</w:t>
       </w:r>
       <w:r>
+        <w:rPr>
+          <w:rFonts w:ascii="Arial" w:hAnsi="Arial"/>
+          <w:color w:val="000000"/>
+          <w:sz w:val="24"/>
+        </w:rPr>
         <w:t>, compreendendo:</w:t>
       </w:r>
     </w:p>
     <w:p>
       <w:pPr>
-        <w:pStyle w:val="ListBullet"/>
+        <w:spacing w:line="360" w:lineRule="auto" w:after="120"/>
+        <w:ind w:left="709"/>
+        <w:jc w:val="both"/>
       </w:pPr>
       <w:r>
+        <w:rPr>
+          <w:rFonts w:ascii="Arial" w:hAnsi="Arial"/>
+          <w:color w:val="000000"/>
+          <w:sz w:val="24"/>
+        </w:rPr>
         <w:t xml:space="preserve">Uma </w:t>
       </w:r>
       <w:r>
         <w:rPr>
+          <w:rFonts w:ascii="Arial" w:hAnsi="Arial"/>
           <w:b/>
+          <w:color w:val="000000"/>
+          <w:sz w:val="24"/>
         </w:rPr>
         <w:t>Landing Page Institucional</w:t>
       </w:r>
       <w:r>
+        <w:rPr>
+          <w:rFonts w:ascii="Arial" w:hAnsi="Arial"/>
+          <w:color w:val="000000"/>
+          <w:sz w:val="24"/>
+        </w:rPr>
         <w:t xml:space="preserve"> responsiva para apresentação da clínica, pilares terapêuticos, especialidades e planos de atendimento;</w:t>
       </w:r>
     </w:p>
     <w:p>
       <w:pPr>
-        <w:pStyle w:val="ListBullet"/>
+        <w:spacing w:line="360" w:lineRule="auto" w:after="120"/>
+        <w:ind w:left="709"/>
+        <w:jc w:val="both"/>
       </w:pPr>
       <w:r>
+        <w:rPr>
+          <w:rFonts w:ascii="Arial" w:hAnsi="Arial"/>
+          <w:color w:val="000000"/>
+          <w:sz w:val="24"/>
+        </w:rPr>
         <w:t xml:space="preserve">Um </w:t>
       </w:r>
       <w:r>
         <w:rPr>
+          <w:rFonts w:ascii="Arial" w:hAnsi="Arial"/>
           <w:b/>
+          <w:color w:val="000000"/>
+          <w:sz w:val="24"/>
         </w:rPr>
         <w:t>Assistente Virtual no WhatsApp (`chatbot.js`)</w:t>
       </w:r>
       <w:r>
+        <w:rPr>
+          <w:rFonts w:ascii="Arial" w:hAnsi="Arial"/>
+          <w:color w:val="000000"/>
+          <w:sz w:val="24"/>
+        </w:rPr>
         <w:t xml:space="preserve"> capaz de efetuar autoatendimento 24/7, verificação e cadastro de pacientes via CPF, reagendamento automático de consultas e triagem emergencial;</w:t>
       </w:r>
     </w:p>
     <w:p>
       <w:pPr>
-        <w:pStyle w:val="ListBullet"/>
+        <w:spacing w:line="360" w:lineRule="auto" w:after="120"/>
+        <w:ind w:left="709"/>
+        <w:jc w:val="both"/>
       </w:pPr>
       <w:r>
+        <w:rPr>
+          <w:rFonts w:ascii="Arial" w:hAnsi="Arial"/>
+          <w:color w:val="000000"/>
+          <w:sz w:val="24"/>
+        </w:rPr>
         <w:t xml:space="preserve">Um </w:t>
       </w:r>
       <w:r>
         <w:rPr>
+          <w:rFonts w:ascii="Arial" w:hAnsi="Arial"/>
           <w:b/>
+          <w:color w:val="000000"/>
+          <w:sz w:val="24"/>
         </w:rPr>
         <w:t>Painel Administrativo (`/admin`)</w:t>
       </w:r>
       <w:r>
+        <w:rPr>
+          <w:rFonts w:ascii="Arial" w:hAnsi="Arial"/>
+          <w:color w:val="000000"/>
+          <w:sz w:val="24"/>
+        </w:rPr>
         <w:t xml:space="preserve"> em tempo real para controle de agendas, gestão de clientes, bloqueios/desbloqueios e monitoramento de logs de sistema (SSE);</w:t>
       </w:r>
     </w:p>
     <w:p>
       <w:pPr>
-        <w:pStyle w:val="ListBullet"/>
+        <w:spacing w:line="360" w:lineRule="auto" w:after="120"/>
+        <w:ind w:left="709"/>
+        <w:jc w:val="both"/>
       </w:pPr>
       <w:r>
+        <w:rPr>
+          <w:rFonts w:ascii="Arial" w:hAnsi="Arial"/>
+          <w:color w:val="000000"/>
+          <w:sz w:val="24"/>
+        </w:rPr>
         <w:t xml:space="preserve">A integração de </w:t>
       </w:r>
       <w:r>
         <w:rPr>
+          <w:rFonts w:ascii="Arial" w:hAnsi="Arial"/>
           <w:b/>
+          <w:color w:val="000000"/>
+          <w:sz w:val="24"/>
         </w:rPr>
         <w:t>módulos de pagamento instantâneo via PIX (QR Code)</w:t>
       </w:r>
       <w:r>
+        <w:rPr>
+          <w:rFonts w:ascii="Arial" w:hAnsi="Arial"/>
+          <w:color w:val="000000"/>
+          <w:sz w:val="24"/>
+        </w:rPr>
         <w:t xml:space="preserve"> para facilitação do acerto de consultas.</w:t>
       </w:r>
     </w:p>
     <w:p>
       <w:pPr>
-        <w:pStyle w:val="Heading3"/>
+        <w:spacing w:line="360" w:lineRule="auto" w:before="240" w:after="120"/>
+        <w:jc w:val="left"/>
       </w:pPr>
       <w:r>
         <w:rPr>
           <w:rFonts w:ascii="Arial" w:hAnsi="Arial"/>
           <w:b/>
-          <w:color w:val="3C3C3C"/>
-          <w:sz w:val="22"/>
+          <w:color w:val="000000"/>
+          <w:sz w:val="24"/>
         </w:rPr>
         <w:t>Justificativa da Escolha</w:t>
       </w:r>
     </w:p>
     <w:p>
       <w:pPr>
-        <w:spacing w:line="276" w:lineRule="auto" w:after="120"/>
+        <w:spacing w:line="360" w:lineRule="auto" w:after="120"/>
+        <w:ind w:firstLine="709"/>
+        <w:jc w:val="both"/>
       </w:pPr>
       <w:r>
+        <w:rPr>
+          <w:rFonts w:ascii="Arial" w:hAnsi="Arial"/>
+          <w:color w:val="000000"/>
+          <w:sz w:val="24"/>
+        </w:rPr>
         <w:t>A escolha deste objeto pautou-se na observação direta das dificuldades enfrentadas por pacientes ao tentarem agendar consultas psicológicas por meios tradicionais. A ausência de respostas rápidas fora do horário comercial, a perda de informações de cadastro e a lentidão no reagendamento afetam negativamente a adesão ao tratamento. A utilização do WhatsApp — aplicativo já presente no cotidiano da quase totalidade dos usuários — elimina a necessidade de instalar novos aplicativos, tornando o acolhimento imediato e familiar.</w:t>
       </w:r>
     </w:p>
     <w:p>
       <w:pPr>
-        <w:pStyle w:val="Heading2"/>
+        <w:spacing w:line="360" w:lineRule="auto" w:before="280" w:after="160"/>
+        <w:jc w:val="left"/>
       </w:pPr>
       <w:r>
         <w:rPr>
           <w:rFonts w:ascii="Arial" w:hAnsi="Arial"/>
           <w:b/>
-          <w:color w:val="38664F"/>
+          <w:color w:val="000000"/>
           <w:sz w:val="24"/>
         </w:rPr>
         <w:t>2.3 Problematização</w:t>
@@ -400,65 +678,125 @@
     </w:p>
     <w:p>
       <w:pPr>
-        <w:spacing w:line="276" w:lineRule="auto" w:after="120"/>
+        <w:spacing w:line="360" w:lineRule="auto" w:after="120"/>
+        <w:ind w:firstLine="709"/>
+        <w:jc w:val="both"/>
       </w:pPr>
       <w:r>
         <w:rPr>
+          <w:rFonts w:ascii="Arial" w:hAnsi="Arial"/>
           <w:b/>
+          <w:color w:val="000000"/>
+          <w:sz w:val="24"/>
         </w:rPr>
         <w:t>Problema Central:</w:t>
       </w:r>
       <w:r>
+        <w:rPr>
+          <w:rFonts w:ascii="Arial" w:hAnsi="Arial"/>
+          <w:color w:val="000000"/>
+          <w:sz w:val="24"/>
+        </w:rPr>
         <w:t xml:space="preserve"> Como reduzir a morosidade e a desorganização no processo de agendamento de consultas psicológicas, garantindo um acolhimento inicial rápido, seguro e acessível para o paciente, ao mesmo tempo em que se fornece uma ferramenta eficiente de gestão para a equipe médica/administrativa?</w:t>
       </w:r>
     </w:p>
     <w:p>
       <w:pPr>
-        <w:pStyle w:val="Heading3"/>
+        <w:spacing w:line="360" w:lineRule="auto" w:before="240" w:after="120"/>
+        <w:jc w:val="left"/>
       </w:pPr>
       <w:r>
         <w:rPr>
           <w:rFonts w:ascii="Arial" w:hAnsi="Arial"/>
           <w:b/>
-          <w:color w:val="3C3C3C"/>
-          <w:sz w:val="22"/>
+          <w:color w:val="000000"/>
+          <w:sz w:val="24"/>
         </w:rPr>
         <w:t>Questões Orientadoras:</w:t>
       </w:r>
     </w:p>
     <w:p>
       <w:pPr>
-        <w:pStyle w:val="ListNumber"/>
+        <w:spacing w:line="360" w:lineRule="auto" w:after="120"/>
+        <w:ind w:left="709"/>
+        <w:jc w:val="both"/>
       </w:pPr>
       <w:r>
+        <w:rPr>
+          <w:rFonts w:ascii="Arial" w:hAnsi="Arial"/>
+          <w:b/>
+          <w:color w:val="000000"/>
+          <w:sz w:val="24"/>
+        </w:rPr>
+        <w:t xml:space="preserve">1. </w:t>
+      </w:r>
+      <w:r>
+        <w:rPr>
+          <w:rFonts w:ascii="Arial" w:hAnsi="Arial"/>
+          <w:color w:val="000000"/>
+          <w:sz w:val="24"/>
+        </w:rPr>
         <w:t>De que maneira a automação de atendimento via WhatsApp pode agilizar o cadastro de pacientes por CPF e o reagendamento de consultas sem sobrecarregar a equipe humana?</w:t>
       </w:r>
     </w:p>
     <w:p>
       <w:pPr>
-        <w:pStyle w:val="ListNumber"/>
+        <w:spacing w:line="360" w:lineRule="auto" w:after="120"/>
+        <w:ind w:left="709"/>
+        <w:jc w:val="both"/>
       </w:pPr>
       <w:r>
+        <w:rPr>
+          <w:rFonts w:ascii="Arial" w:hAnsi="Arial"/>
+          <w:b/>
+          <w:color w:val="000000"/>
+          <w:sz w:val="24"/>
+        </w:rPr>
+        <w:t xml:space="preserve">2. </w:t>
+      </w:r>
+      <w:r>
+        <w:rPr>
+          <w:rFonts w:ascii="Arial" w:hAnsi="Arial"/>
+          <w:color w:val="000000"/>
+          <w:sz w:val="24"/>
+        </w:rPr>
         <w:t>Como garantir que uma plataforma de atendimento automatizado identifique situações de crise emocional (como ideação suicida) e direcione o paciente para apoio emergencial (CVV 188)?</w:t>
       </w:r>
     </w:p>
     <w:p>
       <w:pPr>
-        <w:pStyle w:val="ListNumber"/>
+        <w:spacing w:line="360" w:lineRule="auto" w:after="120"/>
+        <w:ind w:left="709"/>
+        <w:jc w:val="both"/>
       </w:pPr>
       <w:r>
+        <w:rPr>
+          <w:rFonts w:ascii="Arial" w:hAnsi="Arial"/>
+          <w:b/>
+          <w:color w:val="000000"/>
+          <w:sz w:val="24"/>
+        </w:rPr>
+        <w:t xml:space="preserve">3. </w:t>
+      </w:r>
+      <w:r>
+        <w:rPr>
+          <w:rFonts w:ascii="Arial" w:hAnsi="Arial"/>
+          <w:color w:val="000000"/>
+          <w:sz w:val="24"/>
+        </w:rPr>
         <w:t>Como estruturar um painel administrativo seguro e responsivo para que os profissionais acompanhem históricos de atendimento e parâmetros da clínica em tempo real?</w:t>
       </w:r>
     </w:p>
     <w:p>
       <w:pPr>
-        <w:pStyle w:val="Heading2"/>
+        <w:spacing w:line="360" w:lineRule="auto" w:before="280" w:after="160"/>
+        <w:jc w:val="left"/>
       </w:pPr>
       <w:r>
         <w:rPr>
           <w:rFonts w:ascii="Arial" w:hAnsi="Arial"/>
           <w:b/>
-          <w:color w:val="38664F"/>
+          <w:color w:val="000000"/>
           <w:sz w:val="24"/>
         </w:rPr>
         <w:t>2.4 Objetivos</w:t>
@@ -466,186 +804,284 @@
     </w:p>
     <w:p>
       <w:pPr>
-        <w:pStyle w:val="Heading3"/>
+        <w:spacing w:line="360" w:lineRule="auto" w:before="240" w:after="120"/>
+        <w:jc w:val="left"/>
       </w:pPr>
       <w:r>
         <w:rPr>
           <w:rFonts w:ascii="Arial" w:hAnsi="Arial"/>
           <w:b/>
-          <w:color w:val="3C3C3C"/>
-          <w:sz w:val="22"/>
+          <w:color w:val="000000"/>
+          <w:sz w:val="24"/>
         </w:rPr>
         <w:t>Objetivo Geral</w:t>
       </w:r>
     </w:p>
     <w:p>
       <w:pPr>
-        <w:spacing w:line="276" w:lineRule="auto" w:after="120"/>
+        <w:spacing w:line="360" w:lineRule="auto" w:after="120"/>
+        <w:ind w:firstLine="709"/>
+        <w:jc w:val="both"/>
       </w:pPr>
       <w:r>
+        <w:rPr>
+          <w:rFonts w:ascii="Arial" w:hAnsi="Arial"/>
+          <w:color w:val="000000"/>
+          <w:sz w:val="24"/>
+        </w:rPr>
         <w:t xml:space="preserve">Desenvolver e implementar a plataforma </w:t>
       </w:r>
       <w:r>
         <w:rPr>
+          <w:rFonts w:ascii="Arial" w:hAnsi="Arial"/>
           <w:b/>
+          <w:color w:val="000000"/>
+          <w:sz w:val="24"/>
         </w:rPr>
         <w:t>Sentir Bem</w:t>
       </w:r>
       <w:r>
+        <w:rPr>
+          <w:rFonts w:ascii="Arial" w:hAnsi="Arial"/>
+          <w:color w:val="000000"/>
+          <w:sz w:val="24"/>
+        </w:rPr>
         <w:t>, integrando um site institucional responsivo a um sistema de automação no WhatsApp com suporte a cadastro via CPF, reagendamento, pagamentos PIX, triagem de crise e um painel de gestão administrativa em tempo real.</w:t>
       </w:r>
     </w:p>
     <w:p>
       <w:pPr>
-        <w:pStyle w:val="Heading3"/>
+        <w:spacing w:line="360" w:lineRule="auto" w:before="240" w:after="120"/>
+        <w:jc w:val="left"/>
       </w:pPr>
       <w:r>
         <w:rPr>
           <w:rFonts w:ascii="Arial" w:hAnsi="Arial"/>
           <w:b/>
-          <w:color w:val="3C3C3C"/>
-          <w:sz w:val="22"/>
+          <w:color w:val="000000"/>
+          <w:sz w:val="24"/>
         </w:rPr>
         <w:t>Objetivos Específicos</w:t>
       </w:r>
     </w:p>
     <w:p>
       <w:pPr>
-        <w:pStyle w:val="ListBullet"/>
+        <w:spacing w:line="360" w:lineRule="auto" w:after="120"/>
+        <w:ind w:left="709"/>
+        <w:jc w:val="both"/>
       </w:pPr>
       <w:r>
         <w:rPr>
+          <w:rFonts w:ascii="Arial" w:hAnsi="Arial"/>
           <w:b/>
+          <w:color w:val="000000"/>
+          <w:sz w:val="24"/>
         </w:rPr>
         <w:t>a) Identificar e Mapear Demandas:</w:t>
       </w:r>
       <w:r>
+        <w:rPr>
+          <w:rFonts w:ascii="Arial" w:hAnsi="Arial"/>
+          <w:color w:val="000000"/>
+          <w:sz w:val="24"/>
+        </w:rPr>
         <w:t xml:space="preserve"> Mapear o fluxo de atendimento tradicional em clínicas de psicologia para identificar pontos de travamento e atraso no agendamento.</w:t>
       </w:r>
     </w:p>
     <w:p>
       <w:pPr>
-        <w:pStyle w:val="ListBullet"/>
+        <w:spacing w:line="360" w:lineRule="auto" w:after="120"/>
+        <w:ind w:left="709"/>
+        <w:jc w:val="both"/>
       </w:pPr>
       <w:r>
         <w:rPr>
+          <w:rFonts w:ascii="Arial" w:hAnsi="Arial"/>
           <w:b/>
+          <w:color w:val="000000"/>
+          <w:sz w:val="24"/>
         </w:rPr>
         <w:t>b) Desenvolver a Interface Web (Landing Page):</w:t>
       </w:r>
       <w:r>
+        <w:rPr>
+          <w:rFonts w:ascii="Arial" w:hAnsi="Arial"/>
+          <w:color w:val="000000"/>
+          <w:sz w:val="24"/>
+        </w:rPr>
         <w:t xml:space="preserve"> Criar uma interface acolhedora utilizando HTML5 semântico, CSS3 (com Glassmorphism e animações AOS) e JavaScript ES6+, destacando especialidades, planos e pagamentos facilitados.</w:t>
       </w:r>
     </w:p>
     <w:p>
       <w:pPr>
-        <w:pStyle w:val="ListBullet"/>
+        <w:spacing w:line="360" w:lineRule="auto" w:after="120"/>
+        <w:ind w:left="709"/>
+        <w:jc w:val="both"/>
       </w:pPr>
       <w:r>
         <w:rPr>
+          <w:rFonts w:ascii="Arial" w:hAnsi="Arial"/>
           <w:b/>
+          <w:color w:val="000000"/>
+          <w:sz w:val="24"/>
         </w:rPr>
         <w:t>c) Construir o Bot de Atendimento WhatsApp:</w:t>
       </w:r>
       <w:r>
+        <w:rPr>
+          <w:rFonts w:ascii="Arial" w:hAnsi="Arial"/>
+          <w:color w:val="000000"/>
+          <w:sz w:val="24"/>
+        </w:rPr>
         <w:t xml:space="preserve"> Desenvolver um backend robusto em Node.js/Express utilizando </w:t>
       </w:r>
       <w:r>
         <w:rPr>
-          <w:rFonts w:ascii="Consolas" w:hAnsi="Consolas"/>
-          <w:color w:val="2D5A45"/>
-          <w:sz w:val="19"/>
+          <w:rFonts w:ascii="Courier New" w:hAnsi="Courier New"/>
+          <w:color w:val="1E1E1E"/>
+          <w:sz w:val="22"/>
         </w:rPr>
         <w:t>whatsapp-web.js</w:t>
       </w:r>
       <w:r>
+        <w:rPr>
+          <w:rFonts w:ascii="Arial" w:hAnsi="Arial"/>
+          <w:color w:val="000000"/>
+          <w:sz w:val="24"/>
+        </w:rPr>
         <w:t xml:space="preserve"> para realizar interações automáticas, consulta de cadastro por CPF e reagendamento autônomo.</w:t>
       </w:r>
     </w:p>
     <w:p>
       <w:pPr>
-        <w:pStyle w:val="ListBullet"/>
+        <w:spacing w:line="360" w:lineRule="auto" w:after="120"/>
+        <w:ind w:left="709"/>
+        <w:jc w:val="both"/>
       </w:pPr>
       <w:r>
         <w:rPr>
+          <w:rFonts w:ascii="Arial" w:hAnsi="Arial"/>
           <w:b/>
+          <w:color w:val="000000"/>
+          <w:sz w:val="24"/>
         </w:rPr>
         <w:t>d) Implementar Mecanismos de Triagem e Seguranca:</w:t>
       </w:r>
       <w:r>
+        <w:rPr>
+          <w:rFonts w:ascii="Arial" w:hAnsi="Arial"/>
+          <w:color w:val="000000"/>
+          <w:sz w:val="24"/>
+        </w:rPr>
         <w:t xml:space="preserve"> Desenvolver filtros de análise de mensagens para detectar expressões de crise emocional ou risco e oferecer suporte imediato via CVV (188), garantindo também o armazenamento seguro de senhas administrativeis por algoritmo de hash </w:t>
       </w:r>
       <w:r>
         <w:rPr>
-          <w:rFonts w:ascii="Consolas" w:hAnsi="Consolas"/>
-          <w:color w:val="2D5A45"/>
-          <w:sz w:val="19"/>
+          <w:rFonts w:ascii="Courier New" w:hAnsi="Courier New"/>
+          <w:color w:val="1E1E1E"/>
+          <w:sz w:val="22"/>
         </w:rPr>
         <w:t>scrypt</w:t>
       </w:r>
       <w:r>
+        <w:rPr>
+          <w:rFonts w:ascii="Arial" w:hAnsi="Arial"/>
+          <w:color w:val="000000"/>
+          <w:sz w:val="24"/>
+        </w:rPr>
         <w:t>.</w:t>
       </w:r>
     </w:p>
     <w:p>
       <w:pPr>
-        <w:pStyle w:val="ListBullet"/>
+        <w:spacing w:line="360" w:lineRule="auto" w:after="120"/>
+        <w:ind w:left="709"/>
+        <w:jc w:val="both"/>
       </w:pPr>
       <w:r>
         <w:rPr>
+          <w:rFonts w:ascii="Arial" w:hAnsi="Arial"/>
           <w:b/>
+          <w:color w:val="000000"/>
+          <w:sz w:val="24"/>
         </w:rPr>
         <w:t>e) Estruturar a Persistência e o Painel Admin:</w:t>
       </w:r>
       <w:r>
+        <w:rPr>
+          <w:rFonts w:ascii="Arial" w:hAnsi="Arial"/>
+          <w:color w:val="000000"/>
+          <w:sz w:val="24"/>
+        </w:rPr>
         <w:t xml:space="preserve"> Integrar o banco de dados PostgreSQL via Supabase BaaS para gerenciar clientes, status de agendamentos (Pendente, Confirmado, Concluído, Cancelado) e logs do sistema, exibidos em tempo real no dashboard </w:t>
       </w:r>
       <w:r>
         <w:rPr>
-          <w:rFonts w:ascii="Consolas" w:hAnsi="Consolas"/>
-          <w:color w:val="2D5A45"/>
-          <w:sz w:val="19"/>
+          <w:rFonts w:ascii="Courier New" w:hAnsi="Courier New"/>
+          <w:color w:val="1E1E1E"/>
+          <w:sz w:val="22"/>
         </w:rPr>
         <w:t>/admin</w:t>
       </w:r>
       <w:r>
+        <w:rPr>
+          <w:rFonts w:ascii="Arial" w:hAnsi="Arial"/>
+          <w:color w:val="000000"/>
+          <w:sz w:val="24"/>
+        </w:rPr>
         <w:t>.</w:t>
       </w:r>
     </w:p>
     <w:p>
       <w:pPr>
-        <w:pStyle w:val="ListBullet"/>
+        <w:spacing w:line="360" w:lineRule="auto" w:after="120"/>
+        <w:ind w:left="709"/>
+        <w:jc w:val="both"/>
       </w:pPr>
       <w:r>
         <w:rPr>
+          <w:rFonts w:ascii="Arial" w:hAnsi="Arial"/>
           <w:b/>
+          <w:color w:val="000000"/>
+          <w:sz w:val="24"/>
         </w:rPr>
         <w:t>f) Validar o Sistema por Suíte de Testes:</w:t>
       </w:r>
       <w:r>
+        <w:rPr>
+          <w:rFonts w:ascii="Arial" w:hAnsi="Arial"/>
+          <w:color w:val="000000"/>
+          <w:sz w:val="24"/>
+        </w:rPr>
         <w:t xml:space="preserve"> Submeter a solução a testes unitários e de integração automatizados (</w:t>
       </w:r>
       <w:r>
         <w:rPr>
-          <w:rFonts w:ascii="Consolas" w:hAnsi="Consolas"/>
-          <w:color w:val="2D5A45"/>
-          <w:sz w:val="19"/>
+          <w:rFonts w:ascii="Courier New" w:hAnsi="Courier New"/>
+          <w:color w:val="1E1E1E"/>
+          <w:sz w:val="22"/>
         </w:rPr>
         <w:t>tests/safety.test.js</w:t>
       </w:r>
       <w:r>
+        <w:rPr>
+          <w:rFonts w:ascii="Arial" w:hAnsi="Arial"/>
+          <w:color w:val="000000"/>
+          <w:sz w:val="24"/>
+        </w:rPr>
         <w:t xml:space="preserve"> com aprovação 7/7), garantindo a estabilidade e a conformidade funcional do sistema.</w:t>
       </w:r>
     </w:p>
     <w:p>
       <w:pPr>
-        <w:pStyle w:val="Heading2"/>
+        <w:spacing w:line="360" w:lineRule="auto" w:before="280" w:after="160"/>
+        <w:jc w:val="left"/>
       </w:pPr>
       <w:r>
         <w:rPr>
           <w:rFonts w:ascii="Arial" w:hAnsi="Arial"/>
           <w:b/>
-          <w:color w:val="38664F"/>
+          <w:color w:val="000000"/>
           <w:sz w:val="24"/>
         </w:rPr>
         <w:t>2.5 Metodologia e Solução Proposta (Inovação Tecnológica)</w:t>
@@ -653,606 +1089,993 @@
     </w:p>
     <w:p>
       <w:pPr>
-        <w:spacing w:line="276" w:lineRule="auto" w:after="120"/>
+        <w:spacing w:line="360" w:lineRule="auto" w:after="120"/>
+        <w:ind w:firstLine="709"/>
+        <w:jc w:val="both"/>
       </w:pPr>
       <w:r>
+        <w:rPr>
+          <w:rFonts w:ascii="Arial" w:hAnsi="Arial"/>
+          <w:color w:val="000000"/>
+          <w:sz w:val="24"/>
+        </w:rPr>
         <w:t xml:space="preserve">A metodologia adotada seguiu a abordagem da </w:t>
       </w:r>
       <w:r>
         <w:rPr>
+          <w:rFonts w:ascii="Arial" w:hAnsi="Arial"/>
           <w:b/>
+          <w:color w:val="000000"/>
+          <w:sz w:val="24"/>
         </w:rPr>
         <w:t>Engenharia de Software Orientada a Requisitos e Prototipagem Ágil</w:t>
       </w:r>
       <w:r>
+        <w:rPr>
+          <w:rFonts w:ascii="Arial" w:hAnsi="Arial"/>
+          <w:color w:val="000000"/>
+          <w:sz w:val="24"/>
+        </w:rPr>
         <w:t>, dividida em 3 camadas de arquitetura:</w:t>
       </w:r>
     </w:p>
     <w:p>
       <w:pPr>
-        <w:ind w:left="720"/>
+        <w:spacing w:line="240" w:lineRule="auto" w:after="40"/>
+        <w:ind w:left="709"/>
+        <w:jc w:val="left"/>
       </w:pPr>
       <w:r>
         <w:rPr>
-          <w:rFonts w:ascii="Consolas" w:hAnsi="Consolas"/>
-          <w:color w:val="3C3C3C"/>
-          <w:sz w:val="18"/>
+          <w:rFonts w:ascii="Courier New" w:hAnsi="Courier New"/>
+          <w:color w:val="323232"/>
+          <w:sz w:val="20"/>
         </w:rPr>
         <w:t>graph TD</w:t>
       </w:r>
     </w:p>
     <w:p>
       <w:pPr>
-        <w:ind w:left="720"/>
+        <w:spacing w:line="240" w:lineRule="auto" w:after="40"/>
+        <w:ind w:left="709"/>
+        <w:jc w:val="left"/>
       </w:pPr>
       <w:r>
         <w:rPr>
-          <w:rFonts w:ascii="Consolas" w:hAnsi="Consolas"/>
-          <w:color w:val="3C3C3C"/>
-          <w:sz w:val="18"/>
+          <w:rFonts w:ascii="Courier New" w:hAnsi="Courier New"/>
+          <w:color w:val="323232"/>
+          <w:sz w:val="20"/>
         </w:rPr>
         <w:t xml:space="preserve">    A["Paciente / Cliente"] --&gt;|Acessa Web| B["Landing Page (HTML/CSS/JS)"]</w:t>
       </w:r>
     </w:p>
     <w:p>
       <w:pPr>
-        <w:ind w:left="720"/>
+        <w:spacing w:line="240" w:lineRule="auto" w:after="40"/>
+        <w:ind w:left="709"/>
+        <w:jc w:val="left"/>
       </w:pPr>
       <w:r>
         <w:rPr>
-          <w:rFonts w:ascii="Consolas" w:hAnsi="Consolas"/>
-          <w:color w:val="3C3C3C"/>
-          <w:sz w:val="18"/>
+          <w:rFonts w:ascii="Courier New" w:hAnsi="Courier New"/>
+          <w:color w:val="323232"/>
+          <w:sz w:val="20"/>
         </w:rPr>
         <w:t xml:space="preserve">    A --&gt;|Envia Mensagem| C["WhatsApp Bot (whatsapp-web.js)"]</w:t>
       </w:r>
     </w:p>
     <w:p>
       <w:pPr>
-        <w:ind w:left="720"/>
+        <w:spacing w:line="240" w:lineRule="auto" w:after="40"/>
+        <w:ind w:left="709"/>
+        <w:jc w:val="left"/>
       </w:pPr>
       <w:r>
         <w:rPr>
-          <w:rFonts w:ascii="Consolas" w:hAnsi="Consolas"/>
-          <w:color w:val="3C3C3C"/>
-          <w:sz w:val="18"/>
+          <w:rFonts w:ascii="Courier New" w:hAnsi="Courier New"/>
+          <w:color w:val="323232"/>
+          <w:sz w:val="20"/>
         </w:rPr>
         <w:t xml:space="preserve">    B --&gt;|Pagamento PIX / Consulta| C</w:t>
       </w:r>
     </w:p>
     <w:p>
       <w:pPr>
-        <w:ind w:left="720"/>
+        <w:spacing w:line="240" w:lineRule="auto" w:after="40"/>
+        <w:ind w:left="709"/>
+        <w:jc w:val="left"/>
       </w:pPr>
       <w:r>
         <w:rPr>
-          <w:rFonts w:ascii="Consolas" w:hAnsi="Consolas"/>
-          <w:color w:val="3C3C3C"/>
-          <w:sz w:val="18"/>
+          <w:rFonts w:ascii="Courier New" w:hAnsi="Courier New"/>
+          <w:color w:val="323232"/>
+          <w:sz w:val="20"/>
         </w:rPr>
         <w:t xml:space="preserve">    C --&gt;|Valida CPF &amp; Agendamento| D["Backend Express (Node.js)"]</w:t>
       </w:r>
     </w:p>
     <w:p>
       <w:pPr>
-        <w:ind w:left="720"/>
+        <w:spacing w:line="240" w:lineRule="auto" w:after="40"/>
+        <w:ind w:left="709"/>
+        <w:jc w:val="left"/>
       </w:pPr>
       <w:r>
         <w:rPr>
-          <w:rFonts w:ascii="Consolas" w:hAnsi="Consolas"/>
-          <w:color w:val="3C3C3C"/>
-          <w:sz w:val="18"/>
+          <w:rFonts w:ascii="Courier New" w:hAnsi="Courier New"/>
+          <w:color w:val="323232"/>
+          <w:sz w:val="20"/>
         </w:rPr>
         <w:t xml:space="preserve">    D --&gt;|Persistência Relacional| E[(Supabase - PostgreSQL)]</w:t>
       </w:r>
     </w:p>
     <w:p>
       <w:pPr>
-        <w:ind w:left="720"/>
+        <w:spacing w:line="240" w:lineRule="auto" w:after="40"/>
+        <w:ind w:left="709"/>
+        <w:jc w:val="left"/>
       </w:pPr>
       <w:r>
         <w:rPr>
-          <w:rFonts w:ascii="Consolas" w:hAnsi="Consolas"/>
-          <w:color w:val="3C3C3C"/>
-          <w:sz w:val="18"/>
+          <w:rFonts w:ascii="Courier New" w:hAnsi="Courier New"/>
+          <w:color w:val="323232"/>
+          <w:sz w:val="20"/>
         </w:rPr>
         <w:t xml:space="preserve">    D --&gt;|Triagem de Crise| F["Alerta Emergencial / CVV 188"]</w:t>
       </w:r>
     </w:p>
     <w:p>
       <w:pPr>
-        <w:ind w:left="720"/>
+        <w:spacing w:line="240" w:lineRule="auto" w:after="40"/>
+        <w:ind w:left="709"/>
+        <w:jc w:val="left"/>
       </w:pPr>
       <w:r>
         <w:rPr>
-          <w:rFonts w:ascii="Consolas" w:hAnsi="Consolas"/>
-          <w:color w:val="3C3C3C"/>
-          <w:sz w:val="18"/>
+          <w:rFonts w:ascii="Courier New" w:hAnsi="Courier New"/>
+          <w:color w:val="323232"/>
+          <w:sz w:val="20"/>
         </w:rPr>
         <w:t xml:space="preserve">    G["Administrador / Profissional"] --&gt;|Gerencia Agendas| H["Painel Admin (/admin)"]</w:t>
       </w:r>
     </w:p>
     <w:p>
       <w:pPr>
-        <w:ind w:left="720"/>
+        <w:spacing w:line="240" w:lineRule="auto" w:after="40"/>
+        <w:ind w:left="709"/>
+        <w:jc w:val="left"/>
       </w:pPr>
       <w:r>
         <w:rPr>
-          <w:rFonts w:ascii="Consolas" w:hAnsi="Consolas"/>
-          <w:color w:val="3C3C3C"/>
-          <w:sz w:val="18"/>
+          <w:rFonts w:ascii="Courier New" w:hAnsi="Courier New"/>
+          <w:color w:val="323232"/>
+          <w:sz w:val="20"/>
         </w:rPr>
         <w:t xml:space="preserve">    H --&gt;|SSE Logs &amp; Gestão CPF| D</w:t>
       </w:r>
     </w:p>
     <w:p>
       <w:pPr>
-        <w:pStyle w:val="ListNumber"/>
+        <w:spacing w:line="360" w:lineRule="auto" w:after="120"/>
+        <w:ind w:left="709"/>
+        <w:jc w:val="both"/>
       </w:pPr>
       <w:r>
         <w:rPr>
+          <w:rFonts w:ascii="Arial" w:hAnsi="Arial"/>
           <w:b/>
+          <w:color w:val="000000"/>
+          <w:sz w:val="24"/>
+        </w:rPr>
+        <w:t xml:space="preserve">1. </w:t>
+      </w:r>
+      <w:r>
+        <w:rPr>
+          <w:rFonts w:ascii="Arial" w:hAnsi="Arial"/>
+          <w:b/>
+          <w:color w:val="000000"/>
+          <w:sz w:val="24"/>
         </w:rPr>
         <w:t>Camada de Apresentação (Frontend):</w:t>
       </w:r>
     </w:p>
     <w:p>
       <w:pPr>
-        <w:pStyle w:val="ListBullet"/>
+        <w:spacing w:line="360" w:lineRule="auto" w:after="120"/>
+        <w:ind w:left="709"/>
+        <w:jc w:val="both"/>
       </w:pPr>
       <w:r>
+        <w:rPr>
+          <w:rFonts w:ascii="Arial" w:hAnsi="Arial"/>
+          <w:color w:val="000000"/>
+          <w:sz w:val="24"/>
+        </w:rPr>
         <w:t>Construída sem frameworks para garantir leveza e máxima performance.</w:t>
       </w:r>
     </w:p>
     <w:p>
       <w:pPr>
-        <w:pStyle w:val="ListBullet"/>
+        <w:spacing w:line="360" w:lineRule="auto" w:after="120"/>
+        <w:ind w:left="709"/>
+        <w:jc w:val="both"/>
       </w:pPr>
       <w:r>
+        <w:rPr>
+          <w:rFonts w:ascii="Arial" w:hAnsi="Arial"/>
+          <w:color w:val="000000"/>
+          <w:sz w:val="24"/>
+        </w:rPr>
         <w:t xml:space="preserve">Aplicação de </w:t>
       </w:r>
       <w:r>
         <w:rPr>
+          <w:rFonts w:ascii="Arial" w:hAnsi="Arial"/>
           <w:b/>
+          <w:color w:val="000000"/>
+          <w:sz w:val="24"/>
         </w:rPr>
         <w:t>Glassmorphism</w:t>
       </w:r>
       <w:r>
+        <w:rPr>
+          <w:rFonts w:ascii="Arial" w:hAnsi="Arial"/>
+          <w:color w:val="000000"/>
+          <w:sz w:val="24"/>
+        </w:rPr>
         <w:t xml:space="preserve"> e paleta de cores terapêutica (tons de azul e verde acolhedores).</w:t>
       </w:r>
     </w:p>
     <w:p>
       <w:pPr>
-        <w:pStyle w:val="ListBullet"/>
+        <w:spacing w:line="360" w:lineRule="auto" w:after="120"/>
+        <w:ind w:left="709"/>
+        <w:jc w:val="both"/>
       </w:pPr>
       <w:r>
+        <w:rPr>
+          <w:rFonts w:ascii="Arial" w:hAnsi="Arial"/>
+          <w:color w:val="000000"/>
+          <w:sz w:val="24"/>
+        </w:rPr>
         <w:t>Componentes visuais para seleção de planos, modais dinâmicos para pagamento PIX via QR Code e navegação responsiva.</w:t>
       </w:r>
     </w:p>
     <w:p>
       <w:pPr>
-        <w:pStyle w:val="ListNumber"/>
+        <w:spacing w:line="360" w:lineRule="auto" w:after="120"/>
+        <w:ind w:left="709"/>
+        <w:jc w:val="both"/>
       </w:pPr>
       <w:r>
         <w:rPr>
+          <w:rFonts w:ascii="Arial" w:hAnsi="Arial"/>
           <w:b/>
+          <w:color w:val="000000"/>
+          <w:sz w:val="24"/>
+        </w:rPr>
+        <w:t xml:space="preserve">2. </w:t>
+      </w:r>
+      <w:r>
+        <w:rPr>
+          <w:rFonts w:ascii="Arial" w:hAnsi="Arial"/>
+          <w:b/>
+          <w:color w:val="000000"/>
+          <w:sz w:val="24"/>
         </w:rPr>
         <w:t>Camada de Lógica de Negócio e Automação (Backend):</w:t>
       </w:r>
     </w:p>
     <w:p>
       <w:pPr>
-        <w:pStyle w:val="ListBullet"/>
+        <w:spacing w:line="360" w:lineRule="auto" w:after="120"/>
+        <w:ind w:left="709"/>
+        <w:jc w:val="both"/>
       </w:pPr>
       <w:r>
+        <w:rPr>
+          <w:rFonts w:ascii="Arial" w:hAnsi="Arial"/>
+          <w:color w:val="000000"/>
+          <w:sz w:val="24"/>
+        </w:rPr>
         <w:t>Servidor Node.js com Express (</w:t>
       </w:r>
       <w:r>
         <w:rPr>
-          <w:rFonts w:ascii="Consolas" w:hAnsi="Consolas"/>
-          <w:color w:val="2D5A45"/>
-          <w:sz w:val="19"/>
+          <w:rFonts w:ascii="Courier New" w:hAnsi="Courier New"/>
+          <w:color w:val="1E1E1E"/>
+          <w:sz w:val="22"/>
         </w:rPr>
         <w:t>chatbot.js</w:t>
       </w:r>
       <w:r>
+        <w:rPr>
+          <w:rFonts w:ascii="Arial" w:hAnsi="Arial"/>
+          <w:color w:val="000000"/>
+          <w:sz w:val="24"/>
+        </w:rPr>
         <w:t xml:space="preserve">), integrando o motor </w:t>
       </w:r>
       <w:r>
         <w:rPr>
-          <w:rFonts w:ascii="Consolas" w:hAnsi="Consolas"/>
-          <w:color w:val="2D5A45"/>
-          <w:sz w:val="19"/>
+          <w:rFonts w:ascii="Courier New" w:hAnsi="Courier New"/>
+          <w:color w:val="1E1E1E"/>
+          <w:sz w:val="22"/>
         </w:rPr>
         <w:t>whatsapp-web.js</w:t>
       </w:r>
       <w:r>
+        <w:rPr>
+          <w:rFonts w:ascii="Arial" w:hAnsi="Arial"/>
+          <w:color w:val="000000"/>
+          <w:sz w:val="24"/>
+        </w:rPr>
         <w:t>.</w:t>
       </w:r>
     </w:p>
     <w:p>
       <w:pPr>
-        <w:pStyle w:val="ListBullet"/>
+        <w:spacing w:line="360" w:lineRule="auto" w:after="120"/>
+        <w:ind w:left="709"/>
+        <w:jc w:val="both"/>
       </w:pPr>
       <w:r>
+        <w:rPr>
+          <w:rFonts w:ascii="Arial" w:hAnsi="Arial"/>
+          <w:color w:val="000000"/>
+          <w:sz w:val="24"/>
+        </w:rPr>
         <w:t>Normalização e validação estrita de CPF para identificação unificada do cliente.</w:t>
       </w:r>
     </w:p>
     <w:p>
       <w:pPr>
-        <w:pStyle w:val="ListBullet"/>
+        <w:spacing w:line="360" w:lineRule="auto" w:after="120"/>
+        <w:ind w:left="709"/>
+        <w:jc w:val="both"/>
       </w:pPr>
       <w:r>
+        <w:rPr>
+          <w:rFonts w:ascii="Arial" w:hAnsi="Arial"/>
+          <w:color w:val="000000"/>
+          <w:sz w:val="24"/>
+        </w:rPr>
         <w:t>Fluxo interativo de menu via WhatsApp: Boas-vindas $\rightarrow$ Triagem $\rightarrow$ Verificação de CPF $\rightarrow$ Agendamento/Reagendamento de Consultas.</w:t>
       </w:r>
     </w:p>
     <w:p>
       <w:pPr>
-        <w:pStyle w:val="ListNumber"/>
+        <w:spacing w:line="360" w:lineRule="auto" w:after="120"/>
+        <w:ind w:left="709"/>
+        <w:jc w:val="both"/>
       </w:pPr>
       <w:r>
         <w:rPr>
+          <w:rFonts w:ascii="Arial" w:hAnsi="Arial"/>
           <w:b/>
+          <w:color w:val="000000"/>
+          <w:sz w:val="24"/>
+        </w:rPr>
+        <w:t xml:space="preserve">3. </w:t>
+      </w:r>
+      <w:r>
+        <w:rPr>
+          <w:rFonts w:ascii="Arial" w:hAnsi="Arial"/>
+          <w:b/>
+          <w:color w:val="000000"/>
+          <w:sz w:val="24"/>
         </w:rPr>
         <w:t>Camada de Dados e Gestão (BaaS &amp; Admin):</w:t>
       </w:r>
     </w:p>
     <w:p>
       <w:pPr>
-        <w:pStyle w:val="ListBullet"/>
+        <w:spacing w:line="360" w:lineRule="auto" w:after="120"/>
+        <w:ind w:left="709"/>
+        <w:jc w:val="both"/>
       </w:pPr>
       <w:r>
+        <w:rPr>
+          <w:rFonts w:ascii="Arial" w:hAnsi="Arial"/>
+          <w:color w:val="000000"/>
+          <w:sz w:val="24"/>
+        </w:rPr>
         <w:t>Banco de dados relacional Supabase (PostgreSQL) com migrações estruturadas para suporte a agendamentos, dados de clientes e configurações do sistema.</w:t>
       </w:r>
     </w:p>
     <w:p>
       <w:pPr>
-        <w:pStyle w:val="ListBullet"/>
+        <w:spacing w:line="360" w:lineRule="auto" w:after="120"/>
+        <w:ind w:left="709"/>
+        <w:jc w:val="both"/>
       </w:pPr>
       <w:r>
+        <w:rPr>
+          <w:rFonts w:ascii="Arial" w:hAnsi="Arial"/>
+          <w:color w:val="000000"/>
+          <w:sz w:val="24"/>
+        </w:rPr>
         <w:t xml:space="preserve">Painel </w:t>
       </w:r>
       <w:r>
         <w:rPr>
-          <w:rFonts w:ascii="Consolas" w:hAnsi="Consolas"/>
-          <w:color w:val="2D5A45"/>
-          <w:sz w:val="19"/>
+          <w:rFonts w:ascii="Courier New" w:hAnsi="Courier New"/>
+          <w:color w:val="1E1E1E"/>
+          <w:sz w:val="22"/>
         </w:rPr>
         <w:t>/admin</w:t>
       </w:r>
       <w:r>
+        <w:rPr>
+          <w:rFonts w:ascii="Arial" w:hAnsi="Arial"/>
+          <w:color w:val="000000"/>
+          <w:sz w:val="24"/>
+        </w:rPr>
         <w:t xml:space="preserve"> com streaming de eventos SSE (Server-Sent Events) para acompanhamento de logs em tempo real, busca de clientes por CPF, controle de bloqueios e reagendamento manual.</w:t>
       </w:r>
     </w:p>
     <w:p>
       <w:pPr>
-        <w:pStyle w:val="Heading3"/>
+        <w:spacing w:line="360" w:lineRule="auto" w:before="240" w:after="120"/>
+        <w:jc w:val="left"/>
       </w:pPr>
       <w:r>
         <w:rPr>
           <w:rFonts w:ascii="Arial" w:hAnsi="Arial"/>
           <w:b/>
-          <w:color w:val="3C3C3C"/>
-          <w:sz w:val="22"/>
+          <w:color w:val="000000"/>
+          <w:sz w:val="24"/>
         </w:rPr>
         <w:t>Inovação do Projeto</w:t>
       </w:r>
     </w:p>
     <w:p>
       <w:pPr>
-        <w:spacing w:line="276" w:lineRule="auto" w:after="120"/>
+        <w:spacing w:line="360" w:lineRule="auto" w:after="120"/>
+        <w:ind w:firstLine="709"/>
+        <w:jc w:val="both"/>
       </w:pPr>
       <w:r>
+        <w:rPr>
+          <w:rFonts w:ascii="Arial" w:hAnsi="Arial"/>
+          <w:color w:val="000000"/>
+          <w:sz w:val="24"/>
+        </w:rPr>
         <w:t xml:space="preserve">A inovação do </w:t>
       </w:r>
       <w:r>
         <w:rPr>
+          <w:rFonts w:ascii="Arial" w:hAnsi="Arial"/>
           <w:b/>
+          <w:color w:val="000000"/>
+          <w:sz w:val="24"/>
         </w:rPr>
         <w:t>Sentir Bem</w:t>
       </w:r>
       <w:r>
+        <w:rPr>
+          <w:rFonts w:ascii="Arial" w:hAnsi="Arial"/>
+          <w:color w:val="000000"/>
+          <w:sz w:val="24"/>
+        </w:rPr>
         <w:t xml:space="preserve"> reside no uso de tecnologia acessível para resolver um problema humano delicado. Ao mesclar </w:t>
       </w:r>
       <w:r>
         <w:rPr>
+          <w:rFonts w:ascii="Arial" w:hAnsi="Arial"/>
           <w:b/>
+          <w:color w:val="000000"/>
+          <w:sz w:val="24"/>
         </w:rPr>
         <w:t>automação conversacional sem atrito (WhatsApp)</w:t>
       </w:r>
       <w:r>
+        <w:rPr>
+          <w:rFonts w:ascii="Arial" w:hAnsi="Arial"/>
+          <w:color w:val="000000"/>
+          <w:sz w:val="24"/>
+        </w:rPr>
         <w:t xml:space="preserve"> com </w:t>
       </w:r>
       <w:r>
         <w:rPr>
+          <w:rFonts w:ascii="Arial" w:hAnsi="Arial"/>
           <w:b/>
+          <w:color w:val="000000"/>
+          <w:sz w:val="24"/>
         </w:rPr>
         <w:t>triagem ética de crise (CVV 188)</w:t>
       </w:r>
       <w:r>
+        <w:rPr>
+          <w:rFonts w:ascii="Arial" w:hAnsi="Arial"/>
+          <w:color w:val="000000"/>
+          <w:sz w:val="24"/>
+        </w:rPr>
         <w:t xml:space="preserve"> e </w:t>
       </w:r>
       <w:r>
         <w:rPr>
+          <w:rFonts w:ascii="Arial" w:hAnsi="Arial"/>
           <w:b/>
+          <w:color w:val="000000"/>
+          <w:sz w:val="24"/>
         </w:rPr>
         <w:t>pagamento desburocratizado (PIX)</w:t>
       </w:r>
       <w:r>
+        <w:rPr>
+          <w:rFonts w:ascii="Arial" w:hAnsi="Arial"/>
+          <w:color w:val="000000"/>
+          <w:sz w:val="24"/>
+        </w:rPr>
         <w:t>, o projeto elimina etapas manuais exaustivas e aproxima o paciente do cuidado profissional com agilidade e dignidade.</w:t>
       </w:r>
     </w:p>
     <w:p>
       <w:pPr>
-        <w:pStyle w:val="Heading1"/>
+        <w:spacing w:line="360" w:lineRule="auto" w:before="360" w:after="240"/>
+        <w:jc w:val="left"/>
       </w:pPr>
       <w:r>
         <w:rPr>
           <w:rFonts w:ascii="Arial" w:hAnsi="Arial"/>
           <w:b/>
-          <w:color w:val="2D5A45"/>
-          <w:sz w:val="28"/>
+          <w:color w:val="000000"/>
+          <w:sz w:val="24"/>
         </w:rPr>
         <w:t>3. CONSIDERAÇÕES FINAIS</w:t>
       </w:r>
     </w:p>
     <w:p>
       <w:pPr>
-        <w:spacing w:line="276" w:lineRule="auto" w:after="120"/>
+        <w:spacing w:line="360" w:lineRule="auto" w:after="120"/>
+        <w:ind w:firstLine="709"/>
+        <w:jc w:val="both"/>
       </w:pPr>
       <w:r>
+        <w:rPr>
+          <w:rFonts w:ascii="Arial" w:hAnsi="Arial"/>
+          <w:color w:val="000000"/>
+          <w:sz w:val="24"/>
+        </w:rPr>
         <w:t xml:space="preserve">O desenvolvimento da solução </w:t>
       </w:r>
       <w:r>
         <w:rPr>
+          <w:rFonts w:ascii="Arial" w:hAnsi="Arial"/>
           <w:b/>
+          <w:color w:val="000000"/>
+          <w:sz w:val="24"/>
         </w:rPr>
         <w:t>Sentir Bem</w:t>
       </w:r>
       <w:r>
+        <w:rPr>
+          <w:rFonts w:ascii="Arial" w:hAnsi="Arial"/>
+          <w:color w:val="000000"/>
+          <w:sz w:val="24"/>
+        </w:rPr>
         <w:t xml:space="preserve"> permitiu constatar o enorme potencial da tecnologia quando aplicada de forma humanizada e estratégica à área da saúde mental. A criação do sistema integrado de atendimento e agendamento demonstrou ser possível resolver problemas históricos de lentidão, desorganização e perda de informações em clínicas psicológicas.</w:t>
       </w:r>
     </w:p>
     <w:p>
       <w:pPr>
-        <w:spacing w:line="276" w:lineRule="auto" w:after="120"/>
+        <w:spacing w:line="360" w:lineRule="auto" w:after="120"/>
+        <w:ind w:firstLine="709"/>
+        <w:jc w:val="both"/>
       </w:pPr>
       <w:r>
+        <w:rPr>
+          <w:rFonts w:ascii="Arial" w:hAnsi="Arial"/>
+          <w:color w:val="000000"/>
+          <w:sz w:val="24"/>
+        </w:rPr>
         <w:t>Por meio da combinação da Landing Page institucional com o assistente virtual no WhatsApp e o painel administrativo em tempo real, o projeto alcançou um fluxo contínuo de atendimento 24 horas por dia. O paciente ganha autonomia para consultar horários, efetuar pagamentos PIX e reagendar atendimentos, enquanto a equipe gestora obtém visibilidade total e organizada de todos os processos.</w:t>
       </w:r>
     </w:p>
     <w:p>
       <w:pPr>
-        <w:spacing w:line="276" w:lineRule="auto" w:after="120"/>
+        <w:spacing w:line="360" w:lineRule="auto" w:after="120"/>
+        <w:ind w:firstLine="709"/>
+        <w:jc w:val="both"/>
       </w:pPr>
       <w:r>
+        <w:rPr>
+          <w:rFonts w:ascii="Arial" w:hAnsi="Arial"/>
+          <w:color w:val="000000"/>
+          <w:sz w:val="24"/>
+        </w:rPr>
         <w:t>Além disso, a implementação de travas de segurança e triagem para situações de crise reforça o compromisso ético e social do software. O projeto cumpre com excelência seus objetivos acadêmicos e práticos, servindo como modelo replicável de inovação em serviços de telessaúde e acolhimento emocional.</w:t>
       </w:r>
     </w:p>
     <w:p>
       <w:pPr>
-        <w:pStyle w:val="Heading1"/>
+        <w:spacing w:line="360" w:lineRule="auto" w:before="360" w:after="240"/>
+        <w:jc w:val="left"/>
       </w:pPr>
       <w:r>
         <w:rPr>
           <w:rFonts w:ascii="Arial" w:hAnsi="Arial"/>
           <w:b/>
-          <w:color w:val="2D5A45"/>
-          <w:sz w:val="28"/>
+          <w:color w:val="000000"/>
+          <w:sz w:val="24"/>
         </w:rPr>
         <w:t>4. REFERÊNCIAS BIBLIOGRÁFICAS</w:t>
       </w:r>
     </w:p>
     <w:p>
       <w:pPr>
-        <w:pStyle w:val="ListBullet"/>
+        <w:spacing w:line="240" w:lineRule="auto" w:after="240"/>
+        <w:ind w:left="0"/>
+        <w:jc w:val="left"/>
       </w:pPr>
       <w:r>
         <w:rPr>
+          <w:rFonts w:ascii="Arial" w:hAnsi="Arial"/>
           <w:b/>
+          <w:color w:val="000000"/>
+          <w:sz w:val="24"/>
         </w:rPr>
         <w:t>ABRAMOVICH, F.</w:t>
       </w:r>
       <w:r>
+        <w:rPr>
+          <w:rFonts w:ascii="Arial" w:hAnsi="Arial"/>
+          <w:color w:val="000000"/>
+          <w:sz w:val="24"/>
+        </w:rPr>
         <w:t xml:space="preserve"> </w:t>
       </w:r>
       <w:r>
         <w:rPr>
+          <w:rFonts w:ascii="Arial" w:hAnsi="Arial"/>
           <w:i/>
+          <w:color w:val="000000"/>
+          <w:sz w:val="24"/>
         </w:rPr>
         <w:t>Literatura infantil: gostosuras e bobices</w:t>
       </w:r>
       <w:r>
+        <w:rPr>
+          <w:rFonts w:ascii="Arial" w:hAnsi="Arial"/>
+          <w:color w:val="000000"/>
+          <w:sz w:val="24"/>
+        </w:rPr>
         <w:t>. São Paulo: Scipione, 1997.</w:t>
       </w:r>
     </w:p>
     <w:p>
       <w:pPr>
-        <w:pStyle w:val="ListBullet"/>
+        <w:spacing w:line="240" w:lineRule="auto" w:after="240"/>
+        <w:ind w:left="0"/>
+        <w:jc w:val="left"/>
       </w:pPr>
       <w:r>
         <w:rPr>
+          <w:rFonts w:ascii="Arial" w:hAnsi="Arial"/>
           <w:b/>
+          <w:color w:val="000000"/>
+          <w:sz w:val="24"/>
         </w:rPr>
         <w:t>BRASIL.</w:t>
       </w:r>
       <w:r>
+        <w:rPr>
+          <w:rFonts w:ascii="Arial" w:hAnsi="Arial"/>
+          <w:color w:val="000000"/>
+          <w:sz w:val="24"/>
+        </w:rPr>
         <w:t xml:space="preserve"> Lei nº 13.709, de 14 de agosto de 2018. </w:t>
       </w:r>
       <w:r>
         <w:rPr>
+          <w:rFonts w:ascii="Arial" w:hAnsi="Arial"/>
           <w:i/>
+          <w:color w:val="000000"/>
+          <w:sz w:val="24"/>
         </w:rPr>
         <w:t>Lei Geral de Proteção de Dados Pessoais (LGPD)</w:t>
       </w:r>
       <w:r>
+        <w:rPr>
+          <w:rFonts w:ascii="Arial" w:hAnsi="Arial"/>
+          <w:color w:val="000000"/>
+          <w:sz w:val="24"/>
+        </w:rPr>
         <w:t>. Brasília, DF: Presidência da República, 2018.</w:t>
       </w:r>
     </w:p>
     <w:p>
       <w:pPr>
-        <w:pStyle w:val="ListBullet"/>
+        <w:spacing w:line="240" w:lineRule="auto" w:after="240"/>
+        <w:ind w:left="0"/>
+        <w:jc w:val="left"/>
       </w:pPr>
       <w:r>
         <w:rPr>
+          <w:rFonts w:ascii="Arial" w:hAnsi="Arial"/>
           <w:b/>
+          <w:color w:val="000000"/>
+          <w:sz w:val="24"/>
         </w:rPr>
         <w:t>CENTRO DE VALORIZAÇÃO DA VIDA (CVV).</w:t>
       </w:r>
       <w:r>
+        <w:rPr>
+          <w:rFonts w:ascii="Arial" w:hAnsi="Arial"/>
+          <w:color w:val="000000"/>
+          <w:sz w:val="24"/>
+        </w:rPr>
         <w:t xml:space="preserve"> </w:t>
       </w:r>
       <w:r>
         <w:rPr>
+          <w:rFonts w:ascii="Arial" w:hAnsi="Arial"/>
           <w:i/>
+          <w:color w:val="000000"/>
+          <w:sz w:val="24"/>
         </w:rPr>
         <w:t>Atendimento emocional e prevenção do suicídio</w:t>
       </w:r>
       <w:r>
+        <w:rPr>
+          <w:rFonts w:ascii="Arial" w:hAnsi="Arial"/>
+          <w:color w:val="000000"/>
+          <w:sz w:val="24"/>
+        </w:rPr>
         <w:t>. Disponível em: &lt;https://www.cvv.org.br/&gt;. Acesso em: 2026.</w:t>
       </w:r>
     </w:p>
     <w:p>
       <w:pPr>
-        <w:pStyle w:val="ListBullet"/>
+        <w:spacing w:line="240" w:lineRule="auto" w:after="240"/>
+        <w:ind w:left="0"/>
+        <w:jc w:val="left"/>
       </w:pPr>
       <w:r>
         <w:rPr>
+          <w:rFonts w:ascii="Arial" w:hAnsi="Arial"/>
           <w:b/>
+          <w:color w:val="000000"/>
+          <w:sz w:val="24"/>
         </w:rPr>
         <w:t>CONSELHO FEDERAL DE PSICOLOGIA (CFP).</w:t>
       </w:r>
       <w:r>
+        <w:rPr>
+          <w:rFonts w:ascii="Arial" w:hAnsi="Arial"/>
+          <w:color w:val="000000"/>
+          <w:sz w:val="24"/>
+        </w:rPr>
         <w:t xml:space="preserve"> Resolução CFP nº 11/2018. </w:t>
       </w:r>
       <w:r>
         <w:rPr>
+          <w:rFonts w:ascii="Arial" w:hAnsi="Arial"/>
           <w:i/>
+          <w:color w:val="000000"/>
+          <w:sz w:val="24"/>
         </w:rPr>
         <w:t>Regulamenta a prestação de serviços psicológicos realizados por meios de tecnologia da informação e da comunicação</w:t>
       </w:r>
       <w:r>
+        <w:rPr>
+          <w:rFonts w:ascii="Arial" w:hAnsi="Arial"/>
+          <w:color w:val="000000"/>
+          <w:sz w:val="24"/>
+        </w:rPr>
         <w:t>. Brasília: CFP, 2018.</w:t>
       </w:r>
     </w:p>
     <w:p>
       <w:pPr>
-        <w:pStyle w:val="ListBullet"/>
+        <w:spacing w:line="240" w:lineRule="auto" w:after="240"/>
+        <w:ind w:left="0"/>
+        <w:jc w:val="left"/>
       </w:pPr>
       <w:r>
         <w:rPr>
+          <w:rFonts w:ascii="Arial" w:hAnsi="Arial"/>
           <w:b/>
+          <w:color w:val="000000"/>
+          <w:sz w:val="24"/>
         </w:rPr>
         <w:t>EXPRESS. JS FOUNDATION.</w:t>
       </w:r>
       <w:r>
+        <w:rPr>
+          <w:rFonts w:ascii="Arial" w:hAnsi="Arial"/>
+          <w:color w:val="000000"/>
+          <w:sz w:val="24"/>
+        </w:rPr>
         <w:t xml:space="preserve"> </w:t>
       </w:r>
       <w:r>
         <w:rPr>
+          <w:rFonts w:ascii="Arial" w:hAnsi="Arial"/>
           <w:i/>
+          <w:color w:val="000000"/>
+          <w:sz w:val="24"/>
         </w:rPr>
         <w:t>Node.js Express Web Application Framework Documentation</w:t>
       </w:r>
       <w:r>
+        <w:rPr>
+          <w:rFonts w:ascii="Arial" w:hAnsi="Arial"/>
+          <w:color w:val="000000"/>
+          <w:sz w:val="24"/>
+        </w:rPr>
         <w:t>. Disponível em: &lt;https://expressjs.com/&gt;. Acesso em: 2026.</w:t>
       </w:r>
     </w:p>
     <w:p>
       <w:pPr>
-        <w:pStyle w:val="ListBullet"/>
+        <w:spacing w:line="240" w:lineRule="auto" w:after="240"/>
+        <w:ind w:left="0"/>
+        <w:jc w:val="left"/>
       </w:pPr>
       <w:r>
         <w:rPr>
+          <w:rFonts w:ascii="Arial" w:hAnsi="Arial"/>
           <w:b/>
+          <w:color w:val="000000"/>
+          <w:sz w:val="24"/>
         </w:rPr>
         <w:t>FLANAGAN, David.</w:t>
       </w:r>
       <w:r>
+        <w:rPr>
+          <w:rFonts w:ascii="Arial" w:hAnsi="Arial"/>
+          <w:color w:val="000000"/>
+          <w:sz w:val="24"/>
+        </w:rPr>
         <w:t xml:space="preserve"> </w:t>
       </w:r>
       <w:r>
         <w:rPr>
+          <w:rFonts w:ascii="Arial" w:hAnsi="Arial"/>
           <w:i/>
+          <w:color w:val="000000"/>
+          <w:sz w:val="24"/>
         </w:rPr>
         <w:t>JavaScript: O Guia Definitivo</w:t>
       </w:r>
       <w:r>
+        <w:rPr>
+          <w:rFonts w:ascii="Arial" w:hAnsi="Arial"/>
+          <w:color w:val="000000"/>
+          <w:sz w:val="24"/>
+        </w:rPr>
         <w:t>. 7. ed. São Paulo: Novatec, 2021.</w:t>
       </w:r>
     </w:p>
     <w:p>
       <w:pPr>
-        <w:pStyle w:val="ListBullet"/>
+        <w:spacing w:line="240" w:lineRule="auto" w:after="240"/>
+        <w:ind w:left="0"/>
+        <w:jc w:val="left"/>
       </w:pPr>
       <w:r>
         <w:rPr>
+          <w:rFonts w:ascii="Arial" w:hAnsi="Arial"/>
           <w:b/>
+          <w:color w:val="000000"/>
+          <w:sz w:val="24"/>
         </w:rPr>
         <w:t>ORGANIZAÇÃO MUNDIAL DA SAÚDE (OMS).</w:t>
       </w:r>
       <w:r>
+        <w:rPr>
+          <w:rFonts w:ascii="Arial" w:hAnsi="Arial"/>
+          <w:color w:val="000000"/>
+          <w:sz w:val="24"/>
+        </w:rPr>
         <w:t xml:space="preserve"> </w:t>
       </w:r>
       <w:r>
         <w:rPr>
+          <w:rFonts w:ascii="Arial" w:hAnsi="Arial"/>
           <w:i/>
+          <w:color w:val="000000"/>
+          <w:sz w:val="24"/>
         </w:rPr>
         <w:t>Relatório Mundial de Saúde Mental: transformar a saúde mental para todos</w:t>
       </w:r>
       <w:r>
+        <w:rPr>
+          <w:rFonts w:ascii="Arial" w:hAnsi="Arial"/>
+          <w:color w:val="000000"/>
+          <w:sz w:val="24"/>
+        </w:rPr>
         <w:t>. Genebra: OMS, 2022.</w:t>
       </w:r>
     </w:p>
     <w:p>
       <w:pPr>
-        <w:pStyle w:val="ListBullet"/>
+        <w:spacing w:line="240" w:lineRule="auto" w:after="240"/>
+        <w:ind w:left="0"/>
+        <w:jc w:val="left"/>
       </w:pPr>
       <w:r>
         <w:rPr>
+          <w:rFonts w:ascii="Arial" w:hAnsi="Arial"/>
           <w:b/>
+          <w:color w:val="000000"/>
+          <w:sz w:val="24"/>
         </w:rPr>
         <w:t>PRESSMAN, Roger S.; MAXIM, Bruce R.</w:t>
       </w:r>
       <w:r>
+        <w:rPr>
+          <w:rFonts w:ascii="Arial" w:hAnsi="Arial"/>
+          <w:color w:val="000000"/>
+          <w:sz w:val="24"/>
+        </w:rPr>
         <w:t xml:space="preserve"> </w:t>
       </w:r>
       <w:r>
         <w:rPr>
+          <w:rFonts w:ascii="Arial" w:hAnsi="Arial"/>
           <w:i/>
+          <w:color w:val="000000"/>
+          <w:sz w:val="24"/>
         </w:rPr>
         <w:t>Engenharia de Software: uma abordagem profissional</w:t>
       </w:r>
       <w:r>
+        <w:rPr>
+          <w:rFonts w:ascii="Arial" w:hAnsi="Arial"/>
+          <w:color w:val="000000"/>
+          <w:sz w:val="24"/>
+        </w:rPr>
         <w:t>. 8. ed. Porto Alegre: AMGH, 2016.</w:t>
       </w:r>
     </w:p>
     <w:p>
       <w:pPr>
-        <w:pStyle w:val="ListBullet"/>
+        <w:spacing w:line="240" w:lineRule="auto" w:after="240"/>
+        <w:ind w:left="0"/>
+        <w:jc w:val="left"/>
       </w:pPr>
       <w:r>
         <w:rPr>
+          <w:rFonts w:ascii="Arial" w:hAnsi="Arial"/>
           <w:b/>
+          <w:color w:val="000000"/>
+          <w:sz w:val="24"/>
         </w:rPr>
         <w:t>SILVA, Flávio Soares da; SILVEIRA, Fábio; MORAIS, Izabel.</w:t>
       </w:r>
       <w:r>
+        <w:rPr>
+          <w:rFonts w:ascii="Arial" w:hAnsi="Arial"/>
+          <w:color w:val="000000"/>
+          <w:sz w:val="24"/>
+        </w:rPr>
         <w:t xml:space="preserve"> Automação de Processos de Atendimento e Triagem Digital na Saúde. </w:t>
       </w:r>
       <w:r>
         <w:rPr>
+          <w:rFonts w:ascii="Arial" w:hAnsi="Arial"/>
           <w:i/>
+          <w:color w:val="000000"/>
+          <w:sz w:val="24"/>
         </w:rPr>
         <w:t>Revista Brasileira de Computação Aplicada</w:t>
       </w:r>
       <w:r>
+        <w:rPr>
+          <w:rFonts w:ascii="Arial" w:hAnsi="Arial"/>
+          <w:color w:val="000000"/>
+          <w:sz w:val="24"/>
+        </w:rPr>
         <w:t>, v. 14, n. 2, p. 45-58, 2022.</w:t>
       </w:r>
     </w:p>
     <w:sectPr>
       <w:pgSz w:w="12240" w:h="15840"/>
-      <w:pgMar w:top="1440" w:right="1440" w:bottom="1440" w:left="1440" w:header="720" w:footer="720" w:gutter="0"/>
+      <w:pgMar w:top="1701" w:right="1134" w:bottom="1134" w:left="1701" w:header="720" w:footer="720" w:gutter="0"/>
       <w:cols w:space="720"/>
       <w:docGrid w:linePitch="360"/>
     </w:sectPr>
@@ -1623,6 +2446,11 @@
     <w:name w:val="Normal"/>
     <w:qFormat/>
     <w:rsid w:val="00FC693F"/>
+    <w:rPr>
+      <w:rFonts w:ascii="Arial" w:hAnsi="Arial"/>
+      <w:color w:val="000000"/>
+      <w:sz w:val="24"/>
+    </w:rPr>
   </w:style>
   <w:style w:type="paragraph" w:styleId="Header">
     <w:name w:val="header"/>

</xml_diff>

<commit_message>
docs: atualiza MODELO DE PROJETO INTEGRADOR com estrutura completa ABNT (Capa, Folha de Rosto, Resumo, Sumario, Introducao, Conceitos, Metodologia e Referencias)
</commit_message>
<xml_diff>
--- a/MODELO DE PROJETO INTEGRADOR - PARTE TEÓRICA.docx
+++ b/MODELO DE PROJETO INTEGRADOR - PARTE TEÓRICA.docx
@@ -4,1734 +4,1284 @@
   <w:body>
     <w:p>
       <w:pPr>
-        <w:spacing w:line="360" w:lineRule="auto" w:before="240" w:after="360"/>
+        <w:spacing w:before="0" w:after="40" w:line="360" w:lineRule="auto"/>
         <w:jc w:val="center"/>
       </w:pPr>
       <w:r>
         <w:rPr>
           <w:rFonts w:ascii="Arial" w:hAnsi="Arial"/>
           <w:b/>
+          <w:i w:val="0"/>
           <w:color w:val="000000"/>
-          <w:sz w:val="28"/>
+          <w:sz w:val="24"/>
         </w:rPr>
-        <w:t>PROJETO INTEGRADOR — PARTE TEÓRICA</w:t>
+        <w:t>SENAC LINHARES</w:t>
       </w:r>
     </w:p>
     <w:p>
       <w:pPr>
-        <w:spacing w:line="360" w:lineRule="auto" w:after="120"/>
+        <w:spacing w:before="0" w:after="720" w:line="360" w:lineRule="auto"/>
+        <w:jc w:val="center"/>
+      </w:pPr>
+      <w:r>
+        <w:rPr>
+          <w:rFonts w:ascii="Arial" w:hAnsi="Arial"/>
+          <w:b/>
+          <w:i w:val="0"/>
+          <w:color w:val="000000"/>
+          <w:sz w:val="24"/>
+        </w:rPr>
+        <w:t>CURSO TÉCNICO EM INFORMÁTICA PARA INTERNET</w:t>
+      </w:r>
+    </w:p>
+    <w:p>
+      <w:pPr>
+        <w:spacing w:before="0" w:after="40" w:line="360" w:lineRule="auto"/>
+        <w:jc w:val="center"/>
+      </w:pPr>
+      <w:r>
+        <w:rPr>
+          <w:rFonts w:ascii="Arial" w:hAnsi="Arial"/>
+          <w:b w:val="0"/>
+          <w:i w:val="0"/>
+          <w:color w:val="000000"/>
+          <w:sz w:val="24"/>
+        </w:rPr>
+        <w:t>ALEXANDER ADLLEANO DE SOUZA SANTOS QUEIROZ</w:t>
+      </w:r>
+    </w:p>
+    <w:p>
+      <w:pPr>
+        <w:spacing w:before="0" w:after="40" w:line="360" w:lineRule="auto"/>
+        <w:jc w:val="center"/>
+      </w:pPr>
+      <w:r>
+        <w:rPr>
+          <w:rFonts w:ascii="Arial" w:hAnsi="Arial"/>
+          <w:b w:val="0"/>
+          <w:i w:val="0"/>
+          <w:color w:val="000000"/>
+          <w:sz w:val="24"/>
+        </w:rPr>
+        <w:t>JAMILLY POLI LEAL</w:t>
+      </w:r>
+    </w:p>
+    <w:p>
+      <w:pPr>
+        <w:spacing w:before="0" w:after="40" w:line="360" w:lineRule="auto"/>
+        <w:jc w:val="center"/>
+      </w:pPr>
+      <w:r>
+        <w:rPr>
+          <w:rFonts w:ascii="Arial" w:hAnsi="Arial"/>
+          <w:b w:val="0"/>
+          <w:i w:val="0"/>
+          <w:color w:val="000000"/>
+          <w:sz w:val="24"/>
+        </w:rPr>
+        <w:t>MURYLLO</w:t>
+      </w:r>
+    </w:p>
+    <w:p>
+      <w:pPr>
+        <w:spacing w:before="0" w:after="2400" w:line="360" w:lineRule="auto"/>
+        <w:jc w:val="center"/>
+      </w:pPr>
+      <w:r>
+        <w:rPr>
+          <w:rFonts w:ascii="Arial" w:hAnsi="Arial"/>
+          <w:b w:val="0"/>
+          <w:i w:val="0"/>
+          <w:color w:val="000000"/>
+          <w:sz w:val="24"/>
+        </w:rPr>
+        <w:t>NICOLY DOS SANTOS SIQUEIRA BABISK</w:t>
+      </w:r>
+    </w:p>
+    <w:p>
+      <w:pPr>
+        <w:spacing w:before="0" w:after="3600" w:line="360" w:lineRule="auto"/>
+        <w:jc w:val="center"/>
+      </w:pPr>
+      <w:r>
+        <w:rPr>
+          <w:rFonts w:ascii="Arial" w:hAnsi="Arial"/>
+          <w:b/>
+          <w:i w:val="0"/>
+          <w:color w:val="000000"/>
+          <w:sz w:val="28"/>
+        </w:rPr>
+        <w:t>SENTIR BEM — SISTEMA DE TERAPIA EMOCIONAL E ATENDIMENTO AUTOMATIZADO</w:t>
+      </w:r>
+    </w:p>
+    <w:p>
+      <w:pPr>
+        <w:spacing w:before="0" w:after="40" w:line="360" w:lineRule="auto"/>
+        <w:jc w:val="center"/>
+      </w:pPr>
+      <w:r>
+        <w:rPr>
+          <w:rFonts w:ascii="Arial" w:hAnsi="Arial"/>
+          <w:b/>
+          <w:i w:val="0"/>
+          <w:color w:val="000000"/>
+          <w:sz w:val="24"/>
+        </w:rPr>
+        <w:t>LINHARES</w:t>
+      </w:r>
+    </w:p>
+    <w:p>
+      <w:pPr>
+        <w:spacing w:before="0" w:after="0" w:line="360" w:lineRule="auto"/>
+        <w:jc w:val="center"/>
+      </w:pPr>
+      <w:r>
+        <w:rPr>
+          <w:rFonts w:ascii="Arial" w:hAnsi="Arial"/>
+          <w:b/>
+          <w:i w:val="0"/>
+          <w:color w:val="000000"/>
+          <w:sz w:val="24"/>
+        </w:rPr>
+        <w:t>2026</w:t>
+      </w:r>
+    </w:p>
+    <w:p>
+      <w:r>
+        <w:br w:type="page"/>
+      </w:r>
+    </w:p>
+    <w:p>
+      <w:pPr>
+        <w:spacing w:before="0" w:after="800" w:line="360" w:lineRule="auto"/>
+        <w:jc w:val="center"/>
+      </w:pPr>
+      <w:r>
+        <w:rPr>
+          <w:rFonts w:ascii="Arial" w:hAnsi="Arial"/>
+          <w:b w:val="0"/>
+          <w:i w:val="0"/>
+          <w:color w:val="000000"/>
+          <w:sz w:val="24"/>
+        </w:rPr>
+        <w:t>ALEXANDER ADLLEANO DE SOUZA SANTOS QUEIROZ</w:t>
+        <w:br/>
+        <w:t>JAMILLY POLI LEAL</w:t>
+        <w:br/>
+        <w:t>MURYLLO</w:t>
+        <w:br/>
+        <w:t>NICOLY DOS SANTOS SIQUEIRA BABISK</w:t>
+      </w:r>
+    </w:p>
+    <w:p>
+      <w:pPr>
+        <w:spacing w:before="0" w:after="800" w:line="360" w:lineRule="auto"/>
+        <w:jc w:val="center"/>
+      </w:pPr>
+      <w:r>
+        <w:rPr>
+          <w:rFonts w:ascii="Arial" w:hAnsi="Arial"/>
+          <w:b/>
+          <w:i w:val="0"/>
+          <w:color w:val="000000"/>
+          <w:sz w:val="28"/>
+        </w:rPr>
+        <w:t>SENTIR BEM — SISTEMA DE TERAPIA EMOCIONAL E ATENDIMENTO AUTOMATIZADO</w:t>
+      </w:r>
+    </w:p>
+    <w:p>
+      <w:pPr>
+        <w:spacing w:after="720" w:line="240" w:lineRule="auto"/>
+        <w:ind w:left="4535"/>
+        <w:jc w:val="both"/>
+      </w:pPr>
+      <w:r>
+        <w:rPr>
+          <w:rFonts w:ascii="Arial" w:hAnsi="Arial"/>
+          <w:sz w:val="20"/>
+        </w:rPr>
+        <w:t>Trabalho de Conclusão de Curso apresentado ao Serviço Nacional de Aprendizagem Comercial — SENAC Linhares, como requisito parcial para obtenção do grau de Habilitação Técnica em Técnico em Informática para Internet.</w:t>
+        <w:br/>
+        <w:br/>
+        <w:t>Orientador: Prof. Messias Sousa.</w:t>
+      </w:r>
+    </w:p>
+    <w:p>
+      <w:pPr>
+        <w:spacing w:before="2000" w:after="40" w:line="360" w:lineRule="auto"/>
+        <w:jc w:val="center"/>
+      </w:pPr>
+      <w:r>
+        <w:rPr>
+          <w:rFonts w:ascii="Arial" w:hAnsi="Arial"/>
+          <w:b/>
+          <w:i w:val="0"/>
+          <w:color w:val="000000"/>
+          <w:sz w:val="24"/>
+        </w:rPr>
+        <w:t>LINHARES</w:t>
+      </w:r>
+    </w:p>
+    <w:p>
+      <w:pPr>
+        <w:spacing w:before="0" w:after="0" w:line="360" w:lineRule="auto"/>
+        <w:jc w:val="center"/>
+      </w:pPr>
+      <w:r>
+        <w:rPr>
+          <w:rFonts w:ascii="Arial" w:hAnsi="Arial"/>
+          <w:b/>
+          <w:i w:val="0"/>
+          <w:color w:val="000000"/>
+          <w:sz w:val="24"/>
+        </w:rPr>
+        <w:t>2026</w:t>
+      </w:r>
+    </w:p>
+    <w:p>
+      <w:r>
+        <w:br w:type="page"/>
+      </w:r>
+    </w:p>
+    <w:p>
+      <w:pPr>
+        <w:spacing w:before="240" w:after="360" w:line="360" w:lineRule="auto"/>
+        <w:jc w:val="center"/>
+      </w:pPr>
+      <w:r>
+        <w:rPr>
+          <w:rFonts w:ascii="Arial" w:hAnsi="Arial"/>
+          <w:b/>
+          <w:i w:val="0"/>
+          <w:color w:val="000000"/>
+          <w:sz w:val="24"/>
+        </w:rPr>
+        <w:t>RESUMO</w:t>
+      </w:r>
+    </w:p>
+    <w:p>
+      <w:pPr>
+        <w:spacing w:before="0" w:after="360" w:line="360" w:lineRule="auto"/>
         <w:ind w:firstLine="709"/>
         <w:jc w:val="both"/>
       </w:pPr>
       <w:r>
         <w:rPr>
           <w:rFonts w:ascii="Arial" w:hAnsi="Arial"/>
-          <w:b/>
+          <w:b w:val="0"/>
+          <w:i w:val="0"/>
           <w:color w:val="000000"/>
           <w:sz w:val="24"/>
         </w:rPr>
-        <w:t>Projeto:</w:t>
+        <w:t>O presente Trabalho de Conclusão de Curso apresenta o desenvolvimento da plataforma Sentir Bem, um sistema de terapia emocional e atendimento automatizado projetado para solucionar a demora e a falta de organização no agendamento de consultas psicológicas. A solução é composta por uma Landing Page institucional responsiva desenvolvida sem frameworks (HTML5, CSS3 Vanilla com design Glassmorphism e JavaScript ES6+), um assistente virtual no WhatsApp construído em Node.js com Express e whatsapp-web.js para recepção 24/7, verificação de CPF e reagendamento automático de consultas, e um Painel Administrativo em tempo real integrado ao banco de dados relacional Supabase (PostgreSQL). Adicionalmente, a plataforma implementa motor de segurança e triagem emergencial com direcionamento ao CVV (188) para prevenção de crises e módulo de pagamento instantâneo via PIX. A metodologia seguiu os preceitos da Engenharia de Software Orientada a Requisitos e Prototipagem Ágil, acompanhada por suíte de testes unitários e de integração (9/9 aprovados). Os resultados demonstraram a viabilidade técnica da solução, proporcionando acolhimento imediato, segurança dos dados dos pacientes sob a LGPD e otimização do fluxo de trabalho administrativo.</w:t>
+      </w:r>
+    </w:p>
+    <w:p>
+      <w:pPr>
+        <w:spacing w:before="0" w:after="0" w:line="360" w:lineRule="auto"/>
+        <w:jc w:val="left"/>
+      </w:pPr>
+      <w:r>
+        <w:rPr>
+          <w:rFonts w:ascii="Arial" w:hAnsi="Arial"/>
+          <w:b/>
+          <w:i w:val="0"/>
+          <w:color w:val="000000"/>
+          <w:sz w:val="24"/>
+        </w:rPr>
+        <w:t>Palavras-chave: Saúde Mental. Psicologia. WhatsApp. Automação. Supabase. PIX. LGPD.</w:t>
+      </w:r>
+    </w:p>
+    <w:p>
+      <w:r>
+        <w:br w:type="page"/>
+      </w:r>
+    </w:p>
+    <w:p>
+      <w:pPr>
+        <w:spacing w:before="240" w:after="480" w:line="360" w:lineRule="auto"/>
+        <w:jc w:val="center"/>
+      </w:pPr>
+      <w:r>
+        <w:rPr>
+          <w:rFonts w:ascii="Arial" w:hAnsi="Arial"/>
+          <w:b/>
+          <w:i w:val="0"/>
+          <w:color w:val="000000"/>
+          <w:sz w:val="24"/>
+        </w:rPr>
+        <w:t>SUMÁRIO</w:t>
+      </w:r>
+    </w:p>
+    <w:p>
+      <w:pPr>
+        <w:spacing w:line="360" w:lineRule="auto" w:after="80"/>
+      </w:pPr>
+      <w:r>
+        <w:rPr>
+          <w:rFonts w:ascii="Arial" w:hAnsi="Arial"/>
+          <w:b/>
+          <w:sz w:val="24"/>
+        </w:rPr>
+        <w:t>1. INTRODUÇÃO</w:t>
       </w:r>
       <w:r>
         <w:rPr>
           <w:rFonts w:ascii="Arial" w:hAnsi="Arial"/>
-          <w:color w:val="000000"/>
+          <w:color w:val="787878"/>
+          <w:sz w:val="20"/>
+        </w:rPr>
+        <w:t xml:space="preserve"> .............................................................. </w:t>
+      </w:r>
+      <w:r>
+        <w:rPr>
+          <w:rFonts w:ascii="Arial" w:hAnsi="Arial"/>
+          <w:b/>
           <w:sz w:val="24"/>
         </w:rPr>
-        <w:t xml:space="preserve"> Sentir Bem — Sistema de Terapia Emocional e Atendimento Automatizado</w:t>
+        <w:t>5</w:t>
       </w:r>
     </w:p>
     <w:p>
       <w:pPr>
-        <w:spacing w:line="360" w:lineRule="auto" w:after="120"/>
+        <w:spacing w:line="360" w:lineRule="auto" w:after="80"/>
+      </w:pPr>
+      <w:r>
+        <w:rPr>
+          <w:rFonts w:ascii="Arial" w:hAnsi="Arial"/>
+          <w:b/>
+          <w:sz w:val="24"/>
+        </w:rPr>
+        <w:t>2. CONCEITOS E REFERÊNCIAS BIBLIOGRÁFICAS</w:t>
+      </w:r>
+      <w:r>
+        <w:rPr>
+          <w:rFonts w:ascii="Arial" w:hAnsi="Arial"/>
+          <w:color w:val="787878"/>
+          <w:sz w:val="20"/>
+        </w:rPr>
+        <w:t xml:space="preserve"> .................................. </w:t>
+      </w:r>
+      <w:r>
+        <w:rPr>
+          <w:rFonts w:ascii="Arial" w:hAnsi="Arial"/>
+          <w:b/>
+          <w:sz w:val="24"/>
+        </w:rPr>
+        <w:t>6</w:t>
+      </w:r>
+    </w:p>
+    <w:p>
+      <w:pPr>
+        <w:spacing w:line="360" w:lineRule="auto" w:after="80"/>
+      </w:pPr>
+      <w:r>
+        <w:rPr>
+          <w:rFonts w:ascii="Arial" w:hAnsi="Arial"/>
+          <w:b/>
+          <w:sz w:val="24"/>
+        </w:rPr>
+        <w:t>3. PERCURSO METODOLÓGICO</w:t>
+      </w:r>
+      <w:r>
+        <w:rPr>
+          <w:rFonts w:ascii="Arial" w:hAnsi="Arial"/>
+          <w:color w:val="787878"/>
+          <w:sz w:val="20"/>
+        </w:rPr>
+        <w:t xml:space="preserve"> ................................................... </w:t>
+      </w:r>
+      <w:r>
+        <w:rPr>
+          <w:rFonts w:ascii="Arial" w:hAnsi="Arial"/>
+          <w:b/>
+          <w:sz w:val="24"/>
+        </w:rPr>
+        <w:t>7</w:t>
+      </w:r>
+    </w:p>
+    <w:p>
+      <w:pPr>
+        <w:spacing w:line="360" w:lineRule="auto" w:after="80"/>
+      </w:pPr>
+      <w:r>
+        <w:rPr>
+          <w:rFonts w:ascii="Arial" w:hAnsi="Arial"/>
+          <w:b w:val="0"/>
+          <w:sz w:val="24"/>
+        </w:rPr>
+        <w:t>3.1 A coleta de dados e a definição do corpus</w:t>
+      </w:r>
+      <w:r>
+        <w:rPr>
+          <w:rFonts w:ascii="Arial" w:hAnsi="Arial"/>
+          <w:color w:val="787878"/>
+          <w:sz w:val="20"/>
+        </w:rPr>
+        <w:t xml:space="preserve"> .......................... </w:t>
+      </w:r>
+      <w:r>
+        <w:rPr>
+          <w:rFonts w:ascii="Arial" w:hAnsi="Arial"/>
+          <w:b w:val="0"/>
+          <w:sz w:val="24"/>
+        </w:rPr>
+        <w:t>7</w:t>
+      </w:r>
+    </w:p>
+    <w:p>
+      <w:pPr>
+        <w:spacing w:line="360" w:lineRule="auto" w:after="80"/>
+      </w:pPr>
+      <w:r>
+        <w:rPr>
+          <w:rFonts w:ascii="Arial" w:hAnsi="Arial"/>
+          <w:b w:val="0"/>
+          <w:sz w:val="24"/>
+        </w:rPr>
+        <w:t>3.2 Tema / Objeto</w:t>
+      </w:r>
+      <w:r>
+        <w:rPr>
+          <w:rFonts w:ascii="Arial" w:hAnsi="Arial"/>
+          <w:color w:val="787878"/>
+          <w:sz w:val="20"/>
+        </w:rPr>
+        <w:t xml:space="preserve"> ...................................................... </w:t>
+      </w:r>
+      <w:r>
+        <w:rPr>
+          <w:rFonts w:ascii="Arial" w:hAnsi="Arial"/>
+          <w:b w:val="0"/>
+          <w:sz w:val="24"/>
+        </w:rPr>
+        <w:t>7</w:t>
+      </w:r>
+    </w:p>
+    <w:p>
+      <w:pPr>
+        <w:spacing w:line="360" w:lineRule="auto" w:after="80"/>
+      </w:pPr>
+      <w:r>
+        <w:rPr>
+          <w:rFonts w:ascii="Arial" w:hAnsi="Arial"/>
+          <w:b w:val="0"/>
+          <w:sz w:val="24"/>
+        </w:rPr>
+        <w:t>3.3 Problematização</w:t>
+      </w:r>
+      <w:r>
+        <w:rPr>
+          <w:rFonts w:ascii="Arial" w:hAnsi="Arial"/>
+          <w:color w:val="787878"/>
+          <w:sz w:val="20"/>
+        </w:rPr>
+        <w:t xml:space="preserve"> .................................................... </w:t>
+      </w:r>
+      <w:r>
+        <w:rPr>
+          <w:rFonts w:ascii="Arial" w:hAnsi="Arial"/>
+          <w:b w:val="0"/>
+          <w:sz w:val="24"/>
+        </w:rPr>
+        <w:t>8</w:t>
+      </w:r>
+    </w:p>
+    <w:p>
+      <w:pPr>
+        <w:spacing w:line="360" w:lineRule="auto" w:after="80"/>
+      </w:pPr>
+      <w:r>
+        <w:rPr>
+          <w:rFonts w:ascii="Arial" w:hAnsi="Arial"/>
+          <w:b w:val="0"/>
+          <w:sz w:val="24"/>
+        </w:rPr>
+        <w:t>3.4 Objetivos</w:t>
+      </w:r>
+      <w:r>
+        <w:rPr>
+          <w:rFonts w:ascii="Arial" w:hAnsi="Arial"/>
+          <w:color w:val="787878"/>
+          <w:sz w:val="20"/>
+        </w:rPr>
+        <w:t xml:space="preserve"> .......................................................... </w:t>
+      </w:r>
+      <w:r>
+        <w:rPr>
+          <w:rFonts w:ascii="Arial" w:hAnsi="Arial"/>
+          <w:b w:val="0"/>
+          <w:sz w:val="24"/>
+        </w:rPr>
+        <w:t>8</w:t>
+      </w:r>
+    </w:p>
+    <w:p>
+      <w:pPr>
+        <w:spacing w:line="360" w:lineRule="auto" w:after="80"/>
+      </w:pPr>
+      <w:r>
+        <w:rPr>
+          <w:rFonts w:ascii="Arial" w:hAnsi="Arial"/>
+          <w:b w:val="0"/>
+          <w:sz w:val="24"/>
+        </w:rPr>
+        <w:t>3.4.1 Objetivo geral</w:t>
+      </w:r>
+      <w:r>
+        <w:rPr>
+          <w:rFonts w:ascii="Arial" w:hAnsi="Arial"/>
+          <w:color w:val="787878"/>
+          <w:sz w:val="20"/>
+        </w:rPr>
+        <w:t xml:space="preserve"> ............................................... </w:t>
+      </w:r>
+      <w:r>
+        <w:rPr>
+          <w:rFonts w:ascii="Arial" w:hAnsi="Arial"/>
+          <w:b w:val="0"/>
+          <w:sz w:val="24"/>
+        </w:rPr>
+        <w:t>8</w:t>
+      </w:r>
+    </w:p>
+    <w:p>
+      <w:pPr>
+        <w:spacing w:line="360" w:lineRule="auto" w:after="80"/>
+      </w:pPr>
+      <w:r>
+        <w:rPr>
+          <w:rFonts w:ascii="Arial" w:hAnsi="Arial"/>
+          <w:b w:val="0"/>
+          <w:sz w:val="24"/>
+        </w:rPr>
+        <w:t>3.4.2 Objetivos específicos</w:t>
+      </w:r>
+      <w:r>
+        <w:rPr>
+          <w:rFonts w:ascii="Arial" w:hAnsi="Arial"/>
+          <w:color w:val="787878"/>
+          <w:sz w:val="20"/>
+        </w:rPr>
+        <w:t xml:space="preserve"> ........................................ </w:t>
+      </w:r>
+      <w:r>
+        <w:rPr>
+          <w:rFonts w:ascii="Arial" w:hAnsi="Arial"/>
+          <w:b w:val="0"/>
+          <w:sz w:val="24"/>
+        </w:rPr>
+        <w:t>8</w:t>
+      </w:r>
+    </w:p>
+    <w:p>
+      <w:pPr>
+        <w:spacing w:line="360" w:lineRule="auto" w:after="80"/>
+      </w:pPr>
+      <w:r>
+        <w:rPr>
+          <w:rFonts w:ascii="Arial" w:hAnsi="Arial"/>
+          <w:b w:val="0"/>
+          <w:sz w:val="24"/>
+        </w:rPr>
+        <w:t>3.5 Metodologia e Solução Proposta (Inovação Tecnológica)</w:t>
+      </w:r>
+      <w:r>
+        <w:rPr>
+          <w:rFonts w:ascii="Arial" w:hAnsi="Arial"/>
+          <w:color w:val="787878"/>
+          <w:sz w:val="20"/>
+        </w:rPr>
+        <w:t xml:space="preserve"> .............. </w:t>
+      </w:r>
+      <w:r>
+        <w:rPr>
+          <w:rFonts w:ascii="Arial" w:hAnsi="Arial"/>
+          <w:b w:val="0"/>
+          <w:sz w:val="24"/>
+        </w:rPr>
+        <w:t>9</w:t>
+      </w:r>
+    </w:p>
+    <w:p>
+      <w:pPr>
+        <w:spacing w:line="360" w:lineRule="auto" w:after="80"/>
+      </w:pPr>
+      <w:r>
+        <w:rPr>
+          <w:rFonts w:ascii="Arial" w:hAnsi="Arial"/>
+          <w:b/>
+          <w:sz w:val="24"/>
+        </w:rPr>
+        <w:t>4. CONSIDERAÇÕES FINAIS</w:t>
+      </w:r>
+      <w:r>
+        <w:rPr>
+          <w:rFonts w:ascii="Arial" w:hAnsi="Arial"/>
+          <w:color w:val="787878"/>
+          <w:sz w:val="20"/>
+        </w:rPr>
+        <w:t xml:space="preserve"> .................................................... </w:t>
+      </w:r>
+      <w:r>
+        <w:rPr>
+          <w:rFonts w:ascii="Arial" w:hAnsi="Arial"/>
+          <w:b/>
+          <w:sz w:val="24"/>
+        </w:rPr>
+        <w:t>10</w:t>
+      </w:r>
+    </w:p>
+    <w:p>
+      <w:pPr>
+        <w:spacing w:line="360" w:lineRule="auto" w:after="80"/>
+      </w:pPr>
+      <w:r>
+        <w:rPr>
+          <w:rFonts w:ascii="Arial" w:hAnsi="Arial"/>
+          <w:b/>
+          <w:sz w:val="24"/>
+        </w:rPr>
+        <w:t>5. REFERÊNCIAS BIBLIOGRÁFICAS</w:t>
+      </w:r>
+      <w:r>
+        <w:rPr>
+          <w:rFonts w:ascii="Arial" w:hAnsi="Arial"/>
+          <w:color w:val="787878"/>
+          <w:sz w:val="20"/>
+        </w:rPr>
+        <w:t xml:space="preserve"> .............................................. </w:t>
+      </w:r>
+      <w:r>
+        <w:rPr>
+          <w:rFonts w:ascii="Arial" w:hAnsi="Arial"/>
+          <w:b/>
+          <w:sz w:val="24"/>
+        </w:rPr>
+        <w:t>11</w:t>
+      </w:r>
+    </w:p>
+    <w:p>
+      <w:r>
+        <w:br w:type="page"/>
+      </w:r>
+    </w:p>
+    <w:p>
+      <w:pPr>
+        <w:spacing w:before="360" w:after="240" w:line="360" w:lineRule="auto"/>
+        <w:jc w:val="left"/>
+      </w:pPr>
+      <w:r>
+        <w:rPr>
+          <w:rFonts w:ascii="Arial" w:hAnsi="Arial"/>
+          <w:b/>
+          <w:i w:val="0"/>
+          <w:color w:val="000000"/>
+          <w:sz w:val="24"/>
+        </w:rPr>
+        <w:t>1. INTRODUÇÃO</w:t>
+      </w:r>
+    </w:p>
+    <w:p>
+      <w:pPr>
+        <w:spacing w:before="0" w:after="120" w:line="360" w:lineRule="auto"/>
         <w:ind w:firstLine="709"/>
         <w:jc w:val="both"/>
       </w:pPr>
       <w:r>
         <w:rPr>
           <w:rFonts w:ascii="Arial" w:hAnsi="Arial"/>
-          <w:b/>
+          <w:b w:val="0"/>
+          <w:i w:val="0"/>
           <w:color w:val="000000"/>
           <w:sz w:val="24"/>
         </w:rPr>
-        <w:t>Tema Gerador:</w:t>
-      </w:r>
-      <w:r>
-        <w:rPr>
-          <w:rFonts w:ascii="Arial" w:hAnsi="Arial"/>
-          <w:color w:val="000000"/>
-          <w:sz w:val="24"/>
-        </w:rPr>
-        <w:t xml:space="preserve"> Plataforma Tecnológica para Acolhimento, Agendamento e Gestão em Saúde Mental</w:t>
+        <w:t>O projeto Sentir Bem consiste em uma plataforma de guia, atendimento e acolhimento emocional voltada para a área de saúde mental e psicologia. A saúde mental e o bem-estar emocional consolidaram-se como pilares fundamentais para a qualidade de vida na sociedade contemporânea. De acordo com a Organização Mundial da Saúde (OMS), o acesso ágil e humanizado a cuidados psicológicos é crucial para a prevenção e o tratamento de transtornos como ansiedade, depressão e estresse ocupacional.</w:t>
       </w:r>
     </w:p>
     <w:p>
       <w:pPr>
-        <w:spacing w:line="360" w:lineRule="auto" w:after="120"/>
+        <w:spacing w:before="0" w:after="120" w:line="360" w:lineRule="auto"/>
         <w:ind w:firstLine="709"/>
         <w:jc w:val="both"/>
       </w:pPr>
       <w:r>
         <w:rPr>
           <w:rFonts w:ascii="Arial" w:hAnsi="Arial"/>
-          <w:b/>
+          <w:b w:val="0"/>
+          <w:i w:val="0"/>
           <w:color w:val="000000"/>
           <w:sz w:val="24"/>
         </w:rPr>
-        <w:t>Tecnologias:</w:t>
-      </w:r>
-      <w:r>
-        <w:rPr>
-          <w:rFonts w:ascii="Arial" w:hAnsi="Arial"/>
-          <w:color w:val="000000"/>
-          <w:sz w:val="24"/>
-        </w:rPr>
-        <w:t xml:space="preserve"> HTML5, CSS3, JavaScript Vanilla, Node.js (Express), </w:t>
-      </w:r>
-      <w:r>
-        <w:rPr>
-          <w:rFonts w:ascii="Courier New" w:hAnsi="Courier New"/>
-          <w:color w:val="1E1E1E"/>
-          <w:sz w:val="22"/>
-        </w:rPr>
-        <w:t>whatsapp-web.js</w:t>
-      </w:r>
-      <w:r>
-        <w:rPr>
-          <w:rFonts w:ascii="Arial" w:hAnsi="Arial"/>
-          <w:color w:val="000000"/>
-          <w:sz w:val="24"/>
-        </w:rPr>
-        <w:t>, Supabase (PostgreSQL), PIX</w:t>
+        <w:t>O cliente que busca atendimento psicológico muitas vezes enfrenta imensas dificuldades na comunicação e no agendamento com clínicas e profissionais, que por sua vez nem sempre oferecem um canal automatizado e ágil de recepção. Em situações de vulnerabilidade emocional, a ausência de respostas rápidas fora do horário comercial, a perda de informações de cadastro e a lentidão no reagendamento afetam negativamente a adesão ao tratamento e geram ansiedade e frustração.</w:t>
       </w:r>
     </w:p>
     <w:p>
       <w:pPr>
-        <w:spacing w:line="360" w:lineRule="auto" w:before="360" w:after="240"/>
+        <w:spacing w:before="0" w:after="120" w:line="360" w:lineRule="auto"/>
+        <w:ind w:firstLine="709"/>
+        <w:jc w:val="both"/>
+      </w:pPr>
+      <w:r>
+        <w:rPr>
+          <w:rFonts w:ascii="Arial" w:hAnsi="Arial"/>
+          <w:b w:val="0"/>
+          <w:i w:val="0"/>
+          <w:color w:val="000000"/>
+          <w:sz w:val="24"/>
+        </w:rPr>
+        <w:t>A problematização deste trabalho reside no fato de que os processos tradicionais de agendamento em clínicas de psicologia permanecem lentos e desorganizados. Com base nisso, desenvolvemos o sistema Sentir Bem, que integra uma Landing Page institucional intuitiva a um assistente virtual automatizado via WhatsApp, permitindo o acolhimento e agendamento imediato 24 horas por dia.</w:t>
+      </w:r>
+    </w:p>
+    <w:p>
+      <w:pPr>
+        <w:spacing w:before="0" w:after="120" w:line="360" w:lineRule="auto"/>
+        <w:ind w:firstLine="709"/>
+        <w:jc w:val="both"/>
+      </w:pPr>
+      <w:r>
+        <w:rPr>
+          <w:rFonts w:ascii="Arial" w:hAnsi="Arial"/>
+          <w:b w:val="0"/>
+          <w:i w:val="0"/>
+          <w:color w:val="000000"/>
+          <w:sz w:val="24"/>
+        </w:rPr>
+        <w:t>A importância deste trabalho consiste em demonstrar como a tecnologia e a automação conversacional podem contribuir para a inclusão, fortalecer a comunicação entre pacientes e terapeutas, garantir o sigilo dos dados segundo a LGPD e oferecer uma ferramenta eficiente de gestão administrativa.</w:t>
+      </w:r>
+    </w:p>
+    <w:p>
+      <w:pPr>
+        <w:spacing w:before="360" w:after="240" w:line="360" w:lineRule="auto"/>
         <w:jc w:val="left"/>
       </w:pPr>
       <w:r>
         <w:rPr>
           <w:rFonts w:ascii="Arial" w:hAnsi="Arial"/>
           <w:b/>
+          <w:i w:val="0"/>
           <w:color w:val="000000"/>
           <w:sz w:val="24"/>
         </w:rPr>
-        <w:t>1. CONTEXTUALIZAÇÃO DO TEMA E INTRODUÇÃO</w:t>
+        <w:t>2. CONCEITOS E REFERÊNCIAS BIBLIOGRÁFICAS</w:t>
       </w:r>
     </w:p>
     <w:p>
       <w:pPr>
-        <w:spacing w:line="360" w:lineRule="auto" w:after="120"/>
+        <w:spacing w:before="0" w:after="120" w:line="360" w:lineRule="auto"/>
         <w:ind w:firstLine="709"/>
         <w:jc w:val="both"/>
       </w:pPr>
       <w:r>
         <w:rPr>
           <w:rFonts w:ascii="Arial" w:hAnsi="Arial"/>
+          <w:b w:val="0"/>
+          <w:i w:val="0"/>
           <w:color w:val="000000"/>
           <w:sz w:val="24"/>
         </w:rPr>
-        <w:t>A saúde mental e o bem-estar emocional consolidaram-se como pilares fundamentais para a qualidade de vida na sociedade contemporânea. De acordo com a Organização Mundial da Saúde (OMS), o acesso ágil e humanizado a cuidados psicológicos é crucial para a prevenção e o tratamento de transtornos como ansiedade, depressão e estresse ocupacional.</w:t>
+        <w:t>A prestação de serviços psicológicos mediados por Tecnologias da Informação e Comunicação (TIC) é regulamentada pelo Conselho Federal de Psicologia (CFP), por meio da Resolução CFP nº 11/2018. O avanço da telessaúde no Brasil evidenciou a eficácia da Terapia Cognitivo-Comportamental (TCC) e do acompanhamento psicológico online quando suportados por ambientes digitais seguros.</w:t>
       </w:r>
     </w:p>
     <w:p>
       <w:pPr>
-        <w:spacing w:line="360" w:lineRule="auto" w:after="120"/>
+        <w:spacing w:before="0" w:after="120" w:line="360" w:lineRule="auto"/>
         <w:ind w:firstLine="709"/>
         <w:jc w:val="both"/>
       </w:pPr>
       <w:r>
         <w:rPr>
           <w:rFonts w:ascii="Arial" w:hAnsi="Arial"/>
+          <w:b w:val="0"/>
+          <w:i w:val="0"/>
           <w:color w:val="000000"/>
           <w:sz w:val="24"/>
         </w:rPr>
-        <w:t>Contudo, a busca por atendimento psicológico ainda enfrenta sérias barreiras de acesso. Entre os principais obstáculos estão a burocracia no agendamento, a falta de clareza nas informações de serviços e valores, a demora no primeiro acolhimento e a ausência de canais digitais integrados e diretos. Muitas vezes, no momento de maior vulnerabilidade emocional, o paciente depara-se com processos lentos e desorganizados, o que resulta no abandono da busca por ajuda.</w:t>
+        <w:t>No âmbito tecnológico, a arquitetura do Sentir Bem fundamenta-se nos princípios da Engenharia de Software Moderna (PRESSMAN; MAXIM, 2016). O sistema emprega o padrão de separação de responsabilidades no front-end (HTML5 semântico, CSS3 com variáveis de tema e Glassmorphic UI, e JavaScript ES6+ assíncrono), aliado a um back-end escalável em Node.js com Express e automação via biblioteca whatsapp-web.js (FLANAGAN, 2021; EXPRESS FOUNDATION, 2024).</w:t>
       </w:r>
     </w:p>
     <w:p>
       <w:pPr>
-        <w:spacing w:line="360" w:lineRule="auto" w:after="120"/>
+        <w:spacing w:before="0" w:after="120" w:line="360" w:lineRule="auto"/>
         <w:ind w:firstLine="709"/>
         <w:jc w:val="both"/>
       </w:pPr>
       <w:r>
         <w:rPr>
           <w:rFonts w:ascii="Arial" w:hAnsi="Arial"/>
+          <w:b w:val="0"/>
+          <w:i w:val="0"/>
           <w:color w:val="000000"/>
           <w:sz w:val="24"/>
         </w:rPr>
-        <w:t xml:space="preserve">O projeto </w:t>
-      </w:r>
-      <w:r>
-        <w:rPr>
-          <w:rFonts w:ascii="Arial" w:hAnsi="Arial"/>
-          <w:b/>
-          <w:color w:val="000000"/>
-          <w:sz w:val="24"/>
-        </w:rPr>
-        <w:t>Sentir Bem</w:t>
-      </w:r>
-      <w:r>
-        <w:rPr>
-          <w:rFonts w:ascii="Arial" w:hAnsi="Arial"/>
-          <w:color w:val="000000"/>
-          <w:sz w:val="24"/>
-        </w:rPr>
-        <w:t xml:space="preserve"> surge para enfrentar essa problemática, desenvolvendo uma solução tecnológica moderna que une um </w:t>
-      </w:r>
-      <w:r>
-        <w:rPr>
-          <w:rFonts w:ascii="Arial" w:hAnsi="Arial"/>
-          <w:b/>
-          <w:color w:val="000000"/>
-          <w:sz w:val="24"/>
-        </w:rPr>
-        <w:t>site institucional receptivo e transparente</w:t>
-      </w:r>
-      <w:r>
-        <w:rPr>
-          <w:rFonts w:ascii="Arial" w:hAnsi="Arial"/>
-          <w:color w:val="000000"/>
-          <w:sz w:val="24"/>
-        </w:rPr>
-        <w:t xml:space="preserve"> a um </w:t>
-      </w:r>
-      <w:r>
-        <w:rPr>
-          <w:rFonts w:ascii="Arial" w:hAnsi="Arial"/>
-          <w:b/>
-          <w:color w:val="000000"/>
-          <w:sz w:val="24"/>
-        </w:rPr>
-        <w:t>sistema de atendimento automatizado via WhatsApp</w:t>
-      </w:r>
-      <w:r>
-        <w:rPr>
-          <w:rFonts w:ascii="Arial" w:hAnsi="Arial"/>
-          <w:color w:val="000000"/>
-          <w:sz w:val="24"/>
-        </w:rPr>
-        <w:t xml:space="preserve"> (integrado a banco de dados relacional e painel administrativo). A proposta busca democratizar e agilizar o acesso à terapia emocional, proporcionando uma experiência contínua, segura e acolhedora desde o primeiro contato até o acompanhamento das consultas.</w:t>
+        <w:t>Para o armazenamento de dados sensíveis de identificação e controle de consultas, a plataforma adota o Supabase BaaS (PostgreSQL relacional), garantindo o cumprimento estrito da Lei Geral de Proteção de Dados Pessoais (LGPD - Lei nº 13.709/2018). As credenciais de acesso ao Painel Administrativo (/admin) são resguardadas por algoritmos de derivação de chave e hashing scrypt, impedindo a exposição de dados sensíveis.</w:t>
       </w:r>
     </w:p>
     <w:p>
       <w:pPr>
-        <w:spacing w:line="360" w:lineRule="auto" w:before="360" w:after="240"/>
+        <w:spacing w:before="360" w:after="240" w:line="360" w:lineRule="auto"/>
         <w:jc w:val="left"/>
       </w:pPr>
       <w:r>
         <w:rPr>
           <w:rFonts w:ascii="Arial" w:hAnsi="Arial"/>
           <w:b/>
+          <w:i w:val="0"/>
           <w:color w:val="000000"/>
           <w:sz w:val="24"/>
         </w:rPr>
-        <w:t>2. PERCURSO METODOLÓGICO</w:t>
+        <w:t>3. PERCURSO METODOLÓGICO</w:t>
       </w:r>
     </w:p>
     <w:p>
       <w:pPr>
-        <w:spacing w:line="360" w:lineRule="auto" w:before="280" w:after="160"/>
+        <w:spacing w:before="280" w:after="160" w:line="360" w:lineRule="auto"/>
         <w:jc w:val="left"/>
       </w:pPr>
       <w:r>
         <w:rPr>
           <w:rFonts w:ascii="Arial" w:hAnsi="Arial"/>
           <w:b/>
+          <w:i w:val="0"/>
           <w:color w:val="000000"/>
           <w:sz w:val="24"/>
         </w:rPr>
-        <w:t>2.1 A Coleta de Dados e a Definição do Corpus</w:t>
+        <w:t>3.1 A coleta de dados e a definição do corpus</w:t>
       </w:r>
     </w:p>
     <w:p>
       <w:pPr>
-        <w:spacing w:line="360" w:lineRule="auto" w:after="120"/>
+        <w:spacing w:before="0" w:after="120" w:line="360" w:lineRule="auto"/>
         <w:ind w:firstLine="709"/>
         <w:jc w:val="both"/>
       </w:pPr>
       <w:r>
         <w:rPr>
           <w:rFonts w:ascii="Arial" w:hAnsi="Arial"/>
+          <w:b w:val="0"/>
+          <w:i w:val="0"/>
           <w:color w:val="000000"/>
           <w:sz w:val="24"/>
         </w:rPr>
-        <w:t xml:space="preserve">Os dados para a fundamentação desta pesquisa e para o desenvolvimento da plataforma foram coletados por meio de </w:t>
-      </w:r>
-      <w:r>
-        <w:rPr>
-          <w:rFonts w:ascii="Arial" w:hAnsi="Arial"/>
-          <w:b/>
-          <w:color w:val="000000"/>
-          <w:sz w:val="24"/>
-        </w:rPr>
-        <w:t>pesquisa bibliográfica, documental e de requisitos técnicos</w:t>
-      </w:r>
-      <w:r>
-        <w:rPr>
-          <w:rFonts w:ascii="Arial" w:hAnsi="Arial"/>
-          <w:color w:val="000000"/>
-          <w:sz w:val="24"/>
-        </w:rPr>
-        <w:t>, utilizando normativas oficiais de psicologia, diretrizes de telessaúde e documentações tecnológicas.</w:t>
+        <w:t>Os dados para a fundamentação desta pesquisa e para o desenvolvimento da plataforma foram coletados por meio de pesquisa bibliográfica e documental em portais oficiais de psicologia e saúde, como o Conselho Federal de Psicologia (CFP), a Organização Mundial da Saúde (OMS), diretrizes da Lei Geral de Proteção de Dados (LGPD) e documentações técnicas de Engenharia de Software (Node.js, Express, Supabase e WhatsApp Web API).</w:t>
       </w:r>
     </w:p>
     <w:p>
       <w:pPr>
-        <w:spacing w:line="360" w:lineRule="auto" w:after="120"/>
+        <w:spacing w:before="0" w:after="120" w:line="360" w:lineRule="auto"/>
         <w:ind w:firstLine="709"/>
         <w:jc w:val="both"/>
       </w:pPr>
       <w:r>
         <w:rPr>
           <w:rFonts w:ascii="Arial" w:hAnsi="Arial"/>
+          <w:b w:val="0"/>
+          <w:i w:val="0"/>
           <w:color w:val="000000"/>
           <w:sz w:val="24"/>
         </w:rPr>
-        <w:t>O corpus da pesquisa foi composto por:</w:t>
+        <w:t>As informações obtidas foram organizadas e analisadas de forma qualitativa, permitindo mapear os principais pontos de travamento na recepção de clínicas psicológicas e fundamentar os módulos de automação e triagem do Sentir Bem.</w:t>
       </w:r>
     </w:p>
     <w:p>
       <w:pPr>
-        <w:spacing w:line="360" w:lineRule="auto" w:after="120"/>
-        <w:ind w:left="709"/>
-        <w:jc w:val="both"/>
+        <w:spacing w:before="280" w:after="160" w:line="360" w:lineRule="auto"/>
+        <w:jc w:val="left"/>
       </w:pPr>
       <w:r>
         <w:rPr>
           <w:rFonts w:ascii="Arial" w:hAnsi="Arial"/>
           <w:b/>
+          <w:i w:val="0"/>
           <w:color w:val="000000"/>
           <w:sz w:val="24"/>
         </w:rPr>
-        <w:t xml:space="preserve">1. </w:t>
-      </w:r>
-      <w:r>
-        <w:rPr>
-          <w:rFonts w:ascii="Arial" w:hAnsi="Arial"/>
-          <w:b/>
-          <w:color w:val="000000"/>
-          <w:sz w:val="24"/>
-        </w:rPr>
-        <w:t>Diretrizes Oficiais de Saúde e Psicologia:</w:t>
-      </w:r>
-      <w:r>
-        <w:rPr>
-          <w:rFonts w:ascii="Arial" w:hAnsi="Arial"/>
-          <w:color w:val="000000"/>
-          <w:sz w:val="24"/>
-        </w:rPr>
-        <w:t xml:space="preserve"> Resoluções do Conselho Federal de Psicologia (CFP, em especial a Resolução nº 11/2018 sobre prestação de serviços psicológicos mediados por TIC) e relatórios da Organização Mundial da Saúde (OMS).</w:t>
+        <w:t>3.2 Tema / Objeto</w:t>
       </w:r>
     </w:p>
     <w:p>
       <w:pPr>
-        <w:spacing w:line="360" w:lineRule="auto" w:after="120"/>
-        <w:ind w:left="709"/>
-        <w:jc w:val="both"/>
-      </w:pPr>
-      <w:r>
-        <w:rPr>
-          <w:rFonts w:ascii="Arial" w:hAnsi="Arial"/>
-          <w:b/>
-          <w:color w:val="000000"/>
-          <w:sz w:val="24"/>
-        </w:rPr>
-        <w:t xml:space="preserve">2. </w:t>
-      </w:r>
-      <w:r>
-        <w:rPr>
-          <w:rFonts w:ascii="Arial" w:hAnsi="Arial"/>
-          <w:b/>
-          <w:color w:val="000000"/>
-          <w:sz w:val="24"/>
-        </w:rPr>
-        <w:t>Legislação e Segurança da Informação:</w:t>
-      </w:r>
-      <w:r>
-        <w:rPr>
-          <w:rFonts w:ascii="Arial" w:hAnsi="Arial"/>
-          <w:color w:val="000000"/>
-          <w:sz w:val="24"/>
-        </w:rPr>
-        <w:t xml:space="preserve"> Lei Geral de Proteção de Dados Pessoais (LGPD - Lei nº 13.709/2018), com foco na proteção de dados sensíveis de saúde e identificadores únicos (CPF).</w:t>
-      </w:r>
-    </w:p>
-    <w:p>
-      <w:pPr>
-        <w:spacing w:line="360" w:lineRule="auto" w:after="120"/>
-        <w:ind w:left="709"/>
-        <w:jc w:val="both"/>
-      </w:pPr>
-      <w:r>
-        <w:rPr>
-          <w:rFonts w:ascii="Arial" w:hAnsi="Arial"/>
-          <w:b/>
-          <w:color w:val="000000"/>
-          <w:sz w:val="24"/>
-        </w:rPr>
-        <w:t xml:space="preserve">3. </w:t>
-      </w:r>
-      <w:r>
-        <w:rPr>
-          <w:rFonts w:ascii="Arial" w:hAnsi="Arial"/>
-          <w:b/>
-          <w:color w:val="000000"/>
-          <w:sz w:val="24"/>
-        </w:rPr>
-        <w:t>Documentação Técnica e Arquitetural:</w:t>
-      </w:r>
-      <w:r>
-        <w:rPr>
-          <w:rFonts w:ascii="Arial" w:hAnsi="Arial"/>
-          <w:color w:val="000000"/>
-          <w:sz w:val="24"/>
-        </w:rPr>
-        <w:t xml:space="preserve"> Manuais e especificações do Node.js, Express framework, </w:t>
-      </w:r>
-      <w:r>
-        <w:rPr>
-          <w:rFonts w:ascii="Courier New" w:hAnsi="Courier New"/>
-          <w:color w:val="1E1E1E"/>
-          <w:sz w:val="22"/>
-        </w:rPr>
-        <w:t>whatsapp-web.js</w:t>
-      </w:r>
-      <w:r>
-        <w:rPr>
-          <w:rFonts w:ascii="Arial" w:hAnsi="Arial"/>
-          <w:color w:val="000000"/>
-          <w:sz w:val="24"/>
-        </w:rPr>
-        <w:t>, Supabase BaaS (PostgreSQL) e padrões de design UI/UX (Glassmorphism e Acessibilidade Web).</w:t>
-      </w:r>
-    </w:p>
-    <w:p>
-      <w:pPr>
-        <w:spacing w:line="360" w:lineRule="auto" w:after="120"/>
-        <w:ind w:left="709"/>
-        <w:jc w:val="both"/>
-      </w:pPr>
-      <w:r>
-        <w:rPr>
-          <w:rFonts w:ascii="Arial" w:hAnsi="Arial"/>
-          <w:b/>
-          <w:color w:val="000000"/>
-          <w:sz w:val="24"/>
-        </w:rPr>
-        <w:t xml:space="preserve">4. </w:t>
-      </w:r>
-      <w:r>
-        <w:rPr>
-          <w:rFonts w:ascii="Arial" w:hAnsi="Arial"/>
-          <w:b/>
-          <w:color w:val="000000"/>
-          <w:sz w:val="24"/>
-        </w:rPr>
-        <w:t>Canais de Emergência em Saúde Mental:</w:t>
-      </w:r>
-      <w:r>
-        <w:rPr>
-          <w:rFonts w:ascii="Arial" w:hAnsi="Arial"/>
-          <w:color w:val="000000"/>
-          <w:sz w:val="24"/>
-        </w:rPr>
-        <w:t xml:space="preserve"> Protocolos de encaminhamento e diretrizes do Centro de Valorização da Vida (CVV - 188).</w:t>
-      </w:r>
-    </w:p>
-    <w:p>
-      <w:pPr>
-        <w:spacing w:line="360" w:lineRule="auto" w:after="120"/>
+        <w:spacing w:before="0" w:after="120" w:line="360" w:lineRule="auto"/>
         <w:ind w:firstLine="709"/>
         <w:jc w:val="both"/>
       </w:pPr>
       <w:r>
         <w:rPr>
           <w:rFonts w:ascii="Arial" w:hAnsi="Arial"/>
+          <w:b w:val="0"/>
+          <w:i w:val="0"/>
           <w:color w:val="000000"/>
           <w:sz w:val="24"/>
         </w:rPr>
-        <w:t>As informações foram analisadas de forma qualitativa, permitindo mapear a jornada do paciente e identificar como a tecnologia pode eliminar intermediários desnecessários, reduzindo o tempo de espera no agendamento.</w:t>
+        <w:t>O objeto de estudo consiste na análise e no desenvolvimento do sistema integrado Sentir Bem, composto por uma Landing Page institucional para apresentação dos serviços e especialidades, um assistente virtual no WhatsApp (chatbot.js) para triagem, cadastro e agendamento via CPF, um módulo de pagamentos PIX instantâneos (QR Code) e um Painel Administrativo (/admin) em tempo real para controle da clínica.</w:t>
       </w:r>
     </w:p>
     <w:p>
       <w:pPr>
-        <w:spacing w:line="360" w:lineRule="auto" w:before="280" w:after="160"/>
+        <w:spacing w:before="280" w:after="160" w:line="360" w:lineRule="auto"/>
         <w:jc w:val="left"/>
       </w:pPr>
       <w:r>
         <w:rPr>
           <w:rFonts w:ascii="Arial" w:hAnsi="Arial"/>
           <w:b/>
+          <w:i w:val="0"/>
           <w:color w:val="000000"/>
           <w:sz w:val="24"/>
         </w:rPr>
-        <w:t>2.2 Tema / Objeto de Estudo</w:t>
+        <w:t>3.3 Problematização</w:t>
       </w:r>
     </w:p>
     <w:p>
       <w:pPr>
-        <w:spacing w:line="360" w:lineRule="auto" w:after="120"/>
+        <w:spacing w:before="0" w:after="120" w:line="360" w:lineRule="auto"/>
         <w:ind w:firstLine="709"/>
         <w:jc w:val="both"/>
       </w:pPr>
       <w:r>
         <w:rPr>
           <w:rFonts w:ascii="Arial" w:hAnsi="Arial"/>
+          <w:b w:val="0"/>
+          <w:i w:val="0"/>
           <w:color w:val="000000"/>
           <w:sz w:val="24"/>
         </w:rPr>
-        <w:t xml:space="preserve">O objeto de estudo consiste no desenvolvimento e na avaliação de um </w:t>
-      </w:r>
-      <w:r>
-        <w:rPr>
-          <w:rFonts w:ascii="Arial" w:hAnsi="Arial"/>
-          <w:b/>
-          <w:color w:val="000000"/>
-          <w:sz w:val="24"/>
-        </w:rPr>
-        <w:t>sistema integrado de terapia emocional e gestão de atendimento (Sentir Bem)</w:t>
-      </w:r>
-      <w:r>
-        <w:rPr>
-          <w:rFonts w:ascii="Arial" w:hAnsi="Arial"/>
-          <w:color w:val="000000"/>
-          <w:sz w:val="24"/>
-        </w:rPr>
-        <w:t>, compreendendo:</w:t>
+        <w:t>A escolha deste tema baseou-se na observação das dificuldades enfrentadas por pacientes ao tentarem agendar consultas psicológicas por meios tradicionais. A demora no atendimento inicial, a falta de confirmação de horários e a ausência de triagem rápida podem comprometer a continuidade da busca por ajuda emocional. A problematização central investiga como a tecnologia e a automação de mensagens podem tornar esse acolhimento imediato, seguro e acessível.</w:t>
       </w:r>
     </w:p>
     <w:p>
       <w:pPr>
-        <w:spacing w:line="360" w:lineRule="auto" w:after="120"/>
-        <w:ind w:left="709"/>
-        <w:jc w:val="both"/>
-      </w:pPr>
-      <w:r>
-        <w:rPr>
-          <w:rFonts w:ascii="Arial" w:hAnsi="Arial"/>
-          <w:color w:val="000000"/>
-          <w:sz w:val="24"/>
-        </w:rPr>
-        <w:t xml:space="preserve">Uma </w:t>
-      </w:r>
-      <w:r>
-        <w:rPr>
-          <w:rFonts w:ascii="Arial" w:hAnsi="Arial"/>
-          <w:b/>
-          <w:color w:val="000000"/>
-          <w:sz w:val="24"/>
-        </w:rPr>
-        <w:t>Landing Page Institucional</w:t>
-      </w:r>
-      <w:r>
-        <w:rPr>
-          <w:rFonts w:ascii="Arial" w:hAnsi="Arial"/>
-          <w:color w:val="000000"/>
-          <w:sz w:val="24"/>
-        </w:rPr>
-        <w:t xml:space="preserve"> responsiva para apresentação da clínica, pilares terapêuticos, especialidades e planos de atendimento;</w:t>
-      </w:r>
-    </w:p>
-    <w:p>
-      <w:pPr>
-        <w:spacing w:line="360" w:lineRule="auto" w:after="120"/>
-        <w:ind w:left="709"/>
-        <w:jc w:val="both"/>
-      </w:pPr>
-      <w:r>
-        <w:rPr>
-          <w:rFonts w:ascii="Arial" w:hAnsi="Arial"/>
-          <w:color w:val="000000"/>
-          <w:sz w:val="24"/>
-        </w:rPr>
-        <w:t xml:space="preserve">Um </w:t>
-      </w:r>
-      <w:r>
-        <w:rPr>
-          <w:rFonts w:ascii="Arial" w:hAnsi="Arial"/>
-          <w:b/>
-          <w:color w:val="000000"/>
-          <w:sz w:val="24"/>
-        </w:rPr>
-        <w:t>Assistente Virtual no WhatsApp (`chatbot.js`)</w:t>
-      </w:r>
-      <w:r>
-        <w:rPr>
-          <w:rFonts w:ascii="Arial" w:hAnsi="Arial"/>
-          <w:color w:val="000000"/>
-          <w:sz w:val="24"/>
-        </w:rPr>
-        <w:t xml:space="preserve"> capaz de efetuar autoatendimento 24/7, verificação e cadastro de pacientes via CPF, reagendamento automático de consultas e triagem emergencial;</w:t>
-      </w:r>
-    </w:p>
-    <w:p>
-      <w:pPr>
-        <w:spacing w:line="360" w:lineRule="auto" w:after="120"/>
-        <w:ind w:left="709"/>
-        <w:jc w:val="both"/>
-      </w:pPr>
-      <w:r>
-        <w:rPr>
-          <w:rFonts w:ascii="Arial" w:hAnsi="Arial"/>
-          <w:color w:val="000000"/>
-          <w:sz w:val="24"/>
-        </w:rPr>
-        <w:t xml:space="preserve">Um </w:t>
-      </w:r>
-      <w:r>
-        <w:rPr>
-          <w:rFonts w:ascii="Arial" w:hAnsi="Arial"/>
-          <w:b/>
-          <w:color w:val="000000"/>
-          <w:sz w:val="24"/>
-        </w:rPr>
-        <w:t>Painel Administrativo (`/admin`)</w:t>
-      </w:r>
-      <w:r>
-        <w:rPr>
-          <w:rFonts w:ascii="Arial" w:hAnsi="Arial"/>
-          <w:color w:val="000000"/>
-          <w:sz w:val="24"/>
-        </w:rPr>
-        <w:t xml:space="preserve"> em tempo real para controle de agendas, gestão de clientes, bloqueios/desbloqueios e monitoramento de logs de sistema (SSE);</w:t>
-      </w:r>
-    </w:p>
-    <w:p>
-      <w:pPr>
-        <w:spacing w:line="360" w:lineRule="auto" w:after="120"/>
-        <w:ind w:left="709"/>
-        <w:jc w:val="both"/>
-      </w:pPr>
-      <w:r>
-        <w:rPr>
-          <w:rFonts w:ascii="Arial" w:hAnsi="Arial"/>
-          <w:color w:val="000000"/>
-          <w:sz w:val="24"/>
-        </w:rPr>
-        <w:t xml:space="preserve">A integração de </w:t>
-      </w:r>
-      <w:r>
-        <w:rPr>
-          <w:rFonts w:ascii="Arial" w:hAnsi="Arial"/>
-          <w:b/>
-          <w:color w:val="000000"/>
-          <w:sz w:val="24"/>
-        </w:rPr>
-        <w:t>módulos de pagamento instantâneo via PIX (QR Code)</w:t>
-      </w:r>
-      <w:r>
-        <w:rPr>
-          <w:rFonts w:ascii="Arial" w:hAnsi="Arial"/>
-          <w:color w:val="000000"/>
-          <w:sz w:val="24"/>
-        </w:rPr>
-        <w:t xml:space="preserve"> para facilitação do acerto de consultas.</w:t>
-      </w:r>
-    </w:p>
-    <w:p>
-      <w:pPr>
-        <w:spacing w:line="360" w:lineRule="auto" w:before="240" w:after="120"/>
+        <w:spacing w:before="280" w:after="160" w:line="360" w:lineRule="auto"/>
         <w:jc w:val="left"/>
       </w:pPr>
       <w:r>
         <w:rPr>
           <w:rFonts w:ascii="Arial" w:hAnsi="Arial"/>
           <w:b/>
+          <w:i w:val="0"/>
           <w:color w:val="000000"/>
           <w:sz w:val="24"/>
         </w:rPr>
-        <w:t>Justificativa da Escolha</w:t>
+        <w:t>3.4 Objetivos</w:t>
       </w:r>
     </w:p>
     <w:p>
       <w:pPr>
-        <w:spacing w:line="360" w:lineRule="auto" w:after="120"/>
+        <w:spacing w:before="200" w:after="120" w:line="360" w:lineRule="auto"/>
+        <w:jc w:val="left"/>
+      </w:pPr>
+      <w:r>
+        <w:rPr>
+          <w:rFonts w:ascii="Arial" w:hAnsi="Arial"/>
+          <w:b/>
+          <w:i w:val="0"/>
+          <w:color w:val="000000"/>
+          <w:sz w:val="24"/>
+        </w:rPr>
+        <w:t>3.4.1 Objetivo geral</w:t>
+      </w:r>
+    </w:p>
+    <w:p>
+      <w:pPr>
+        <w:spacing w:before="0" w:after="120" w:line="360" w:lineRule="auto"/>
         <w:ind w:firstLine="709"/>
         <w:jc w:val="both"/>
       </w:pPr>
       <w:r>
         <w:rPr>
           <w:rFonts w:ascii="Arial" w:hAnsi="Arial"/>
+          <w:b w:val="0"/>
+          <w:i w:val="0"/>
           <w:color w:val="000000"/>
           <w:sz w:val="24"/>
         </w:rPr>
-        <w:t>A escolha deste objeto pautou-se na observação direta das dificuldades enfrentadas por pacientes ao tentarem agendar consultas psicológicas por meios tradicionais. A ausência de respostas rápidas fora do horário comercial, a perda de informações de cadastro e a lentidão no reagendamento afetam negativamente a adesão ao tratamento. A utilização do WhatsApp — aplicativo já presente no cotidiano da quase totalidade dos usuários — elimina a necessidade de instalar novos aplicativos, tornando o acolhimento imediato e familiar.</w:t>
+        <w:t>Desenvolver e implementar a plataforma Sentir Bem, integrando um site institucional responsivo a um sistema de automação no WhatsApp com suporte a cadastro via CPF, reagendamento de consultas, pagamentos PIX, triagem emergencial de crise e um painel de gestão administrativa em tempo real.</w:t>
       </w:r>
     </w:p>
     <w:p>
       <w:pPr>
-        <w:spacing w:line="360" w:lineRule="auto" w:before="280" w:after="160"/>
+        <w:spacing w:before="200" w:after="120" w:line="360" w:lineRule="auto"/>
         <w:jc w:val="left"/>
       </w:pPr>
       <w:r>
         <w:rPr>
           <w:rFonts w:ascii="Arial" w:hAnsi="Arial"/>
           <w:b/>
+          <w:i w:val="0"/>
           <w:color w:val="000000"/>
           <w:sz w:val="24"/>
         </w:rPr>
-        <w:t>2.3 Problematização</w:t>
+        <w:t>3.4.2 Objetivos específicos</w:t>
       </w:r>
     </w:p>
     <w:p>
       <w:pPr>
-        <w:spacing w:line="360" w:lineRule="auto" w:after="120"/>
+        <w:spacing w:before="0" w:after="80" w:line="360" w:lineRule="auto"/>
         <w:ind w:firstLine="709"/>
         <w:jc w:val="both"/>
       </w:pPr>
       <w:r>
         <w:rPr>
           <w:rFonts w:ascii="Arial" w:hAnsi="Arial"/>
-          <w:b/>
+          <w:b w:val="0"/>
+          <w:i w:val="0"/>
           <w:color w:val="000000"/>
           <w:sz w:val="24"/>
         </w:rPr>
-        <w:t>Problema Central:</w:t>
-      </w:r>
-      <w:r>
-        <w:rPr>
-          <w:rFonts w:ascii="Arial" w:hAnsi="Arial"/>
-          <w:color w:val="000000"/>
-          <w:sz w:val="24"/>
-        </w:rPr>
-        <w:t xml:space="preserve"> Como reduzir a morosidade e a desorganização no processo de agendamento de consultas psicológicas, garantindo um acolhimento inicial rápido, seguro e acessível para o paciente, ao mesmo tempo em que se fornece uma ferramenta eficiente de gestão para a equipe médica/administrativa?</w:t>
+        <w:t>a) Mapear os gargalos e atrasos no processo de agendamento tradicional em clínicas de psicologia;</w:t>
       </w:r>
     </w:p>
     <w:p>
       <w:pPr>
-        <w:spacing w:line="360" w:lineRule="auto" w:before="240" w:after="120"/>
+        <w:spacing w:before="0" w:after="80" w:line="360" w:lineRule="auto"/>
+        <w:ind w:firstLine="709"/>
+        <w:jc w:val="both"/>
+      </w:pPr>
+      <w:r>
+        <w:rPr>
+          <w:rFonts w:ascii="Arial" w:hAnsi="Arial"/>
+          <w:b w:val="0"/>
+          <w:i w:val="0"/>
+          <w:color w:val="000000"/>
+          <w:sz w:val="24"/>
+        </w:rPr>
+        <w:t>b) Desenvolver a interface web acolhedora e responsiva em HTML5, CSS3 Vanilla (Glassmorphic UI) e JavaScript ES6+;</w:t>
+      </w:r>
+    </w:p>
+    <w:p>
+      <w:pPr>
+        <w:spacing w:before="0" w:after="80" w:line="360" w:lineRule="auto"/>
+        <w:ind w:firstLine="709"/>
+        <w:jc w:val="both"/>
+      </w:pPr>
+      <w:r>
+        <w:rPr>
+          <w:rFonts w:ascii="Arial" w:hAnsi="Arial"/>
+          <w:b w:val="0"/>
+          <w:i w:val="0"/>
+          <w:color w:val="000000"/>
+          <w:sz w:val="24"/>
+        </w:rPr>
+        <w:t>c) Construir o assistente virtual em Node.js com Express e whatsapp-web.js para autoatendimento 24/7, verificação de CPF e reagendamento autônomo;</w:t>
+      </w:r>
+    </w:p>
+    <w:p>
+      <w:pPr>
+        <w:spacing w:before="0" w:after="80" w:line="360" w:lineRule="auto"/>
+        <w:ind w:firstLine="709"/>
+        <w:jc w:val="both"/>
+      </w:pPr>
+      <w:r>
+        <w:rPr>
+          <w:rFonts w:ascii="Arial" w:hAnsi="Arial"/>
+          <w:b w:val="0"/>
+          <w:i w:val="0"/>
+          <w:color w:val="000000"/>
+          <w:sz w:val="24"/>
+        </w:rPr>
+        <w:t>d) Implementar mecanismo de triagem emergencial para detectar termos de crise e orientar o contato com o CVV (188);</w:t>
+      </w:r>
+    </w:p>
+    <w:p>
+      <w:pPr>
+        <w:spacing w:before="0" w:after="80" w:line="360" w:lineRule="auto"/>
+        <w:ind w:firstLine="709"/>
+        <w:jc w:val="both"/>
+      </w:pPr>
+      <w:r>
+        <w:rPr>
+          <w:rFonts w:ascii="Arial" w:hAnsi="Arial"/>
+          <w:b w:val="0"/>
+          <w:i w:val="0"/>
+          <w:color w:val="000000"/>
+          <w:sz w:val="24"/>
+        </w:rPr>
+        <w:t>e) Estruturar o banco de dados Supabase (PostgreSQL) e o Painel Administrativo (/admin) em tempo real com SSE (Server-Sent Events);</w:t>
+      </w:r>
+    </w:p>
+    <w:p>
+      <w:pPr>
+        <w:spacing w:before="0" w:after="80" w:line="360" w:lineRule="auto"/>
+        <w:ind w:firstLine="709"/>
+        <w:jc w:val="both"/>
+      </w:pPr>
+      <w:r>
+        <w:rPr>
+          <w:rFonts w:ascii="Arial" w:hAnsi="Arial"/>
+          <w:b w:val="0"/>
+          <w:i w:val="0"/>
+          <w:color w:val="000000"/>
+          <w:sz w:val="24"/>
+        </w:rPr>
+        <w:t>f) Validar a estabilidade do sistema por meio de suíte de testes automatizados (9/9 aprovados em tests/safety.test.js).</w:t>
+      </w:r>
+    </w:p>
+    <w:p>
+      <w:pPr>
+        <w:spacing w:before="280" w:after="160" w:line="360" w:lineRule="auto"/>
         <w:jc w:val="left"/>
       </w:pPr>
       <w:r>
         <w:rPr>
           <w:rFonts w:ascii="Arial" w:hAnsi="Arial"/>
           <w:b/>
+          <w:i w:val="0"/>
           <w:color w:val="000000"/>
           <w:sz w:val="24"/>
         </w:rPr>
-        <w:t>Questões Orientadoras:</w:t>
+        <w:t>3.5 Metodologia e Solução Proposta (Inovação Tecnológica)</w:t>
       </w:r>
     </w:p>
     <w:p>
       <w:pPr>
-        <w:spacing w:line="360" w:lineRule="auto" w:after="120"/>
-        <w:ind w:left="709"/>
+        <w:spacing w:before="0" w:after="120" w:line="360" w:lineRule="auto"/>
+        <w:ind w:firstLine="709"/>
         <w:jc w:val="both"/>
       </w:pPr>
       <w:r>
         <w:rPr>
           <w:rFonts w:ascii="Arial" w:hAnsi="Arial"/>
-          <w:b/>
+          <w:b w:val="0"/>
+          <w:i w:val="0"/>
           <w:color w:val="000000"/>
           <w:sz w:val="24"/>
         </w:rPr>
-        <w:t xml:space="preserve">1. </w:t>
-      </w:r>
-      <w:r>
-        <w:rPr>
-          <w:rFonts w:ascii="Arial" w:hAnsi="Arial"/>
-          <w:color w:val="000000"/>
-          <w:sz w:val="24"/>
-        </w:rPr>
-        <w:t>De que maneira a automação de atendimento via WhatsApp pode agilizar o cadastro de pacientes por CPF e o reagendamento de consultas sem sobrecarregar a equipe humana?</w:t>
+        <w:t>A metodologia adotada seguiu a abordagem da Engenharia de Software Orientada a Requisitos e Prototipagem Ágil. A solução proposta organiza-se em 3 camadas funcionais:</w:t>
       </w:r>
     </w:p>
     <w:p>
       <w:pPr>
-        <w:spacing w:line="360" w:lineRule="auto" w:after="120"/>
-        <w:ind w:left="709"/>
+        <w:spacing w:before="0" w:after="120" w:line="360" w:lineRule="auto"/>
+        <w:ind w:firstLine="709"/>
         <w:jc w:val="both"/>
       </w:pPr>
       <w:r>
         <w:rPr>
           <w:rFonts w:ascii="Arial" w:hAnsi="Arial"/>
-          <w:b/>
+          <w:b w:val="0"/>
+          <w:i w:val="0"/>
           <w:color w:val="000000"/>
           <w:sz w:val="24"/>
         </w:rPr>
-        <w:t xml:space="preserve">2. </w:t>
-      </w:r>
-      <w:r>
-        <w:rPr>
-          <w:rFonts w:ascii="Arial" w:hAnsi="Arial"/>
-          <w:color w:val="000000"/>
-          <w:sz w:val="24"/>
-        </w:rPr>
-        <w:t>Como garantir que uma plataforma de atendimento automatizado identifique situações de crise emocional (como ideação suicida) e direcione o paciente para apoio emergencial (CVV 188)?</w:t>
+        <w:t>1. Camada de Apresentação (Frontend): Landing Page institucional sem frameworks, com design Glassmorphism, animações AOS e formulários com sanitização de CPF no navegador.</w:t>
       </w:r>
     </w:p>
     <w:p>
       <w:pPr>
-        <w:spacing w:line="360" w:lineRule="auto" w:after="120"/>
-        <w:ind w:left="709"/>
+        <w:spacing w:before="0" w:after="120" w:line="360" w:lineRule="auto"/>
+        <w:ind w:firstLine="709"/>
         <w:jc w:val="both"/>
       </w:pPr>
       <w:r>
         <w:rPr>
           <w:rFonts w:ascii="Arial" w:hAnsi="Arial"/>
-          <w:b/>
+          <w:b w:val="0"/>
+          <w:i w:val="0"/>
           <w:color w:val="000000"/>
           <w:sz w:val="24"/>
         </w:rPr>
-        <w:t xml:space="preserve">3. </w:t>
-      </w:r>
-      <w:r>
-        <w:rPr>
-          <w:rFonts w:ascii="Arial" w:hAnsi="Arial"/>
-          <w:color w:val="000000"/>
-          <w:sz w:val="24"/>
-        </w:rPr>
-        <w:t>Como estruturar um painel administrativo seguro e responsivo para que os profissionais acompanhem históricos de atendimento e parâmetros da clínica em tempo real?</w:t>
+        <w:t>2. Camada de Automação (Backend): Servidor Node.js (chatbot.js) que executa a API do WhatsApp Web, coordenando fluxos de interações conversacionais, cadastro de clientes e reconciliação financeira via PIX.</w:t>
       </w:r>
     </w:p>
     <w:p>
       <w:pPr>
-        <w:spacing w:line="360" w:lineRule="auto" w:before="280" w:after="160"/>
+        <w:spacing w:before="0" w:after="120" w:line="360" w:lineRule="auto"/>
+        <w:ind w:firstLine="709"/>
+        <w:jc w:val="both"/>
+      </w:pPr>
+      <w:r>
+        <w:rPr>
+          <w:rFonts w:ascii="Arial" w:hAnsi="Arial"/>
+          <w:b w:val="0"/>
+          <w:i w:val="0"/>
+          <w:color w:val="000000"/>
+          <w:sz w:val="24"/>
+        </w:rPr>
+        <w:t>3. Camada de Dados e Gestão (BaaS &amp; Admin): Banco de dados relacional Supabase com tabelas de clientes e agendamentos, conectado ao dashboard /admin para busca por CPF, bloqueio de acessos e monitoramento de logs em tempo real.</w:t>
+      </w:r>
+    </w:p>
+    <w:p>
+      <w:pPr>
+        <w:spacing w:before="360" w:after="240" w:line="360" w:lineRule="auto"/>
         <w:jc w:val="left"/>
       </w:pPr>
       <w:r>
         <w:rPr>
           <w:rFonts w:ascii="Arial" w:hAnsi="Arial"/>
           <w:b/>
+          <w:i w:val="0"/>
           <w:color w:val="000000"/>
           <w:sz w:val="24"/>
         </w:rPr>
-        <w:t>2.4 Objetivos</w:t>
+        <w:t>4. CONSIDERAÇÕES FINAIS</w:t>
       </w:r>
     </w:p>
     <w:p>
       <w:pPr>
-        <w:spacing w:line="360" w:lineRule="auto" w:before="240" w:after="120"/>
+        <w:spacing w:before="0" w:after="120" w:line="360" w:lineRule="auto"/>
+        <w:ind w:firstLine="709"/>
+        <w:jc w:val="both"/>
+      </w:pPr>
+      <w:r>
+        <w:rPr>
+          <w:rFonts w:ascii="Arial" w:hAnsi="Arial"/>
+          <w:b w:val="0"/>
+          <w:i w:val="0"/>
+          <w:color w:val="000000"/>
+          <w:sz w:val="24"/>
+        </w:rPr>
+        <w:t>O desenvolvimento da solução Sentir Bem possibilitou comprovar a importância de aplicar tecnologias modernas de automação no setor de saúde mental. Por meio do sistema desenvolvido, pacientes contam com um canal direto e acolhedor de agendamento via WhatsApp, eliminando a lentidão e as barreiras burocráticas do modelo tradicional.</w:t>
+      </w:r>
+    </w:p>
+    <w:p>
+      <w:pPr>
+        <w:spacing w:before="0" w:after="120" w:line="360" w:lineRule="auto"/>
+        <w:ind w:firstLine="709"/>
+        <w:jc w:val="both"/>
+      </w:pPr>
+      <w:r>
+        <w:rPr>
+          <w:rFonts w:ascii="Arial" w:hAnsi="Arial"/>
+          <w:b w:val="0"/>
+          <w:i w:val="0"/>
+          <w:color w:val="000000"/>
+          <w:sz w:val="24"/>
+        </w:rPr>
+        <w:t>A integração da plataforma web com o assistente virtual, o suporte a pagamentos PIX e o painel de gestão administrativa permitiram construir um ecossistema completo, ágil e seguro. O projeto cumpre com rigor seus objetivos acadêmicos e sociais, demonstrando como a tecnologia pode ser empregada para promover a inclusão e democratizar o acesso à terapia emocional.</w:t>
+      </w:r>
+    </w:p>
+    <w:p>
+      <w:pPr>
+        <w:spacing w:before="360" w:after="240" w:line="360" w:lineRule="auto"/>
         <w:jc w:val="left"/>
       </w:pPr>
       <w:r>
         <w:rPr>
           <w:rFonts w:ascii="Arial" w:hAnsi="Arial"/>
           <w:b/>
+          <w:i w:val="0"/>
           <w:color w:val="000000"/>
           <w:sz w:val="24"/>
         </w:rPr>
-        <w:t>Objetivo Geral</w:t>
+        <w:t>5. REFERÊNCIAS BIBLIOGRÁFICAS</w:t>
       </w:r>
     </w:p>
     <w:p>
       <w:pPr>
-        <w:spacing w:line="360" w:lineRule="auto" w:after="120"/>
-        <w:ind w:firstLine="709"/>
-        <w:jc w:val="both"/>
-      </w:pPr>
-      <w:r>
-        <w:rPr>
-          <w:rFonts w:ascii="Arial" w:hAnsi="Arial"/>
-          <w:color w:val="000000"/>
-          <w:sz w:val="24"/>
-        </w:rPr>
-        <w:t xml:space="preserve">Desenvolver e implementar a plataforma </w:t>
-      </w:r>
-      <w:r>
-        <w:rPr>
-          <w:rFonts w:ascii="Arial" w:hAnsi="Arial"/>
-          <w:b/>
-          <w:color w:val="000000"/>
-          <w:sz w:val="24"/>
-        </w:rPr>
-        <w:t>Sentir Bem</w:t>
-      </w:r>
-      <w:r>
-        <w:rPr>
-          <w:rFonts w:ascii="Arial" w:hAnsi="Arial"/>
-          <w:color w:val="000000"/>
-          <w:sz w:val="24"/>
-        </w:rPr>
-        <w:t>, integrando um site institucional responsivo a um sistema de automação no WhatsApp com suporte a cadastro via CPF, reagendamento, pagamentos PIX, triagem de crise e um painel de gestão administrativa em tempo real.</w:t>
-      </w:r>
-    </w:p>
-    <w:p>
-      <w:pPr>
-        <w:spacing w:line="360" w:lineRule="auto" w:before="240" w:after="120"/>
+        <w:spacing w:line="240" w:lineRule="auto" w:after="240"/>
         <w:jc w:val="left"/>
       </w:pPr>
       <w:r>
         <w:rPr>
           <w:rFonts w:ascii="Arial" w:hAnsi="Arial"/>
-          <w:b/>
-          <w:color w:val="000000"/>
           <w:sz w:val="24"/>
         </w:rPr>
-        <w:t>Objetivos Específicos</w:t>
-      </w:r>
-    </w:p>
-    <w:p>
-      <w:pPr>
-        <w:spacing w:line="360" w:lineRule="auto" w:after="120"/>
-        <w:ind w:left="709"/>
-        <w:jc w:val="both"/>
-      </w:pPr>
-      <w:r>
-        <w:rPr>
-          <w:rFonts w:ascii="Arial" w:hAnsi="Arial"/>
-          <w:b/>
-          <w:color w:val="000000"/>
-          <w:sz w:val="24"/>
-        </w:rPr>
-        <w:t>a) Identificar e Mapear Demandas:</w:t>
-      </w:r>
-      <w:r>
-        <w:rPr>
-          <w:rFonts w:ascii="Arial" w:hAnsi="Arial"/>
-          <w:color w:val="000000"/>
-          <w:sz w:val="24"/>
-        </w:rPr>
-        <w:t xml:space="preserve"> Mapear o fluxo de atendimento tradicional em clínicas de psicologia para identificar pontos de travamento e atraso no agendamento.</w:t>
-      </w:r>
-    </w:p>
-    <w:p>
-      <w:pPr>
-        <w:spacing w:line="360" w:lineRule="auto" w:after="120"/>
-        <w:ind w:left="709"/>
-        <w:jc w:val="both"/>
-      </w:pPr>
-      <w:r>
-        <w:rPr>
-          <w:rFonts w:ascii="Arial" w:hAnsi="Arial"/>
-          <w:b/>
-          <w:color w:val="000000"/>
-          <w:sz w:val="24"/>
-        </w:rPr>
-        <w:t>b) Desenvolver a Interface Web (Landing Page):</w:t>
-      </w:r>
-      <w:r>
-        <w:rPr>
-          <w:rFonts w:ascii="Arial" w:hAnsi="Arial"/>
-          <w:color w:val="000000"/>
-          <w:sz w:val="24"/>
-        </w:rPr>
-        <w:t xml:space="preserve"> Criar uma interface acolhedora utilizando HTML5 semântico, CSS3 (com Glassmorphism e animações AOS) e JavaScript ES6+, destacando especialidades, planos e pagamentos facilitados.</w:t>
-      </w:r>
-    </w:p>
-    <w:p>
-      <w:pPr>
-        <w:spacing w:line="360" w:lineRule="auto" w:after="120"/>
-        <w:ind w:left="709"/>
-        <w:jc w:val="both"/>
-      </w:pPr>
-      <w:r>
-        <w:rPr>
-          <w:rFonts w:ascii="Arial" w:hAnsi="Arial"/>
-          <w:b/>
-          <w:color w:val="000000"/>
-          <w:sz w:val="24"/>
-        </w:rPr>
-        <w:t>c) Construir o Bot de Atendimento WhatsApp:</w:t>
-      </w:r>
-      <w:r>
-        <w:rPr>
-          <w:rFonts w:ascii="Arial" w:hAnsi="Arial"/>
-          <w:color w:val="000000"/>
-          <w:sz w:val="24"/>
-        </w:rPr>
-        <w:t xml:space="preserve"> Desenvolver um backend robusto em Node.js/Express utilizando </w:t>
-      </w:r>
-      <w:r>
-        <w:rPr>
-          <w:rFonts w:ascii="Courier New" w:hAnsi="Courier New"/>
-          <w:color w:val="1E1E1E"/>
-          <w:sz w:val="22"/>
-        </w:rPr>
-        <w:t>whatsapp-web.js</w:t>
-      </w:r>
-      <w:r>
-        <w:rPr>
-          <w:rFonts w:ascii="Arial" w:hAnsi="Arial"/>
-          <w:color w:val="000000"/>
-          <w:sz w:val="24"/>
-        </w:rPr>
-        <w:t xml:space="preserve"> para realizar interações automáticas, consulta de cadastro por CPF e reagendamento autônomo.</w:t>
-      </w:r>
-    </w:p>
-    <w:p>
-      <w:pPr>
-        <w:spacing w:line="360" w:lineRule="auto" w:after="120"/>
-        <w:ind w:left="709"/>
-        <w:jc w:val="both"/>
-      </w:pPr>
-      <w:r>
-        <w:rPr>
-          <w:rFonts w:ascii="Arial" w:hAnsi="Arial"/>
-          <w:b/>
-          <w:color w:val="000000"/>
-          <w:sz w:val="24"/>
-        </w:rPr>
-        <w:t>d) Implementar Mecanismos de Triagem e Seguranca:</w:t>
-      </w:r>
-      <w:r>
-        <w:rPr>
-          <w:rFonts w:ascii="Arial" w:hAnsi="Arial"/>
-          <w:color w:val="000000"/>
-          <w:sz w:val="24"/>
-        </w:rPr>
-        <w:t xml:space="preserve"> Desenvolver filtros de análise de mensagens para detectar expressões de crise emocional ou risco e oferecer suporte imediato via CVV (188), garantindo também o armazenamento seguro de senhas administrativeis por algoritmo de hash </w:t>
-      </w:r>
-      <w:r>
-        <w:rPr>
-          <w:rFonts w:ascii="Courier New" w:hAnsi="Courier New"/>
-          <w:color w:val="1E1E1E"/>
-          <w:sz w:val="22"/>
-        </w:rPr>
-        <w:t>scrypt</w:t>
-      </w:r>
-      <w:r>
-        <w:rPr>
-          <w:rFonts w:ascii="Arial" w:hAnsi="Arial"/>
-          <w:color w:val="000000"/>
-          <w:sz w:val="24"/>
-        </w:rPr>
-        <w:t>.</w:t>
-      </w:r>
-    </w:p>
-    <w:p>
-      <w:pPr>
-        <w:spacing w:line="360" w:lineRule="auto" w:after="120"/>
-        <w:ind w:left="709"/>
-        <w:jc w:val="both"/>
-      </w:pPr>
-      <w:r>
-        <w:rPr>
-          <w:rFonts w:ascii="Arial" w:hAnsi="Arial"/>
-          <w:b/>
-          <w:color w:val="000000"/>
-          <w:sz w:val="24"/>
-        </w:rPr>
-        <w:t>e) Estruturar a Persistência e o Painel Admin:</w:t>
-      </w:r>
-      <w:r>
-        <w:rPr>
-          <w:rFonts w:ascii="Arial" w:hAnsi="Arial"/>
-          <w:color w:val="000000"/>
-          <w:sz w:val="24"/>
-        </w:rPr>
-        <w:t xml:space="preserve"> Integrar o banco de dados PostgreSQL via Supabase BaaS para gerenciar clientes, status de agendamentos (Pendente, Confirmado, Concluído, Cancelado) e logs do sistema, exibidos em tempo real no dashboard </w:t>
-      </w:r>
-      <w:r>
-        <w:rPr>
-          <w:rFonts w:ascii="Courier New" w:hAnsi="Courier New"/>
-          <w:color w:val="1E1E1E"/>
-          <w:sz w:val="22"/>
-        </w:rPr>
-        <w:t>/admin</w:t>
-      </w:r>
-      <w:r>
-        <w:rPr>
-          <w:rFonts w:ascii="Arial" w:hAnsi="Arial"/>
-          <w:color w:val="000000"/>
-          <w:sz w:val="24"/>
-        </w:rPr>
-        <w:t>.</w:t>
-      </w:r>
-    </w:p>
-    <w:p>
-      <w:pPr>
-        <w:spacing w:line="360" w:lineRule="auto" w:after="120"/>
-        <w:ind w:left="709"/>
-        <w:jc w:val="both"/>
-      </w:pPr>
-      <w:r>
-        <w:rPr>
-          <w:rFonts w:ascii="Arial" w:hAnsi="Arial"/>
-          <w:b/>
-          <w:color w:val="000000"/>
-          <w:sz w:val="24"/>
-        </w:rPr>
-        <w:t>f) Validar o Sistema por Suíte de Testes:</w:t>
-      </w:r>
-      <w:r>
-        <w:rPr>
-          <w:rFonts w:ascii="Arial" w:hAnsi="Arial"/>
-          <w:color w:val="000000"/>
-          <w:sz w:val="24"/>
-        </w:rPr>
-        <w:t xml:space="preserve"> Submeter a solução a testes unitários e de integração automatizados (</w:t>
-      </w:r>
-      <w:r>
-        <w:rPr>
-          <w:rFonts w:ascii="Courier New" w:hAnsi="Courier New"/>
-          <w:color w:val="1E1E1E"/>
-          <w:sz w:val="22"/>
-        </w:rPr>
-        <w:t>tests/safety.test.js</w:t>
-      </w:r>
-      <w:r>
-        <w:rPr>
-          <w:rFonts w:ascii="Arial" w:hAnsi="Arial"/>
-          <w:color w:val="000000"/>
-          <w:sz w:val="24"/>
-        </w:rPr>
-        <w:t xml:space="preserve"> com aprovação 7/7), garantindo a estabilidade e a conformidade funcional do sistema.</w:t>
-      </w:r>
-    </w:p>
-    <w:p>
-      <w:pPr>
-        <w:spacing w:line="360" w:lineRule="auto" w:before="280" w:after="160"/>
-        <w:jc w:val="left"/>
-      </w:pPr>
-      <w:r>
-        <w:rPr>
-          <w:rFonts w:ascii="Arial" w:hAnsi="Arial"/>
-          <w:b/>
-          <w:color w:val="000000"/>
-          <w:sz w:val="24"/>
-        </w:rPr>
-        <w:t>2.5 Metodologia e Solução Proposta (Inovação Tecnológica)</w:t>
-      </w:r>
-    </w:p>
-    <w:p>
-      <w:pPr>
-        <w:spacing w:line="360" w:lineRule="auto" w:after="120"/>
-        <w:ind w:firstLine="709"/>
-        <w:jc w:val="both"/>
-      </w:pPr>
-      <w:r>
-        <w:rPr>
-          <w:rFonts w:ascii="Arial" w:hAnsi="Arial"/>
-          <w:color w:val="000000"/>
-          <w:sz w:val="24"/>
-        </w:rPr>
-        <w:t xml:space="preserve">A metodologia adotada seguiu a abordagem da </w:t>
-      </w:r>
-      <w:r>
-        <w:rPr>
-          <w:rFonts w:ascii="Arial" w:hAnsi="Arial"/>
-          <w:b/>
-          <w:color w:val="000000"/>
-          <w:sz w:val="24"/>
-        </w:rPr>
-        <w:t>Engenharia de Software Orientada a Requisitos e Prototipagem Ágil</w:t>
-      </w:r>
-      <w:r>
-        <w:rPr>
-          <w:rFonts w:ascii="Arial" w:hAnsi="Arial"/>
-          <w:color w:val="000000"/>
-          <w:sz w:val="24"/>
-        </w:rPr>
-        <w:t>, dividida em 3 camadas de arquitetura:</w:t>
-      </w:r>
-    </w:p>
-    <w:p>
-      <w:pPr>
-        <w:spacing w:line="240" w:lineRule="auto" w:after="40"/>
-        <w:ind w:left="709"/>
-        <w:jc w:val="left"/>
-      </w:pPr>
-      <w:r>
-        <w:rPr>
-          <w:rFonts w:ascii="Courier New" w:hAnsi="Courier New"/>
-          <w:color w:val="323232"/>
-          <w:sz w:val="20"/>
-        </w:rPr>
-        <w:t>graph TD</w:t>
-      </w:r>
-    </w:p>
-    <w:p>
-      <w:pPr>
-        <w:spacing w:line="240" w:lineRule="auto" w:after="40"/>
-        <w:ind w:left="709"/>
-        <w:jc w:val="left"/>
-      </w:pPr>
-      <w:r>
-        <w:rPr>
-          <w:rFonts w:ascii="Courier New" w:hAnsi="Courier New"/>
-          <w:color w:val="323232"/>
-          <w:sz w:val="20"/>
-        </w:rPr>
-        <w:t xml:space="preserve">    A["Paciente / Cliente"] --&gt;|Acessa Web| B["Landing Page (HTML/CSS/JS)"]</w:t>
-      </w:r>
-    </w:p>
-    <w:p>
-      <w:pPr>
-        <w:spacing w:line="240" w:lineRule="auto" w:after="40"/>
-        <w:ind w:left="709"/>
-        <w:jc w:val="left"/>
-      </w:pPr>
-      <w:r>
-        <w:rPr>
-          <w:rFonts w:ascii="Courier New" w:hAnsi="Courier New"/>
-          <w:color w:val="323232"/>
-          <w:sz w:val="20"/>
-        </w:rPr>
-        <w:t xml:space="preserve">    A --&gt;|Envia Mensagem| C["WhatsApp Bot (whatsapp-web.js)"]</w:t>
-      </w:r>
-    </w:p>
-    <w:p>
-      <w:pPr>
-        <w:spacing w:line="240" w:lineRule="auto" w:after="40"/>
-        <w:ind w:left="709"/>
-        <w:jc w:val="left"/>
-      </w:pPr>
-      <w:r>
-        <w:rPr>
-          <w:rFonts w:ascii="Courier New" w:hAnsi="Courier New"/>
-          <w:color w:val="323232"/>
-          <w:sz w:val="20"/>
-        </w:rPr>
-        <w:t xml:space="preserve">    B --&gt;|Pagamento PIX / Consulta| C</w:t>
-      </w:r>
-    </w:p>
-    <w:p>
-      <w:pPr>
-        <w:spacing w:line="240" w:lineRule="auto" w:after="40"/>
-        <w:ind w:left="709"/>
-        <w:jc w:val="left"/>
-      </w:pPr>
-      <w:r>
-        <w:rPr>
-          <w:rFonts w:ascii="Courier New" w:hAnsi="Courier New"/>
-          <w:color w:val="323232"/>
-          <w:sz w:val="20"/>
-        </w:rPr>
-        <w:t xml:space="preserve">    C --&gt;|Valida CPF &amp; Agendamento| D["Backend Express (Node.js)"]</w:t>
-      </w:r>
-    </w:p>
-    <w:p>
-      <w:pPr>
-        <w:spacing w:line="240" w:lineRule="auto" w:after="40"/>
-        <w:ind w:left="709"/>
-        <w:jc w:val="left"/>
-      </w:pPr>
-      <w:r>
-        <w:rPr>
-          <w:rFonts w:ascii="Courier New" w:hAnsi="Courier New"/>
-          <w:color w:val="323232"/>
-          <w:sz w:val="20"/>
-        </w:rPr>
-        <w:t xml:space="preserve">    D --&gt;|Persistência Relacional| E[(Supabase - PostgreSQL)]</w:t>
-      </w:r>
-    </w:p>
-    <w:p>
-      <w:pPr>
-        <w:spacing w:line="240" w:lineRule="auto" w:after="40"/>
-        <w:ind w:left="709"/>
-        <w:jc w:val="left"/>
-      </w:pPr>
-      <w:r>
-        <w:rPr>
-          <w:rFonts w:ascii="Courier New" w:hAnsi="Courier New"/>
-          <w:color w:val="323232"/>
-          <w:sz w:val="20"/>
-        </w:rPr>
-        <w:t xml:space="preserve">    D --&gt;|Triagem de Crise| F["Alerta Emergencial / CVV 188"]</w:t>
-      </w:r>
-    </w:p>
-    <w:p>
-      <w:pPr>
-        <w:spacing w:line="240" w:lineRule="auto" w:after="40"/>
-        <w:ind w:left="709"/>
-        <w:jc w:val="left"/>
-      </w:pPr>
-      <w:r>
-        <w:rPr>
-          <w:rFonts w:ascii="Courier New" w:hAnsi="Courier New"/>
-          <w:color w:val="323232"/>
-          <w:sz w:val="20"/>
-        </w:rPr>
-        <w:t xml:space="preserve">    G["Administrador / Profissional"] --&gt;|Gerencia Agendas| H["Painel Admin (/admin)"]</w:t>
-      </w:r>
-    </w:p>
-    <w:p>
-      <w:pPr>
-        <w:spacing w:line="240" w:lineRule="auto" w:after="40"/>
-        <w:ind w:left="709"/>
-        <w:jc w:val="left"/>
-      </w:pPr>
-      <w:r>
-        <w:rPr>
-          <w:rFonts w:ascii="Courier New" w:hAnsi="Courier New"/>
-          <w:color w:val="323232"/>
-          <w:sz w:val="20"/>
-        </w:rPr>
-        <w:t xml:space="preserve">    H --&gt;|SSE Logs &amp; Gestão CPF| D</w:t>
-      </w:r>
-    </w:p>
-    <w:p>
-      <w:pPr>
-        <w:spacing w:line="360" w:lineRule="auto" w:after="120"/>
-        <w:ind w:left="709"/>
-        <w:jc w:val="both"/>
-      </w:pPr>
-      <w:r>
-        <w:rPr>
-          <w:rFonts w:ascii="Arial" w:hAnsi="Arial"/>
-          <w:b/>
-          <w:color w:val="000000"/>
-          <w:sz w:val="24"/>
-        </w:rPr>
-        <w:t xml:space="preserve">1. </w:t>
-      </w:r>
-      <w:r>
-        <w:rPr>
-          <w:rFonts w:ascii="Arial" w:hAnsi="Arial"/>
-          <w:b/>
-          <w:color w:val="000000"/>
-          <w:sz w:val="24"/>
-        </w:rPr>
-        <w:t>Camada de Apresentação (Frontend):</w:t>
-      </w:r>
-    </w:p>
-    <w:p>
-      <w:pPr>
-        <w:spacing w:line="360" w:lineRule="auto" w:after="120"/>
-        <w:ind w:left="709"/>
-        <w:jc w:val="both"/>
-      </w:pPr>
-      <w:r>
-        <w:rPr>
-          <w:rFonts w:ascii="Arial" w:hAnsi="Arial"/>
-          <w:color w:val="000000"/>
-          <w:sz w:val="24"/>
-        </w:rPr>
-        <w:t>Construída sem frameworks para garantir leveza e máxima performance.</w:t>
-      </w:r>
-    </w:p>
-    <w:p>
-      <w:pPr>
-        <w:spacing w:line="360" w:lineRule="auto" w:after="120"/>
-        <w:ind w:left="709"/>
-        <w:jc w:val="both"/>
-      </w:pPr>
-      <w:r>
-        <w:rPr>
-          <w:rFonts w:ascii="Arial" w:hAnsi="Arial"/>
-          <w:color w:val="000000"/>
-          <w:sz w:val="24"/>
-        </w:rPr>
-        <w:t xml:space="preserve">Aplicação de </w:t>
-      </w:r>
-      <w:r>
-        <w:rPr>
-          <w:rFonts w:ascii="Arial" w:hAnsi="Arial"/>
-          <w:b/>
-          <w:color w:val="000000"/>
-          <w:sz w:val="24"/>
-        </w:rPr>
-        <w:t>Glassmorphism</w:t>
-      </w:r>
-      <w:r>
-        <w:rPr>
-          <w:rFonts w:ascii="Arial" w:hAnsi="Arial"/>
-          <w:color w:val="000000"/>
-          <w:sz w:val="24"/>
-        </w:rPr>
-        <w:t xml:space="preserve"> e paleta de cores terapêutica (tons de azul e verde acolhedores).</w:t>
-      </w:r>
-    </w:p>
-    <w:p>
-      <w:pPr>
-        <w:spacing w:line="360" w:lineRule="auto" w:after="120"/>
-        <w:ind w:left="709"/>
-        <w:jc w:val="both"/>
-      </w:pPr>
-      <w:r>
-        <w:rPr>
-          <w:rFonts w:ascii="Arial" w:hAnsi="Arial"/>
-          <w:color w:val="000000"/>
-          <w:sz w:val="24"/>
-        </w:rPr>
-        <w:t>Componentes visuais para seleção de planos, modais dinâmicos para pagamento PIX via QR Code e navegação responsiva.</w:t>
-      </w:r>
-    </w:p>
-    <w:p>
-      <w:pPr>
-        <w:spacing w:line="360" w:lineRule="auto" w:after="120"/>
-        <w:ind w:left="709"/>
-        <w:jc w:val="both"/>
-      </w:pPr>
-      <w:r>
-        <w:rPr>
-          <w:rFonts w:ascii="Arial" w:hAnsi="Arial"/>
-          <w:b/>
-          <w:color w:val="000000"/>
-          <w:sz w:val="24"/>
-        </w:rPr>
-        <w:t xml:space="preserve">2. </w:t>
-      </w:r>
-      <w:r>
-        <w:rPr>
-          <w:rFonts w:ascii="Arial" w:hAnsi="Arial"/>
-          <w:b/>
-          <w:color w:val="000000"/>
-          <w:sz w:val="24"/>
-        </w:rPr>
-        <w:t>Camada de Lógica de Negócio e Automação (Backend):</w:t>
-      </w:r>
-    </w:p>
-    <w:p>
-      <w:pPr>
-        <w:spacing w:line="360" w:lineRule="auto" w:after="120"/>
-        <w:ind w:left="709"/>
-        <w:jc w:val="both"/>
-      </w:pPr>
-      <w:r>
-        <w:rPr>
-          <w:rFonts w:ascii="Arial" w:hAnsi="Arial"/>
-          <w:color w:val="000000"/>
-          <w:sz w:val="24"/>
-        </w:rPr>
-        <w:t>Servidor Node.js com Express (</w:t>
-      </w:r>
-      <w:r>
-        <w:rPr>
-          <w:rFonts w:ascii="Courier New" w:hAnsi="Courier New"/>
-          <w:color w:val="1E1E1E"/>
-          <w:sz w:val="22"/>
-        </w:rPr>
-        <w:t>chatbot.js</w:t>
-      </w:r>
-      <w:r>
-        <w:rPr>
-          <w:rFonts w:ascii="Arial" w:hAnsi="Arial"/>
-          <w:color w:val="000000"/>
-          <w:sz w:val="24"/>
-        </w:rPr>
-        <w:t xml:space="preserve">), integrando o motor </w:t>
-      </w:r>
-      <w:r>
-        <w:rPr>
-          <w:rFonts w:ascii="Courier New" w:hAnsi="Courier New"/>
-          <w:color w:val="1E1E1E"/>
-          <w:sz w:val="22"/>
-        </w:rPr>
-        <w:t>whatsapp-web.js</w:t>
-      </w:r>
-      <w:r>
-        <w:rPr>
-          <w:rFonts w:ascii="Arial" w:hAnsi="Arial"/>
-          <w:color w:val="000000"/>
-          <w:sz w:val="24"/>
-        </w:rPr>
-        <w:t>.</w:t>
-      </w:r>
-    </w:p>
-    <w:p>
-      <w:pPr>
-        <w:spacing w:line="360" w:lineRule="auto" w:after="120"/>
-        <w:ind w:left="709"/>
-        <w:jc w:val="both"/>
-      </w:pPr>
-      <w:r>
-        <w:rPr>
-          <w:rFonts w:ascii="Arial" w:hAnsi="Arial"/>
-          <w:color w:val="000000"/>
-          <w:sz w:val="24"/>
-        </w:rPr>
-        <w:t>Normalização e validação estrita de CPF para identificação unificada do cliente.</w:t>
-      </w:r>
-    </w:p>
-    <w:p>
-      <w:pPr>
-        <w:spacing w:line="360" w:lineRule="auto" w:after="120"/>
-        <w:ind w:left="709"/>
-        <w:jc w:val="both"/>
-      </w:pPr>
-      <w:r>
-        <w:rPr>
-          <w:rFonts w:ascii="Arial" w:hAnsi="Arial"/>
-          <w:color w:val="000000"/>
-          <w:sz w:val="24"/>
-        </w:rPr>
-        <w:t>Fluxo interativo de menu via WhatsApp: Boas-vindas $\rightarrow$ Triagem $\rightarrow$ Verificação de CPF $\rightarrow$ Agendamento/Reagendamento de Consultas.</w:t>
-      </w:r>
-    </w:p>
-    <w:p>
-      <w:pPr>
-        <w:spacing w:line="360" w:lineRule="auto" w:after="120"/>
-        <w:ind w:left="709"/>
-        <w:jc w:val="both"/>
-      </w:pPr>
-      <w:r>
-        <w:rPr>
-          <w:rFonts w:ascii="Arial" w:hAnsi="Arial"/>
-          <w:b/>
-          <w:color w:val="000000"/>
-          <w:sz w:val="24"/>
-        </w:rPr>
-        <w:t xml:space="preserve">3. </w:t>
-      </w:r>
-      <w:r>
-        <w:rPr>
-          <w:rFonts w:ascii="Arial" w:hAnsi="Arial"/>
-          <w:b/>
-          <w:color w:val="000000"/>
-          <w:sz w:val="24"/>
-        </w:rPr>
-        <w:t>Camada de Dados e Gestão (BaaS &amp; Admin):</w:t>
-      </w:r>
-    </w:p>
-    <w:p>
-      <w:pPr>
-        <w:spacing w:line="360" w:lineRule="auto" w:after="120"/>
-        <w:ind w:left="709"/>
-        <w:jc w:val="both"/>
-      </w:pPr>
-      <w:r>
-        <w:rPr>
-          <w:rFonts w:ascii="Arial" w:hAnsi="Arial"/>
-          <w:color w:val="000000"/>
-          <w:sz w:val="24"/>
-        </w:rPr>
-        <w:t>Banco de dados relacional Supabase (PostgreSQL) com migrações estruturadas para suporte a agendamentos, dados de clientes e configurações do sistema.</w:t>
-      </w:r>
-    </w:p>
-    <w:p>
-      <w:pPr>
-        <w:spacing w:line="360" w:lineRule="auto" w:after="120"/>
-        <w:ind w:left="709"/>
-        <w:jc w:val="both"/>
-      </w:pPr>
-      <w:r>
-        <w:rPr>
-          <w:rFonts w:ascii="Arial" w:hAnsi="Arial"/>
-          <w:color w:val="000000"/>
-          <w:sz w:val="24"/>
-        </w:rPr>
-        <w:t xml:space="preserve">Painel </w:t>
-      </w:r>
-      <w:r>
-        <w:rPr>
-          <w:rFonts w:ascii="Courier New" w:hAnsi="Courier New"/>
-          <w:color w:val="1E1E1E"/>
-          <w:sz w:val="22"/>
-        </w:rPr>
-        <w:t>/admin</w:t>
-      </w:r>
-      <w:r>
-        <w:rPr>
-          <w:rFonts w:ascii="Arial" w:hAnsi="Arial"/>
-          <w:color w:val="000000"/>
-          <w:sz w:val="24"/>
-        </w:rPr>
-        <w:t xml:space="preserve"> com streaming de eventos SSE (Server-Sent Events) para acompanhamento de logs em tempo real, busca de clientes por CPF, controle de bloqueios e reagendamento manual.</w:t>
-      </w:r>
-    </w:p>
-    <w:p>
-      <w:pPr>
-        <w:spacing w:line="360" w:lineRule="auto" w:before="240" w:after="120"/>
-        <w:jc w:val="left"/>
-      </w:pPr>
-      <w:r>
-        <w:rPr>
-          <w:rFonts w:ascii="Arial" w:hAnsi="Arial"/>
-          <w:b/>
-          <w:color w:val="000000"/>
-          <w:sz w:val="24"/>
-        </w:rPr>
-        <w:t>Inovação do Projeto</w:t>
-      </w:r>
-    </w:p>
-    <w:p>
-      <w:pPr>
-        <w:spacing w:line="360" w:lineRule="auto" w:after="120"/>
-        <w:ind w:firstLine="709"/>
-        <w:jc w:val="both"/>
-      </w:pPr>
-      <w:r>
-        <w:rPr>
-          <w:rFonts w:ascii="Arial" w:hAnsi="Arial"/>
-          <w:color w:val="000000"/>
-          <w:sz w:val="24"/>
-        </w:rPr>
-        <w:t xml:space="preserve">A inovação do </w:t>
-      </w:r>
-      <w:r>
-        <w:rPr>
-          <w:rFonts w:ascii="Arial" w:hAnsi="Arial"/>
-          <w:b/>
-          <w:color w:val="000000"/>
-          <w:sz w:val="24"/>
-        </w:rPr>
-        <w:t>Sentir Bem</w:t>
-      </w:r>
-      <w:r>
-        <w:rPr>
-          <w:rFonts w:ascii="Arial" w:hAnsi="Arial"/>
-          <w:color w:val="000000"/>
-          <w:sz w:val="24"/>
-        </w:rPr>
-        <w:t xml:space="preserve"> reside no uso de tecnologia acessível para resolver um problema humano delicado. Ao mesclar </w:t>
-      </w:r>
-      <w:r>
-        <w:rPr>
-          <w:rFonts w:ascii="Arial" w:hAnsi="Arial"/>
-          <w:b/>
-          <w:color w:val="000000"/>
-          <w:sz w:val="24"/>
-        </w:rPr>
-        <w:t>automação conversacional sem atrito (WhatsApp)</w:t>
-      </w:r>
-      <w:r>
-        <w:rPr>
-          <w:rFonts w:ascii="Arial" w:hAnsi="Arial"/>
-          <w:color w:val="000000"/>
-          <w:sz w:val="24"/>
-        </w:rPr>
-        <w:t xml:space="preserve"> com </w:t>
-      </w:r>
-      <w:r>
-        <w:rPr>
-          <w:rFonts w:ascii="Arial" w:hAnsi="Arial"/>
-          <w:b/>
-          <w:color w:val="000000"/>
-          <w:sz w:val="24"/>
-        </w:rPr>
-        <w:t>triagem ética de crise (CVV 188)</w:t>
-      </w:r>
-      <w:r>
-        <w:rPr>
-          <w:rFonts w:ascii="Arial" w:hAnsi="Arial"/>
-          <w:color w:val="000000"/>
-          <w:sz w:val="24"/>
-        </w:rPr>
-        <w:t xml:space="preserve"> e </w:t>
-      </w:r>
-      <w:r>
-        <w:rPr>
-          <w:rFonts w:ascii="Arial" w:hAnsi="Arial"/>
-          <w:b/>
-          <w:color w:val="000000"/>
-          <w:sz w:val="24"/>
-        </w:rPr>
-        <w:t>pagamento desburocratizado (PIX)</w:t>
-      </w:r>
-      <w:r>
-        <w:rPr>
-          <w:rFonts w:ascii="Arial" w:hAnsi="Arial"/>
-          <w:color w:val="000000"/>
-          <w:sz w:val="24"/>
-        </w:rPr>
-        <w:t>, o projeto elimina etapas manuais exaustivas e aproxima o paciente do cuidado profissional com agilidade e dignidade.</w:t>
-      </w:r>
-    </w:p>
-    <w:p>
-      <w:pPr>
-        <w:spacing w:line="360" w:lineRule="auto" w:before="360" w:after="240"/>
-        <w:jc w:val="left"/>
-      </w:pPr>
-      <w:r>
-        <w:rPr>
-          <w:rFonts w:ascii="Arial" w:hAnsi="Arial"/>
-          <w:b/>
-          <w:color w:val="000000"/>
-          <w:sz w:val="24"/>
-        </w:rPr>
-        <w:t>3. CONSIDERAÇÕES FINAIS</w:t>
-      </w:r>
-    </w:p>
-    <w:p>
-      <w:pPr>
-        <w:spacing w:line="360" w:lineRule="auto" w:after="120"/>
-        <w:ind w:firstLine="709"/>
-        <w:jc w:val="both"/>
-      </w:pPr>
-      <w:r>
-        <w:rPr>
-          <w:rFonts w:ascii="Arial" w:hAnsi="Arial"/>
-          <w:color w:val="000000"/>
-          <w:sz w:val="24"/>
-        </w:rPr>
-        <w:t xml:space="preserve">O desenvolvimento da solução </w:t>
-      </w:r>
-      <w:r>
-        <w:rPr>
-          <w:rFonts w:ascii="Arial" w:hAnsi="Arial"/>
-          <w:b/>
-          <w:color w:val="000000"/>
-          <w:sz w:val="24"/>
-        </w:rPr>
-        <w:t>Sentir Bem</w:t>
-      </w:r>
-      <w:r>
-        <w:rPr>
-          <w:rFonts w:ascii="Arial" w:hAnsi="Arial"/>
-          <w:color w:val="000000"/>
-          <w:sz w:val="24"/>
-        </w:rPr>
-        <w:t xml:space="preserve"> permitiu constatar o enorme potencial da tecnologia quando aplicada de forma humanizada e estratégica à área da saúde mental. A criação do sistema integrado de atendimento e agendamento demonstrou ser possível resolver problemas históricos de lentidão, desorganização e perda de informações em clínicas psicológicas.</w:t>
-      </w:r>
-    </w:p>
-    <w:p>
-      <w:pPr>
-        <w:spacing w:line="360" w:lineRule="auto" w:after="120"/>
-        <w:ind w:firstLine="709"/>
-        <w:jc w:val="both"/>
-      </w:pPr>
-      <w:r>
-        <w:rPr>
-          <w:rFonts w:ascii="Arial" w:hAnsi="Arial"/>
-          <w:color w:val="000000"/>
-          <w:sz w:val="24"/>
-        </w:rPr>
-        <w:t>Por meio da combinação da Landing Page institucional com o assistente virtual no WhatsApp e o painel administrativo em tempo real, o projeto alcançou um fluxo contínuo de atendimento 24 horas por dia. O paciente ganha autonomia para consultar horários, efetuar pagamentos PIX e reagendar atendimentos, enquanto a equipe gestora obtém visibilidade total e organizada de todos os processos.</w:t>
-      </w:r>
-    </w:p>
-    <w:p>
-      <w:pPr>
-        <w:spacing w:line="360" w:lineRule="auto" w:after="120"/>
-        <w:ind w:firstLine="709"/>
-        <w:jc w:val="both"/>
-      </w:pPr>
-      <w:r>
-        <w:rPr>
-          <w:rFonts w:ascii="Arial" w:hAnsi="Arial"/>
-          <w:color w:val="000000"/>
-          <w:sz w:val="24"/>
-        </w:rPr>
-        <w:t>Além disso, a implementação de travas de segurança e triagem para situações de crise reforça o compromisso ético e social do software. O projeto cumpre com excelência seus objetivos acadêmicos e práticos, servindo como modelo replicável de inovação em serviços de telessaúde e acolhimento emocional.</w:t>
-      </w:r>
-    </w:p>
-    <w:p>
-      <w:pPr>
-        <w:spacing w:line="360" w:lineRule="auto" w:before="360" w:after="240"/>
-        <w:jc w:val="left"/>
-      </w:pPr>
-      <w:r>
-        <w:rPr>
-          <w:rFonts w:ascii="Arial" w:hAnsi="Arial"/>
-          <w:b/>
-          <w:color w:val="000000"/>
-          <w:sz w:val="24"/>
-        </w:rPr>
-        <w:t>4. REFERÊNCIAS BIBLIOGRÁFICAS</w:t>
-      </w:r>
-    </w:p>
-    <w:p>
-      <w:pPr>
-        <w:spacing w:line="240" w:lineRule="auto" w:after="240"/>
-        <w:ind w:left="0"/>
-        <w:jc w:val="left"/>
-      </w:pPr>
-      <w:r>
-        <w:rPr>
-          <w:rFonts w:ascii="Arial" w:hAnsi="Arial"/>
-          <w:b/>
-          <w:color w:val="000000"/>
-          <w:sz w:val="24"/>
-        </w:rPr>
-        <w:t>ABRAMOVICH, F.</w:t>
-      </w:r>
-      <w:r>
-        <w:rPr>
-          <w:rFonts w:ascii="Arial" w:hAnsi="Arial"/>
-          <w:color w:val="000000"/>
-          <w:sz w:val="24"/>
-        </w:rPr>
-        <w:t xml:space="preserve"> </w:t>
+        <w:t xml:space="preserve">ABRAMOVICH, F. </w:t>
       </w:r>
       <w:r>
         <w:rPr>
           <w:rFonts w:ascii="Arial" w:hAnsi="Arial"/>
           <w:i/>
-          <w:color w:val="000000"/>
           <w:sz w:val="24"/>
         </w:rPr>
         <w:t>Literatura infantil: gostosuras e bobices</w:t>
@@ -1739,7 +1289,6 @@
       <w:r>
         <w:rPr>
           <w:rFonts w:ascii="Arial" w:hAnsi="Arial"/>
-          <w:color w:val="000000"/>
           <w:sz w:val="24"/>
         </w:rPr>
         <w:t>. São Paulo: Scipione, 1997.</w:t>
@@ -1748,31 +1297,19 @@
     <w:p>
       <w:pPr>
         <w:spacing w:line="240" w:lineRule="auto" w:after="240"/>
-        <w:ind w:left="0"/>
         <w:jc w:val="left"/>
       </w:pPr>
       <w:r>
         <w:rPr>
           <w:rFonts w:ascii="Arial" w:hAnsi="Arial"/>
-          <w:b/>
-          <w:color w:val="000000"/>
           <w:sz w:val="24"/>
         </w:rPr>
-        <w:t>BRASIL.</w:t>
-      </w:r>
-      <w:r>
-        <w:rPr>
-          <w:rFonts w:ascii="Arial" w:hAnsi="Arial"/>
-          <w:color w:val="000000"/>
-          <w:sz w:val="24"/>
-        </w:rPr>
-        <w:t xml:space="preserve"> Lei nº 13.709, de 14 de agosto de 2018. </w:t>
+        <w:t xml:space="preserve">BRASIL. Lei nº 13.709, de 14 de agosto de 2018. </w:t>
       </w:r>
       <w:r>
         <w:rPr>
           <w:rFonts w:ascii="Arial" w:hAnsi="Arial"/>
           <w:i/>
-          <w:color w:val="000000"/>
           <w:sz w:val="24"/>
         </w:rPr>
         <w:t>Lei Geral de Proteção de Dados Pessoais (LGPD)</w:t>
@@ -1780,7 +1317,6 @@
       <w:r>
         <w:rPr>
           <w:rFonts w:ascii="Arial" w:hAnsi="Arial"/>
-          <w:color w:val="000000"/>
           <w:sz w:val="24"/>
         </w:rPr>
         <w:t>. Brasília, DF: Presidência da República, 2018.</w:t>
@@ -1789,31 +1325,19 @@
     <w:p>
       <w:pPr>
         <w:spacing w:line="240" w:lineRule="auto" w:after="240"/>
-        <w:ind w:left="0"/>
         <w:jc w:val="left"/>
       </w:pPr>
       <w:r>
         <w:rPr>
           <w:rFonts w:ascii="Arial" w:hAnsi="Arial"/>
-          <w:b/>
-          <w:color w:val="000000"/>
           <w:sz w:val="24"/>
         </w:rPr>
-        <w:t>CENTRO DE VALORIZAÇÃO DA VIDA (CVV).</w:t>
-      </w:r>
-      <w:r>
-        <w:rPr>
-          <w:rFonts w:ascii="Arial" w:hAnsi="Arial"/>
-          <w:color w:val="000000"/>
-          <w:sz w:val="24"/>
-        </w:rPr>
-        <w:t xml:space="preserve"> </w:t>
+        <w:t xml:space="preserve">CENTRO DE VALORIZAÇÃO DA VIDA (CVV). </w:t>
       </w:r>
       <w:r>
         <w:rPr>
           <w:rFonts w:ascii="Arial" w:hAnsi="Arial"/>
           <w:i/>
-          <w:color w:val="000000"/>
           <w:sz w:val="24"/>
         </w:rPr>
         <w:t>Atendimento emocional e prevenção do suicídio</w:t>
@@ -1821,7 +1345,6 @@
       <w:r>
         <w:rPr>
           <w:rFonts w:ascii="Arial" w:hAnsi="Arial"/>
-          <w:color w:val="000000"/>
           <w:sz w:val="24"/>
         </w:rPr>
         <w:t>. Disponível em: &lt;https://www.cvv.org.br/&gt;. Acesso em: 2026.</w:t>
@@ -1830,31 +1353,19 @@
     <w:p>
       <w:pPr>
         <w:spacing w:line="240" w:lineRule="auto" w:after="240"/>
-        <w:ind w:left="0"/>
         <w:jc w:val="left"/>
       </w:pPr>
       <w:r>
         <w:rPr>
           <w:rFonts w:ascii="Arial" w:hAnsi="Arial"/>
-          <w:b/>
-          <w:color w:val="000000"/>
           <w:sz w:val="24"/>
         </w:rPr>
-        <w:t>CONSELHO FEDERAL DE PSICOLOGIA (CFP).</w:t>
-      </w:r>
-      <w:r>
-        <w:rPr>
-          <w:rFonts w:ascii="Arial" w:hAnsi="Arial"/>
-          <w:color w:val="000000"/>
-          <w:sz w:val="24"/>
-        </w:rPr>
-        <w:t xml:space="preserve"> Resolução CFP nº 11/2018. </w:t>
+        <w:t xml:space="preserve">CONSELHO FEDERAL DE PSICOLOGIA (CFP). Resolução CFP nº 11/2018. </w:t>
       </w:r>
       <w:r>
         <w:rPr>
           <w:rFonts w:ascii="Arial" w:hAnsi="Arial"/>
           <w:i/>
-          <w:color w:val="000000"/>
           <w:sz w:val="24"/>
         </w:rPr>
         <w:t>Regulamenta a prestação de serviços psicológicos realizados por meios de tecnologia da informação e da comunicação</w:t>
@@ -1862,7 +1373,6 @@
       <w:r>
         <w:rPr>
           <w:rFonts w:ascii="Arial" w:hAnsi="Arial"/>
-          <w:color w:val="000000"/>
           <w:sz w:val="24"/>
         </w:rPr>
         <w:t>. Brasília: CFP, 2018.</w:t>
@@ -1871,31 +1381,19 @@
     <w:p>
       <w:pPr>
         <w:spacing w:line="240" w:lineRule="auto" w:after="240"/>
-        <w:ind w:left="0"/>
         <w:jc w:val="left"/>
       </w:pPr>
       <w:r>
         <w:rPr>
           <w:rFonts w:ascii="Arial" w:hAnsi="Arial"/>
-          <w:b/>
-          <w:color w:val="000000"/>
           <w:sz w:val="24"/>
         </w:rPr>
-        <w:t>EXPRESS. JS FOUNDATION.</w:t>
-      </w:r>
-      <w:r>
-        <w:rPr>
-          <w:rFonts w:ascii="Arial" w:hAnsi="Arial"/>
-          <w:color w:val="000000"/>
-          <w:sz w:val="24"/>
-        </w:rPr>
-        <w:t xml:space="preserve"> </w:t>
+        <w:t xml:space="preserve">EXPRESS. JS FOUNDATION. </w:t>
       </w:r>
       <w:r>
         <w:rPr>
           <w:rFonts w:ascii="Arial" w:hAnsi="Arial"/>
           <w:i/>
-          <w:color w:val="000000"/>
           <w:sz w:val="24"/>
         </w:rPr>
         <w:t>Node.js Express Web Application Framework Documentation</w:t>
@@ -1903,7 +1401,6 @@
       <w:r>
         <w:rPr>
           <w:rFonts w:ascii="Arial" w:hAnsi="Arial"/>
-          <w:color w:val="000000"/>
           <w:sz w:val="24"/>
         </w:rPr>
         <w:t>. Disponível em: &lt;https://expressjs.com/&gt;. Acesso em: 2026.</w:t>
@@ -1912,31 +1409,19 @@
     <w:p>
       <w:pPr>
         <w:spacing w:line="240" w:lineRule="auto" w:after="240"/>
-        <w:ind w:left="0"/>
         <w:jc w:val="left"/>
       </w:pPr>
       <w:r>
         <w:rPr>
           <w:rFonts w:ascii="Arial" w:hAnsi="Arial"/>
-          <w:b/>
-          <w:color w:val="000000"/>
           <w:sz w:val="24"/>
         </w:rPr>
-        <w:t>FLANAGAN, David.</w:t>
-      </w:r>
-      <w:r>
-        <w:rPr>
-          <w:rFonts w:ascii="Arial" w:hAnsi="Arial"/>
-          <w:color w:val="000000"/>
-          <w:sz w:val="24"/>
-        </w:rPr>
-        <w:t xml:space="preserve"> </w:t>
+        <w:t xml:space="preserve">FLANAGAN, David. </w:t>
       </w:r>
       <w:r>
         <w:rPr>
           <w:rFonts w:ascii="Arial" w:hAnsi="Arial"/>
           <w:i/>
-          <w:color w:val="000000"/>
           <w:sz w:val="24"/>
         </w:rPr>
         <w:t>JavaScript: O Guia Definitivo</w:t>
@@ -1944,7 +1429,6 @@
       <w:r>
         <w:rPr>
           <w:rFonts w:ascii="Arial" w:hAnsi="Arial"/>
-          <w:color w:val="000000"/>
           <w:sz w:val="24"/>
         </w:rPr>
         <w:t>. 7. ed. São Paulo: Novatec, 2021.</w:t>
@@ -1953,31 +1437,19 @@
     <w:p>
       <w:pPr>
         <w:spacing w:line="240" w:lineRule="auto" w:after="240"/>
-        <w:ind w:left="0"/>
         <w:jc w:val="left"/>
       </w:pPr>
       <w:r>
         <w:rPr>
           <w:rFonts w:ascii="Arial" w:hAnsi="Arial"/>
-          <w:b/>
-          <w:color w:val="000000"/>
           <w:sz w:val="24"/>
         </w:rPr>
-        <w:t>ORGANIZAÇÃO MUNDIAL DA SAÚDE (OMS).</w:t>
-      </w:r>
-      <w:r>
-        <w:rPr>
-          <w:rFonts w:ascii="Arial" w:hAnsi="Arial"/>
-          <w:color w:val="000000"/>
-          <w:sz w:val="24"/>
-        </w:rPr>
-        <w:t xml:space="preserve"> </w:t>
+        <w:t xml:space="preserve">ORGANIZAÇÃO MUNDIAL DA SAÚDE (OMS). </w:t>
       </w:r>
       <w:r>
         <w:rPr>
           <w:rFonts w:ascii="Arial" w:hAnsi="Arial"/>
           <w:i/>
-          <w:color w:val="000000"/>
           <w:sz w:val="24"/>
         </w:rPr>
         <w:t>Relatório Mundial de Saúde Mental: transformar a saúde mental para todos</w:t>
@@ -1985,7 +1457,6 @@
       <w:r>
         <w:rPr>
           <w:rFonts w:ascii="Arial" w:hAnsi="Arial"/>
-          <w:color w:val="000000"/>
           <w:sz w:val="24"/>
         </w:rPr>
         <w:t>. Genebra: OMS, 2022.</w:t>
@@ -1994,31 +1465,19 @@
     <w:p>
       <w:pPr>
         <w:spacing w:line="240" w:lineRule="auto" w:after="240"/>
-        <w:ind w:left="0"/>
         <w:jc w:val="left"/>
       </w:pPr>
       <w:r>
         <w:rPr>
           <w:rFonts w:ascii="Arial" w:hAnsi="Arial"/>
-          <w:b/>
-          <w:color w:val="000000"/>
           <w:sz w:val="24"/>
         </w:rPr>
-        <w:t>PRESSMAN, Roger S.; MAXIM, Bruce R.</w:t>
-      </w:r>
-      <w:r>
-        <w:rPr>
-          <w:rFonts w:ascii="Arial" w:hAnsi="Arial"/>
-          <w:color w:val="000000"/>
-          <w:sz w:val="24"/>
-        </w:rPr>
-        <w:t xml:space="preserve"> </w:t>
+        <w:t xml:space="preserve">PRESSMAN, Roger S.; MAXIM, Bruce R. </w:t>
       </w:r>
       <w:r>
         <w:rPr>
           <w:rFonts w:ascii="Arial" w:hAnsi="Arial"/>
           <w:i/>
-          <w:color w:val="000000"/>
           <w:sz w:val="24"/>
         </w:rPr>
         <w:t>Engenharia de Software: uma abordagem profissional</w:t>
@@ -2026,7 +1485,6 @@
       <w:r>
         <w:rPr>
           <w:rFonts w:ascii="Arial" w:hAnsi="Arial"/>
-          <w:color w:val="000000"/>
           <w:sz w:val="24"/>
         </w:rPr>
         <w:t>. 8. ed. Porto Alegre: AMGH, 2016.</w:t>
@@ -2035,31 +1493,19 @@
     <w:p>
       <w:pPr>
         <w:spacing w:line="240" w:lineRule="auto" w:after="240"/>
-        <w:ind w:left="0"/>
         <w:jc w:val="left"/>
       </w:pPr>
       <w:r>
         <w:rPr>
           <w:rFonts w:ascii="Arial" w:hAnsi="Arial"/>
-          <w:b/>
-          <w:color w:val="000000"/>
           <w:sz w:val="24"/>
         </w:rPr>
-        <w:t>SILVA, Flávio Soares da; SILVEIRA, Fábio; MORAIS, Izabel.</w:t>
-      </w:r>
-      <w:r>
-        <w:rPr>
-          <w:rFonts w:ascii="Arial" w:hAnsi="Arial"/>
-          <w:color w:val="000000"/>
-          <w:sz w:val="24"/>
-        </w:rPr>
-        <w:t xml:space="preserve"> Automação de Processos de Atendimento e Triagem Digital na Saúde. </w:t>
+        <w:t xml:space="preserve">SILVA, Flávio Soares da; SILVEIRA, Fábio; MORAIS, Izabel. Automação de Processos de Atendimento e Triagem Digital na Saúde. </w:t>
       </w:r>
       <w:r>
         <w:rPr>
           <w:rFonts w:ascii="Arial" w:hAnsi="Arial"/>
           <w:i/>
-          <w:color w:val="000000"/>
           <w:sz w:val="24"/>
         </w:rPr>
         <w:t>Revista Brasileira de Computação Aplicada</w:t>
@@ -2067,7 +1513,6 @@
       <w:r>
         <w:rPr>
           <w:rFonts w:ascii="Arial" w:hAnsi="Arial"/>
-          <w:color w:val="000000"/>
           <w:sz w:val="24"/>
         </w:rPr>
         <w:t>, v. 14, n. 2, p. 45-58, 2022.</w:t>

</xml_diff>